<commit_message>
Rebuild all P1 outputs and update the advisor deck
PDFs (EN/CN main and supplement), the advisor-review build (dated
8 October 2026), the Word files and FIGURES.md are rebuilt from the
current sources, including the NICE-only Figure 11, the new Figure S04
and the review-4 edits.

The advisor deck (renamed to 20261008) now follows the current
manuscript: two-cell maxima 0.27% and 1.49%, page counts, figure,
table and section numbers, the NICE example and two-factor split on the
energy-share slide with the new Figure 11, reference and per-direction
statistics of Sections 5.2-5.3, exact checks up to 51 cells, the AMG
comparison in the limitations, and the cost and accuracy reasons of the
full-node PIML variant. Training-cost figures are removed, the follow-up
slide follows the author-annotated plan and the decisions slide is
dropped, as in the follow-up notes.

Co-Authored-By: Claude Opus 5.5 <noreply@anthropic.com>
Claude-Session: https://claude.ai/code/session_0114mFUC9kQKF8s1RT519QXM
</commit_message>
<xml_diff>
--- a/docs/paper_p1/word/P1_supp_EN.docx
+++ b/docs/paper_p1/word/P1_supp_EN.docx
@@ -15,7 +15,7 @@
         <w:pStyle w:val="FirstParagraph"/>
       </w:pPr>
       <w:r>
-        <w:t xml:space="preserve">Supplementary Notes, Tables and Figures are numbered in the order in which they appear in this supplement. Variant labels follow the main text (Table 3); the key below also gives each variant's record identifier in the data archive.</w:t>
+        <w:t xml:space="preserve">Supplementary Notes, Tables and Figures are numbered in the order in which they appear in this supplement. Variant labels follow the main text (Table 2); the key below also gives each variant's record identifier in the data archive.</w:t>
       </w:r>
     </w:p>
     <w:p>
@@ -959,7 +959,7 @@
         </m:r>
       </m:oMath>
       <w:r>
-        <w:t xml:space="preserve">, and v0, v1 and v2 give the heavy, moderate and light retained-volume strata. In configuration labels such as U1/x, x and y give the neighbour configuration of Figure 8. The deployment geometries use the G1–G4 labels of Table ST13; the table below gives their identifiers in the data archive.</w:t>
+        <w:t xml:space="preserve">, and v0, v1 and v2 give the heavy, moderate and light retained-volume strata. In configuration labels such as U1/x, x and y give the neighbour configuration of Figure 9. The deployment geometries use the G1–G4 labels of Table ST13; the table below gives their identifiers in the data archive.</w:t>
       </w:r>
     </w:p>
     <w:tbl>
@@ -1668,7 +1668,7 @@
         <w:pStyle w:val="BodyText"/>
       </w:pPr>
       <w:r>
-        <w:t xml:space="preserve">Training settings, common to the variants of Table 3:</w:t>
+        <w:t xml:space="preserve">Training settings, common to the variants of Table 2:</w:t>
       </w:r>
     </w:p>
     <w:p>
@@ -6272,7 +6272,7 @@
         </m:r>
       </m:oMath>
       <w:r>
-        <w:t xml:space="preserve">; Section 5.5, Figure 7a,b); smoothed values are tabulated for the base network under consistent tractions, and — marks entries not tabulated. The first-order share is the Frobenius norm of the linear error array divided by the sum of the Frobenius norms of the linear and quadratic arrays (%), at</w:t>
+        <w:t xml:space="preserve">; Section 5.5, Figure 8a,b); smoothed values are tabulated for the base network under consistent tractions, and — marks entries not tabulated. The first-order share is the Frobenius norm of the linear error array divided by the sum of the Frobenius norms of the linear and quadratic arrays (%), at</w:t>
       </w:r>
       <w:r>
         <w:t xml:space="preserve"> </w:t>
@@ -8495,7 +8495,7 @@
         <w:pStyle w:val="FirstParagraph"/>
       </w:pPr>
       <w:r>
-        <w:t xml:space="preserve">Base network, mean over consistent-traction directions; each fraction uses its own interior-energy denominator (Eq. (15)). Cumulative curves, nodal-force results and directional percentiles are shown in Figure 5.</w:t>
+        <w:t xml:space="preserve">Base network, mean over consistent-traction directions; each fraction uses its own interior-energy denominator (Eq. (15)). Cumulative curves, nodal-force results and directional percentiles are shown in Figure 6.</w:t>
       </w:r>
     </w:p>
     <w:tbl>
@@ -14992,7 +14992,7 @@
         <w:pStyle w:val="BodyText"/>
       </w:pPr>
       <w:r>
-        <w:t xml:space="preserve">Combinations without a row were not evaluated. All cells in this table belong to the 20 validation geometries used for checkpoint selection (Section 5.1). Cut-surface responses of the same configurations are in Table ST09. For the base network on U1/x under the neighbour-face z traction (Section 5.6, Figure 10b), the target cell carries 0.1274669% of the exact assembled energy and has a local energy error of 2.312168%; the product</w:t>
+        <w:t xml:space="preserve">Combinations without a row were not evaluated. All cells in this table belong to the 20 validation geometries used for checkpoint selection (Section 5.1). Cut-surface responses of the same configurations are in Table ST09. For the base network on U1/x under the neighbour-face z traction (circled in Figure S04(a–c)), the target cell carries 0.1274669% of the exact assembled energy and has a local energy error of 2.312168%; the product</w:t>
       </w:r>
       <w:r>
         <w:t xml:space="preserve"> </w:t>
@@ -18214,7 +18214,7 @@
         <w:pStyle w:val="FirstParagraph"/>
       </w:pPr>
       <w:r>
-        <w:t xml:space="preserve">Figure S01 and Table ST10 verify the CutFEM reference against background refinement and the ghost-penalty coefficient; the last paragraph of this note verifies the numerical thickness derivative.</w:t>
+        <w:t xml:space="preserve">Figure S01 and Table ST10 verify the CutFEM reference against background refinement and the ghost-penalty coefficient, and Table ST10b compares it with a body-fitted discretisation on uncut cells; the last paragraph of this note verifies the numerical thickness derivative.</w:t>
       </w:r>
     </w:p>
     <w:p>
@@ -19124,6 +19124,231 @@
         <w:pStyle w:val="BodyText"/>
       </w:pPr>
       <w:r>
+        <w:t xml:space="preserve">On uncut cells, the discrete model was also compared with an independent body-fitted discretisation that meshes the same implicit geometry with quadratic tetrahedra and shares no geometry, quadrature or stabilisation code with it (Table ST10b).</w:t>
+      </w:r>
+    </w:p>
+    <w:p>
+      <w:pPr>
+        <w:pStyle w:val="Heading3"/>
+      </w:pPr>
+      <w:r>
+        <w:t xml:space="preserve">Table ST10b. Comparison with a body-fitted quadratic-tetrahedral discretisation on uncut cells</w:t>
+      </w:r>
+    </w:p>
+    <w:tbl>
+      <w:tblPr>
+        <w:tblStyle w:val="Table"/>
+        <w:tblW w:type="pct" w:w="5000"/>
+        <w:tblLayout w:type="fixed"/>
+        <w:tblLook w:firstRow="1" w:lastRow="0" w:firstColumn="0" w:lastColumn="0" w:noHBand="0" w:noVBand="0" w:val="0020"/>
+      </w:tblPr>
+      <w:tblGrid>
+        <w:gridCol w:w="1697"/>
+        <w:gridCol w:w="1697"/>
+        <w:gridCol w:w="2262"/>
+        <w:gridCol w:w="2262"/>
+      </w:tblGrid>
+      <w:tr>
+        <w:trPr>
+          <w:tblHeader w:val="on"/>
+        </w:trPr>
+        <w:tc>
+          <w:tcPr/>
+          <w:p>
+            <w:pPr>
+              <w:pStyle w:val="Compact"/>
+            </w:pPr>
+            <w:r>
+              <w:t xml:space="preserve">Configuration</w:t>
+            </w:r>
+          </w:p>
+        </w:tc>
+        <w:tc>
+          <w:tcPr/>
+          <w:p>
+            <w:pPr>
+              <w:pStyle w:val="Compact"/>
+            </w:pPr>
+            <w:r>
+              <w:t xml:space="preserve">Loads</w:t>
+            </w:r>
+          </w:p>
+        </w:tc>
+        <w:tc>
+          <w:tcPr/>
+          <w:p>
+            <w:pPr>
+              <w:pStyle w:val="Compact"/>
+              <w:jc w:val="right"/>
+            </w:pPr>
+            <w:r>
+              <w:t xml:space="preserve">CutFEM vs finer body-fitted mesh: max. compliance difference (%)</w:t>
+            </w:r>
+          </w:p>
+        </w:tc>
+        <w:tc>
+          <w:tcPr/>
+          <w:p>
+            <w:pPr>
+              <w:pStyle w:val="Compact"/>
+              <w:jc w:val="right"/>
+            </w:pPr>
+            <w:r>
+              <w:t xml:space="preserve">Body-fitted discretisation: change between its two mesh levels (%)</w:t>
+            </w:r>
+          </w:p>
+        </w:tc>
+      </w:tr>
+      <w:tr>
+        <w:tc>
+          <w:tcPr/>
+          <w:p>
+            <w:pPr>
+              <w:pStyle w:val="Compact"/>
+            </w:pPr>
+            <w:r>
+              <w:t xml:space="preserve">Four single uncut cells</w:t>
+            </w:r>
+          </w:p>
+        </w:tc>
+        <w:tc>
+          <w:tcPr/>
+          <w:p>
+            <w:pPr>
+              <w:pStyle w:val="Compact"/>
+            </w:pPr>
+            <w:r>
+              <w:t xml:space="preserve">Six fixture load cases</w:t>
+            </w:r>
+          </w:p>
+        </w:tc>
+        <w:tc>
+          <w:tcPr/>
+          <w:p>
+            <w:pPr>
+              <w:pStyle w:val="Compact"/>
+              <w:jc w:val="right"/>
+            </w:pPr>
+            <w:r>
+              <w:t xml:space="preserve">0.084–0.101</w:t>
+            </w:r>
+          </w:p>
+        </w:tc>
+        <w:tc>
+          <w:tcPr/>
+          <w:p>
+            <w:pPr>
+              <w:pStyle w:val="Compact"/>
+              <w:jc w:val="right"/>
+            </w:pPr>
+            <w:r>
+              <w:t xml:space="preserve">0.130–0.273</w:t>
+            </w:r>
+          </w:p>
+        </w:tc>
+      </w:tr>
+      <w:tr>
+        <w:tc>
+          <w:tcPr/>
+          <w:p>
+            <w:pPr>
+              <w:pStyle w:val="Compact"/>
+            </w:pPr>
+            <w:r>
+              <w:t xml:space="preserve">One uncut cell</w:t>
+            </w:r>
+          </w:p>
+        </w:tc>
+        <w:tc>
+          <w:tcPr/>
+          <w:p>
+            <w:pPr>
+              <w:pStyle w:val="Compact"/>
+            </w:pPr>
+            <w:r>
+              <w:t xml:space="preserve">Twelve local tractions on finite areas</w:t>
+            </w:r>
+          </w:p>
+        </w:tc>
+        <w:tc>
+          <w:tcPr/>
+          <w:p>
+            <w:pPr>
+              <w:pStyle w:val="Compact"/>
+              <w:jc w:val="right"/>
+            </w:pPr>
+            <w:r>
+              <w:t xml:space="preserve">0.253</w:t>
+            </w:r>
+          </w:p>
+        </w:tc>
+        <w:tc>
+          <w:tcPr/>
+          <w:p>
+            <w:pPr>
+              <w:pStyle w:val="Compact"/>
+              <w:jc w:val="right"/>
+            </w:pPr>
+            <w:r>
+              <w:t xml:space="preserve">0.502</w:t>
+            </w:r>
+          </w:p>
+        </w:tc>
+      </w:tr>
+      <w:tr>
+        <w:tc>
+          <w:tcPr/>
+          <w:p>
+            <w:pPr>
+              <w:pStyle w:val="Compact"/>
+            </w:pPr>
+            <w:r>
+              <w:t xml:space="preserve">Assemblies of uncut cells: two cells, 2×2×2, 1×1×4</w:t>
+            </w:r>
+          </w:p>
+        </w:tc>
+        <w:tc>
+          <w:tcPr/>
+          <w:p>
+            <w:pPr>
+              <w:pStyle w:val="Compact"/>
+            </w:pPr>
+            <w:r>
+              <w:t xml:space="preserve">Fixture load cases</w:t>
+            </w:r>
+          </w:p>
+        </w:tc>
+        <w:tc>
+          <w:tcPr/>
+          <w:p>
+            <w:pPr>
+              <w:pStyle w:val="Compact"/>
+              <w:jc w:val="right"/>
+            </w:pPr>
+            <w:r>
+              <w:t xml:space="preserve">0.052–0.090</w:t>
+            </w:r>
+          </w:p>
+        </w:tc>
+        <w:tc>
+          <w:tcPr/>
+          <w:p>
+            <w:pPr>
+              <w:pStyle w:val="Compact"/>
+              <w:jc w:val="right"/>
+            </w:pPr>
+            <w:r>
+              <w:t xml:space="preserve">0.108–0.190</w:t>
+            </w:r>
+          </w:p>
+        </w:tc>
+      </w:tr>
+    </w:tbl>
+    <w:p>
+      <w:pPr>
+        <w:pStyle w:val="BodyText"/>
+      </w:pPr>
+      <w:r>
         <w:t xml:space="preserve">Figure S01(c) reports a step-refinement study of the numerical thickness derivative on four cells: relative to the production step</w:t>
       </w:r>
       <w:r>
@@ -19475,7 +19700,7 @@
         </m:sSup>
       </m:oMath>
       <w:r>
-        <w:t xml:space="preserve">. An element-level check over the partially filled elements of the eight detailed cells shows that the discrete moments do not preserve the nesting behind Eq. (H.6) everywhere. The element stiffnesses are positive semidefinite to rounding, but the exact derivative of the discrete moments at fixed clipping topology gives element derivative matrices with negative eigenvalues: in the uncut cells the smallest ratio</w:t>
+        <w:t xml:space="preserve">. An element-level check over the partially filled elements of the eight detailed cells shows that the discrete moments do not preserve the nesting behind Eq. (H.7) everywhere. The element stiffnesses are positive semidefinite to rounding, but the exact derivative of the discrete moments at fixed clipping topology gives element derivative matrices with negative eigenvalues: in the uncut cells the smallest ratio</w:t>
       </w:r>
       <w:r>
         <w:t xml:space="preserve"> </w:t>
@@ -20091,7 +20316,7 @@
         </w:numPr>
       </w:pPr>
       <w:r>
-        <w:t xml:space="preserve">Pairs in configuration x (Figure 8; Supplementary Note S4), each target with its exact continuous-thickness neighbour, for U1, M1, M2 and H1; the interface-only variant was run for U1, M1 and M2.</w:t>
+        <w:t xml:space="preserve">Pairs in configuration x (Figure 9; Supplementary Note S4), each target with its exact continuous-thickness neighbour, for U1, M1, M2 and H1; the interface-only variant was run for U1, M1 and M2.</w:t>
       </w:r>
     </w:p>
     <w:p>
@@ -23530,7 +23755,7 @@
         <w:t xml:space="preserve"> </w:t>
       </w:r>
       <w:r>
-        <w:t xml:space="preserve">of Eq. (9) for the three loads, obtained by reverse-mode differentiation of the moment integrals at the fixed recovered fields. Its arithmetic is that of the timed route of Table 2: the network and the correction's smoothing and coarse solve in single precision, the stiffness products of the condensed action in double precision (Appendix F.2). The three routes read the same generated cell geometries; geometry generation is not timed.</w:t>
+        <w:t xml:space="preserve">of Eq. (9) for the three loads, obtained by reverse-mode differentiation of the moment integrals at the fixed recovered fields. Its arithmetic is that of the timed route of Table 1: the network and the correction's smoothing and coarse solve in single precision, the stiffness products of the condensed action in double precision (Appendix F.2). The three routes read the same generated cell geometries; geometry generation is not timed.</w:t>
       </w:r>
     </w:p>
     <w:p>
@@ -27443,7 +27668,7 @@
         <w:pStyle w:val="FirstParagraph"/>
       </w:pPr>
       <w:r>
-        <w:t xml:space="preserve">In both configurations of Figure 8, the six face loads are the three Cartesian traction directions applied to the target face and the same three directions applied to the neighbour face. The consistent-load implementation integrates the Q2 surface shape functions, normalises each nodal load to unit resultant before support elimination, and then eliminates clamped entries. Three similarly normalised consistent tractions on the target cut surface are reported separately when present. The neighbour is an uncut cell; where the target's cut plane meets the shared face, the pair is therefore a test configuration rather than a physically cut specimen.</w:t>
+        <w:t xml:space="preserve">In both configurations of Figure 9, the six face loads are the three Cartesian traction directions applied to the target face and the same three directions applied to the neighbour face. The consistent-load implementation integrates the Q2 surface shape functions, normalises each nodal load to unit resultant before support elimination, and then eliminates clamped entries. Three similarly normalised consistent tractions on the target cut surface are reported separately when present. The neighbour is an uncut cell; where the target's cut plane meets the shared face, the pair is therefore a test configuration rather than a physically cut specimen.</w:t>
       </w:r>
     </w:p>
     <w:p>
@@ -31497,7 +31722,7 @@
         <w:t xml:space="preserve"> </w:t>
       </w:r>
       <w:r>
-        <w:t xml:space="preserve">along a search direction, where the inconsistency discussed in Section 6.2 would matter. Neither the gradient norm nor a KKT residual is used for stopping, since the estimate is not the gradient of</w:t>
+        <w:t xml:space="preserve">along a search direction, where the inconsistency discussed in Section 3.3 would matter. Neither the gradient norm nor a KKT residual is used for stopping, since the estimate is not the gradient of</w:t>
       </w:r>
       <w:r>
         <w:t xml:space="preserve"> </w:t>
@@ -35786,7 +36011,7 @@
         <w:t xml:space="preserve"> </w:t>
       </w:r>
       <w:r>
-        <w:t xml:space="preserve">of the validation geometries (Section 5.1), rather than at its image, 56.31°; the network is not equivariant under the cube symmetries (Section 6.4). Apart from the clamped cut band, no DOF is fixed.</w:t>
+        <w:t xml:space="preserve">of the validation geometries (Section 5.1), rather than at its image, 56.31°; the network is not equivariant under the cube symmetries (Section 6.3). Apart from the clamped cut band, no DOF is fixed.</w:t>
       </w:r>
     </w:p>
     <w:p>
@@ -37189,7 +37414,7 @@
         <w:pStyle w:val="BodyText"/>
       </w:pPr>
       <w:r>
-        <w:t xml:space="preserve">Every fine-scale value is a NICE value; exact checks in Table ST21. Iterations and first and last compliances: Table 7. Figure 13a,b draws the corner parameters in the layer</w:t>
+        <w:t xml:space="preserve">Every fine-scale value is a NICE value; exact checks in Table ST21. Iterations and first and last compliances: Table 7. Figure 15a,b draws the corner parameters in the layer</w:t>
       </w:r>
       <w:r>
         <w:t xml:space="preserve"> </w:t>
@@ -40624,6 +40849,154 @@
         <w:pStyle w:val="BodyText"/>
       </w:pPr>
       <w:r>
+        <w:t xml:space="preserve">Exact checks at the first design iteration, with the metrics of Table ST21: 24 cells,</w:t>
+      </w:r>
+      <w:r>
+        <w:t xml:space="preserve"> </w:t>
+      </w:r>
+      <m:oMath>
+        <m:r>
+          <m:t>C</m:t>
+        </m:r>
+        <m:r>
+          <m:rPr>
+            <m:sty m:val="p"/>
+          </m:rPr>
+          <m:t>=</m:t>
+        </m:r>
+        <m:r>
+          <m:t>94.353</m:t>
+        </m:r>
+      </m:oMath>
+      <w:r>
+        <w:t xml:space="preserve">,</w:t>
+      </w:r>
+      <w:r>
+        <w:t xml:space="preserve"> </w:t>
+      </w:r>
+      <m:oMath>
+        <m:acc>
+          <m:accPr>
+            <m:chr m:val="̂"/>
+          </m:accPr>
+          <m:e>
+            <m:r>
+              <m:t>C</m:t>
+            </m:r>
+          </m:e>
+        </m:acc>
+        <m:r>
+          <m:rPr>
+            <m:sty m:val="p"/>
+          </m:rPr>
+          <m:t>=</m:t>
+        </m:r>
+        <m:r>
+          <m:t>94.341</m:t>
+        </m:r>
+      </m:oMath>
+      <w:r>
+        <w:t xml:space="preserve">, surrogate compliance error</w:t>
+      </w:r>
+      <w:r>
+        <w:t xml:space="preserve"> </w:t>
+      </w:r>
+      <m:oMath>
+        <m:r>
+          <m:rPr>
+            <m:sty m:val="p"/>
+          </m:rPr>
+          <m:t>−</m:t>
+        </m:r>
+        <m:r>
+          <m:t>0.0132</m:t>
+        </m:r>
+        <m:r>
+          <m:rPr>
+            <m:sty m:val="p"/>
+          </m:rPr>
+          <m:t>%</m:t>
+        </m:r>
+      </m:oMath>
+      <w:r>
+        <w:t xml:space="preserve">, gradient error 0.045%, cosine 0.99999993, component error median / 95th percentile / max 0.011 / 0.048 / 0.059%, exact sign in all 64 components; 51 cells,</w:t>
+      </w:r>
+      <w:r>
+        <w:t xml:space="preserve"> </w:t>
+      </w:r>
+      <m:oMath>
+        <m:r>
+          <m:t>C</m:t>
+        </m:r>
+        <m:r>
+          <m:rPr>
+            <m:sty m:val="p"/>
+          </m:rPr>
+          <m:t>=</m:t>
+        </m:r>
+        <m:r>
+          <m:t>89.129</m:t>
+        </m:r>
+      </m:oMath>
+      <w:r>
+        <w:t xml:space="preserve">,</w:t>
+      </w:r>
+      <w:r>
+        <w:t xml:space="preserve"> </w:t>
+      </w:r>
+      <m:oMath>
+        <m:acc>
+          <m:accPr>
+            <m:chr m:val="̂"/>
+          </m:accPr>
+          <m:e>
+            <m:r>
+              <m:t>C</m:t>
+            </m:r>
+          </m:e>
+        </m:acc>
+        <m:r>
+          <m:rPr>
+            <m:sty m:val="p"/>
+          </m:rPr>
+          <m:t>=</m:t>
+        </m:r>
+        <m:r>
+          <m:t>89.119</m:t>
+        </m:r>
+      </m:oMath>
+      <w:r>
+        <w:t xml:space="preserve">,</w:t>
+      </w:r>
+      <w:r>
+        <w:t xml:space="preserve"> </w:t>
+      </w:r>
+      <m:oMath>
+        <m:r>
+          <m:rPr>
+            <m:sty m:val="p"/>
+          </m:rPr>
+          <m:t>−</m:t>
+        </m:r>
+        <m:r>
+          <m:t>0.0113</m:t>
+        </m:r>
+        <m:r>
+          <m:rPr>
+            <m:sty m:val="p"/>
+          </m:rPr>
+          <m:t>%</m:t>
+        </m:r>
+      </m:oMath>
+      <w:r>
+        <w:t xml:space="preserve">, 0.047%, 0.99999994, 0.009 / 0.034 / 0.063%, all 128 components. The exact reference of the 88- and 110-cell plates was not computed.</w:t>
+      </w:r>
+    </w:p>
+    <w:p>
+      <w:pPr>
+        <w:pStyle w:val="BodyText"/>
+      </w:pPr>
+      <w:r>
         <w:rPr>
           <w:b/>
           <w:bCs/>
@@ -40634,7 +41007,33 @@
         <w:t xml:space="preserve"> </w:t>
       </w:r>
       <w:r>
-        <w:t xml:space="preserve">The uniform start, the final NICE design and the homogenisation design of S6.3; the intermediate designs were not checked. Exact condensation of the 55 distinct cells with PARDISO's Schur-complement option, verified column-wise against interior solves; assembled solve, with every cut-band DOF of the cut cells fixed, to a recursive relative residual of</w:t>
+        <w:t xml:space="preserve">The uniform start, the final NICE design and the homogenisation design of S6.3, and two uniform designs at the volume bound</w:t>
+      </w:r>
+      <w:r>
+        <w:t xml:space="preserve"> </w:t>
+      </w:r>
+      <m:oMath>
+        <m:sSup>
+          <m:e>
+            <m:r>
+              <m:t>V</m:t>
+            </m:r>
+          </m:e>
+          <m:sup>
+            <m:r>
+              <m:rPr>
+                <m:sty m:val="p"/>
+              </m:rPr>
+              <m:t>*</m:t>
+            </m:r>
+          </m:sup>
+        </m:sSup>
+      </m:oMath>
+      <w:r>
+        <w:t xml:space="preserve"> </w:t>
+      </w:r>
+      <w:r>
+        <w:t xml:space="preserve">for comparison; the intermediate designs were not checked. Exact condensation of the 55 distinct cells with PARDISO's Schur-complement option, verified column-wise against interior solves; assembled solve, with every cut-band DOF of the cut cells fixed, to a recursive relative residual of</w:t>
       </w:r>
       <w:r>
         <w:t xml:space="preserve"> </w:t>
@@ -41148,7 +41547,2287 @@
           </w:p>
         </w:tc>
       </w:tr>
+      <w:tr>
+        <w:tc>
+          <w:tcPr/>
+          <w:p>
+            <w:pPr>
+              <w:pStyle w:val="Compact"/>
+            </w:pPr>
+            <w:r>
+              <w:t xml:space="preserve">Uniform design at</w:t>
+            </w:r>
+            <w:r>
+              <w:t xml:space="preserve"> </w:t>
+            </w:r>
+            <m:oMath>
+              <m:sSup>
+                <m:e>
+                  <m:r>
+                    <m:t>V</m:t>
+                  </m:r>
+                </m:e>
+                <m:sup>
+                  <m:r>
+                    <m:rPr>
+                      <m:sty m:val="p"/>
+                    </m:rPr>
+                    <m:t>*</m:t>
+                  </m:r>
+                </m:sup>
+              </m:sSup>
+            </m:oMath>
+            <w:r>
+              <w:t xml:space="preserve">, 64 free parameters (loaded-face parameters 0.40)</w:t>
+            </w:r>
+          </w:p>
+        </w:tc>
+        <w:tc>
+          <w:tcPr/>
+          <w:p>
+            <w:pPr>
+              <w:pStyle w:val="Compact"/>
+              <w:jc w:val="right"/>
+            </w:pPr>
+            <w:r>
+              <w:t xml:space="preserve">115.357</w:t>
+            </w:r>
+          </w:p>
+        </w:tc>
+        <w:tc>
+          <w:tcPr/>
+          <w:p>
+            <w:pPr>
+              <w:pStyle w:val="Compact"/>
+              <w:jc w:val="right"/>
+            </w:pPr>
+            <w:r>
+              <w:t xml:space="preserve">115.335</w:t>
+            </w:r>
+          </w:p>
+        </w:tc>
+        <w:tc>
+          <w:tcPr/>
+          <w:p>
+            <w:pPr>
+              <w:pStyle w:val="Compact"/>
+              <w:jc w:val="right"/>
+            </w:pPr>
+            <w:r>
+              <w:t xml:space="preserve">−0.0191</w:t>
+            </w:r>
+          </w:p>
+        </w:tc>
+        <w:tc>
+          <w:tcPr/>
+          <w:p>
+            <w:pPr>
+              <w:pStyle w:val="Compact"/>
+              <w:jc w:val="right"/>
+            </w:pPr>
+            <w:r>
+              <w:t xml:space="preserve">0.064</w:t>
+            </w:r>
+          </w:p>
+        </w:tc>
+        <w:tc>
+          <w:tcPr/>
+          <w:p>
+            <w:pPr>
+              <w:pStyle w:val="Compact"/>
+              <w:jc w:val="right"/>
+            </w:pPr>
+            <w:r>
+              <w:t xml:space="preserve">0.99999995</w:t>
+            </w:r>
+          </w:p>
+        </w:tc>
+        <w:tc>
+          <w:tcPr/>
+          <w:p>
+            <w:pPr>
+              <w:pStyle w:val="Compact"/>
+            </w:pPr>
+            <w:r>
+              <w:t xml:space="preserve">—</w:t>
+            </w:r>
+          </w:p>
+        </w:tc>
+        <w:tc>
+          <w:tcPr/>
+          <w:p>
+            <w:pPr>
+              <w:pStyle w:val="Compact"/>
+            </w:pPr>
+            <w:r>
+              <w:t xml:space="preserve">1.000</w:t>
+            </w:r>
+          </w:p>
+        </w:tc>
+      </w:tr>
+      <w:tr>
+        <w:tc>
+          <w:tcPr/>
+          <w:p>
+            <w:pPr>
+              <w:pStyle w:val="Compact"/>
+            </w:pPr>
+            <w:r>
+              <w:t xml:space="preserve">Uniform design at</w:t>
+            </w:r>
+            <w:r>
+              <w:t xml:space="preserve"> </w:t>
+            </w:r>
+            <m:oMath>
+              <m:sSup>
+                <m:e>
+                  <m:r>
+                    <m:t>V</m:t>
+                  </m:r>
+                </m:e>
+                <m:sup>
+                  <m:r>
+                    <m:rPr>
+                      <m:sty m:val="p"/>
+                    </m:rPr>
+                    <m:t>*</m:t>
+                  </m:r>
+                </m:sup>
+              </m:sSup>
+            </m:oMath>
+            <w:r>
+              <w:t xml:space="preserve">, all 74 parameters</w:t>
+            </w:r>
+          </w:p>
+        </w:tc>
+        <w:tc>
+          <w:tcPr/>
+          <w:p>
+            <w:pPr>
+              <w:pStyle w:val="Compact"/>
+              <w:jc w:val="right"/>
+            </w:pPr>
+            <w:r>
+              <w:t xml:space="preserve">113.279</w:t>
+            </w:r>
+          </w:p>
+        </w:tc>
+        <w:tc>
+          <w:tcPr/>
+          <w:p>
+            <w:pPr>
+              <w:pStyle w:val="Compact"/>
+              <w:jc w:val="right"/>
+            </w:pPr>
+            <w:r>
+              <w:t xml:space="preserve">113.259</w:t>
+            </w:r>
+          </w:p>
+        </w:tc>
+        <w:tc>
+          <w:tcPr/>
+          <w:p>
+            <w:pPr>
+              <w:pStyle w:val="Compact"/>
+              <w:jc w:val="right"/>
+            </w:pPr>
+            <w:r>
+              <w:t xml:space="preserve">−0.0179</w:t>
+            </w:r>
+          </w:p>
+        </w:tc>
+        <w:tc>
+          <w:tcPr/>
+          <w:p>
+            <w:pPr>
+              <w:pStyle w:val="Compact"/>
+              <w:jc w:val="right"/>
+            </w:pPr>
+            <w:r>
+              <w:t xml:space="preserve">0.055</w:t>
+            </w:r>
+          </w:p>
+        </w:tc>
+        <w:tc>
+          <w:tcPr/>
+          <w:p>
+            <w:pPr>
+              <w:pStyle w:val="Compact"/>
+              <w:jc w:val="right"/>
+            </w:pPr>
+            <w:r>
+              <w:t xml:space="preserve">0.99999995</w:t>
+            </w:r>
+          </w:p>
+        </w:tc>
+        <w:tc>
+          <w:tcPr/>
+          <w:p>
+            <w:pPr>
+              <w:pStyle w:val="Compact"/>
+            </w:pPr>
+            <w:r>
+              <w:t xml:space="preserve">—</w:t>
+            </w:r>
+          </w:p>
+        </w:tc>
+        <w:tc>
+          <w:tcPr/>
+          <w:p>
+            <w:pPr>
+              <w:pStyle w:val="Compact"/>
+            </w:pPr>
+            <w:r>
+              <w:t xml:space="preserve">1.000</w:t>
+            </w:r>
+          </w:p>
+        </w:tc>
+      </w:tr>
     </w:tbl>
+    <w:p>
+      <w:pPr>
+        <w:pStyle w:val="Heading2"/>
+      </w:pPr>
+      <w:r>
+        <w:t xml:space="preserve">Supplementary Note S7. Transfer to a second TPMS family: gyroid sheet cells</w:t>
+      </w:r>
+    </w:p>
+    <w:p>
+      <w:pPr>
+        <w:pStyle w:val="FirstParagraph"/>
+      </w:pPr>
+      <w:r>
+        <w:t xml:space="preserve">The construction of Sections 3 and 4, that is, the condensed energy with the transpose of the complete extension, Propositions 1–4 and the correction</w:t>
+      </w:r>
+      <w:r>
+        <w:t xml:space="preserve"> </w:t>
+      </w:r>
+      <m:oMath>
+        <m:r>
+          <m:rPr>
+            <m:scr m:val="script"/>
+            <m:sty m:val="p"/>
+          </m:rPr>
+          <m:t>W</m:t>
+        </m:r>
+      </m:oMath>
+      <w:r>
+        <w:t xml:space="preserve">, uses the symmetry and positive semidefiniteness of the cell stiffness and the positive definiteness of its interior block, not the level-set function of Eq. (1). The trained network, in contrast, has seen Schwarz-P cells only (Sections 6.1 and 6.3). This note applies NICE to gyroid sheet cells, first with the network parameters of Table 2 unchanged (zero-shot) and then after a short continuation of training that includes a few gyroid cells. It is not part of the evidence of Section 5.</w:t>
+      </w:r>
+    </w:p>
+    <w:p>
+      <w:pPr>
+        <w:pStyle w:val="BodyText"/>
+      </w:pPr>
+      <w:r>
+        <w:rPr>
+          <w:b/>
+          <w:bCs/>
+        </w:rPr>
+        <w:t xml:space="preserve">Cells.</w:t>
+      </w:r>
+      <w:r>
+        <w:t xml:space="preserve"> </w:t>
+      </w:r>
+      <w:r>
+        <w:t xml:space="preserve">A gyroid cell replaces the level-set function of Eq. (1) by</w:t>
+      </w:r>
+      <w:r>
+        <w:t xml:space="preserve"> </w:t>
+      </w:r>
+      <m:oMath>
+        <m:sSub>
+          <m:e>
+            <m:r>
+              <m:t>ϕ</m:t>
+            </m:r>
+          </m:e>
+          <m:sub>
+            <m:r>
+              <m:t>G</m:t>
+            </m:r>
+          </m:sub>
+        </m:sSub>
+        <m:r>
+          <m:rPr>
+            <m:sty m:val="p"/>
+          </m:rPr>
+          <m:t>(</m:t>
+        </m:r>
+        <m:r>
+          <m:t>x</m:t>
+        </m:r>
+        <m:r>
+          <m:rPr>
+            <m:sty m:val="p"/>
+          </m:rPr>
+          <m:t>)</m:t>
+        </m:r>
+        <m:r>
+          <m:rPr>
+            <m:sty m:val="p"/>
+          </m:rPr>
+          <m:t>=</m:t>
+        </m:r>
+        <m:r>
+          <m:rPr>
+            <m:sty m:val="p"/>
+          </m:rPr>
+          <m:t>sin</m:t>
+        </m:r>
+        <m:r>
+          <m:t>2</m:t>
+        </m:r>
+        <m:r>
+          <m:t>π</m:t>
+        </m:r>
+        <m:sSub>
+          <m:e>
+            <m:r>
+              <m:t>x</m:t>
+            </m:r>
+          </m:e>
+          <m:sub>
+            <m:r>
+              <m:t>1</m:t>
+            </m:r>
+          </m:sub>
+        </m:sSub>
+        <m:r>
+          <m:rPr>
+            <m:sty m:val="p"/>
+          </m:rPr>
+          <m:t>cos</m:t>
+        </m:r>
+        <m:r>
+          <m:t>2</m:t>
+        </m:r>
+        <m:r>
+          <m:t>π</m:t>
+        </m:r>
+        <m:sSub>
+          <m:e>
+            <m:r>
+              <m:t>x</m:t>
+            </m:r>
+          </m:e>
+          <m:sub>
+            <m:r>
+              <m:t>2</m:t>
+            </m:r>
+          </m:sub>
+        </m:sSub>
+        <m:r>
+          <m:rPr>
+            <m:sty m:val="p"/>
+          </m:rPr>
+          <m:t>+</m:t>
+        </m:r>
+        <m:r>
+          <m:rPr>
+            <m:sty m:val="p"/>
+          </m:rPr>
+          <m:t>sin</m:t>
+        </m:r>
+        <m:r>
+          <m:t>2</m:t>
+        </m:r>
+        <m:r>
+          <m:t>π</m:t>
+        </m:r>
+        <m:sSub>
+          <m:e>
+            <m:r>
+              <m:t>x</m:t>
+            </m:r>
+          </m:e>
+          <m:sub>
+            <m:r>
+              <m:t>2</m:t>
+            </m:r>
+          </m:sub>
+        </m:sSub>
+        <m:r>
+          <m:rPr>
+            <m:sty m:val="p"/>
+          </m:rPr>
+          <m:t>cos</m:t>
+        </m:r>
+        <m:r>
+          <m:t>2</m:t>
+        </m:r>
+        <m:r>
+          <m:t>π</m:t>
+        </m:r>
+        <m:sSub>
+          <m:e>
+            <m:r>
+              <m:t>x</m:t>
+            </m:r>
+          </m:e>
+          <m:sub>
+            <m:r>
+              <m:t>3</m:t>
+            </m:r>
+          </m:sub>
+        </m:sSub>
+        <m:r>
+          <m:rPr>
+            <m:sty m:val="p"/>
+          </m:rPr>
+          <m:t>+</m:t>
+        </m:r>
+        <m:r>
+          <m:rPr>
+            <m:sty m:val="p"/>
+          </m:rPr>
+          <m:t>sin</m:t>
+        </m:r>
+        <m:r>
+          <m:t>2</m:t>
+        </m:r>
+        <m:r>
+          <m:t>π</m:t>
+        </m:r>
+        <m:sSub>
+          <m:e>
+            <m:r>
+              <m:t>x</m:t>
+            </m:r>
+          </m:e>
+          <m:sub>
+            <m:r>
+              <m:t>3</m:t>
+            </m:r>
+          </m:sub>
+        </m:sSub>
+        <m:r>
+          <m:rPr>
+            <m:sty m:val="p"/>
+          </m:rPr>
+          <m:t>cos</m:t>
+        </m:r>
+        <m:r>
+          <m:t>2</m:t>
+        </m:r>
+        <m:r>
+          <m:t>π</m:t>
+        </m:r>
+        <m:sSub>
+          <m:e>
+            <m:r>
+              <m:t>x</m:t>
+            </m:r>
+          </m:e>
+          <m:sub>
+            <m:r>
+              <m:t>1</m:t>
+            </m:r>
+          </m:sub>
+        </m:sSub>
+      </m:oMath>
+      <w:r>
+        <w:t xml:space="preserve"> </w:t>
+      </w:r>
+      <w:r>
+        <w:t xml:space="preserve">and keeps the box, the trilinear corner parameters, the optional planar cut and the settings of Table 1 (background mesh</w:t>
+      </w:r>
+      <w:r>
+        <w:t xml:space="preserve"> </w:t>
+      </w:r>
+      <m:oMath>
+        <m:r>
+          <m:t>n</m:t>
+        </m:r>
+        <m:r>
+          <m:rPr>
+            <m:sty m:val="p"/>
+          </m:rPr>
+          <m:t>=</m:t>
+        </m:r>
+        <m:r>
+          <m:t>32</m:t>
+        </m:r>
+      </m:oMath>
+      <w:r>
+        <w:t xml:space="preserve">, material, ghost penalty, retained space and correction 8 /</w:t>
+      </w:r>
+      <w:r>
+        <w:t xml:space="preserve"> </w:t>
+      </w:r>
+      <m:oMath>
+        <m:sSub>
+          <m:e>
+            <m:r>
+              <m:t>Q</m:t>
+            </m:r>
+          </m:e>
+          <m:sub>
+            <m:r>
+              <m:t>1</m:t>
+            </m:r>
+          </m:sub>
+        </m:sSub>
+        <m:r>
+          <m:rPr>
+            <m:sty m:val="p"/>
+          </m:rPr>
+          <m:t>(</m:t>
+        </m:r>
+        <m:r>
+          <m:t>17</m:t>
+        </m:r>
+        <m:r>
+          <m:rPr>
+            <m:sty m:val="p"/>
+          </m:rPr>
+          <m:t>)</m:t>
+        </m:r>
+      </m:oMath>
+      <w:r>
+        <w:t xml:space="preserve"> </w:t>
+      </w:r>
+      <w:r>
+        <w:t xml:space="preserve">/ 8). Every gyroid cell is the twin of one P cell: it keeps the P cell's position, cut plane and stratum (uncut or cut), and its corner parameters are mapped from the P values so that a uniform-thickness cell keeps its sheet volume fraction (for example 23.3% against 23.2% and 5.8% against 6.2% for two twins). The cells are generated by a version of the geometry stage that takes the level-set function as input; with the P function it reproduces the eight cells of the</w:t>
+      </w:r>
+      <w:r>
+        <w:t xml:space="preserve"> </w:t>
+      </w:r>
+      <m:oMath>
+        <m:r>
+          <m:t>2</m:t>
+        </m:r>
+        <m:r>
+          <m:rPr>
+            <m:sty m:val="p"/>
+          </m:rPr>
+          <m:t>×</m:t>
+        </m:r>
+        <m:r>
+          <m:t>2</m:t>
+        </m:r>
+        <m:r>
+          <m:rPr>
+            <m:sty m:val="p"/>
+          </m:rPr>
+          <m:t>×</m:t>
+        </m:r>
+        <m:r>
+          <m:t>2</m:t>
+        </m:r>
+      </m:oMath>
+      <w:r>
+        <w:t xml:space="preserve"> </w:t>
+      </w:r>
+      <w:r>
+        <w:t xml:space="preserve">block of Section 5.8 cell by cell. When a lattice is generated, it keeps the largest face-connected set of active elements of the whole lattice rather than of each cell and removes fragments of less than a quarter of an element that have no ghost-penalty support, repeating both steps until nothing changes; the retained DOFs of neighbouring cells then coincide on their shared faces except along the cell edges (unmatched DOFs are treated as in Section 2.3). The sixteen single cells are the twins of the validation cells fresh_val_2000 to fresh_val_2015 (geometry identifiers gval_000 to gval_1500 in the data archive), which include U1, U2, L1, M1, M2 and H1–H3 of R1 and belong to the 20 checkpoint-selection geometries of Table ST01; the lattice is the twin of the</w:t>
+      </w:r>
+      <w:r>
+        <w:t xml:space="preserve"> </w:t>
+      </w:r>
+      <m:oMath>
+        <m:r>
+          <m:t>2</m:t>
+        </m:r>
+        <m:r>
+          <m:rPr>
+            <m:sty m:val="p"/>
+          </m:rPr>
+          <m:t>×</m:t>
+        </m:r>
+        <m:r>
+          <m:t>2</m:t>
+        </m:r>
+        <m:r>
+          <m:rPr>
+            <m:sty m:val="p"/>
+          </m:rPr>
+          <m:t>×</m:t>
+        </m:r>
+        <m:r>
+          <m:t>2</m:t>
+        </m:r>
+      </m:oMath>
+      <w:r>
+        <w:t xml:space="preserve"> </w:t>
+      </w:r>
+      <w:r>
+        <w:t xml:space="preserve">block (glat222). No gyroid cell entered the training or checkpoint selection of any variant of Table 2.</w:t>
+      </w:r>
+    </w:p>
+    <w:p>
+      <w:pPr>
+        <w:pStyle w:val="BodyText"/>
+      </w:pPr>
+      <w:r>
+        <w:t xml:space="preserve">Propositions 1–3 and the properties of Section 4.1 hold for these cells as for the P cells, since assumptions (A1)–(A3) concern the stiffness and the assembly, and the network extension is admissible and reproduces rigid-body motion by construction. Proposition 4 holds under its spectral condition, which, as for the cells of Sections 5.8–5.10, was not checked on the gyroid cells.</w:t>
+      </w:r>
+    </w:p>
+    <w:p>
+      <w:pPr>
+        <w:pStyle w:val="BodyText"/>
+      </w:pPr>
+      <w:r>
+        <w:rPr>
+          <w:b/>
+          <w:bCs/>
+        </w:rPr>
+        <w:t xml:space="preserve">Variants.</w:t>
+      </w:r>
+      <w:r>
+        <w:t xml:space="preserve"> </w:t>
+      </w:r>
+      <w:r>
+        <w:rPr>
+          <w:i/>
+          <w:iCs/>
+        </w:rPr>
+        <w:t xml:space="preserve">NICE, zero-shot</w:t>
+      </w:r>
+      <w:r>
+        <w:t xml:space="preserve">: NICE with the network parameters of Table 2, unchanged.</w:t>
+      </w:r>
+      <w:r>
+        <w:t xml:space="preserve"> </w:t>
+      </w:r>
+      <w:r>
+        <w:rPr>
+          <w:i/>
+          <w:iCs/>
+        </w:rPr>
+        <w:t xml:space="preserve">NICE, continued</w:t>
+      </w:r>
+      <w:r>
+        <w:t xml:space="preserve"> </w:t>
+      </w:r>
+      <w:r>
+        <w:t xml:space="preserve">(record identifier A3G_ft): NICE's parameters continued for 8,000 training steps on 96 P training cells and 18 gyroid twins of P training cells (cells with at most 420,000 DOFs), with the correction 8 /</w:t>
+      </w:r>
+      <w:r>
+        <w:t xml:space="preserve"> </w:t>
+      </w:r>
+      <m:oMath>
+        <m:sSub>
+          <m:e>
+            <m:r>
+              <m:t>Q</m:t>
+            </m:r>
+          </m:e>
+          <m:sub>
+            <m:r>
+              <m:t>1</m:t>
+            </m:r>
+          </m:sub>
+        </m:sSub>
+        <m:r>
+          <m:rPr>
+            <m:sty m:val="p"/>
+          </m:rPr>
+          <m:t>(</m:t>
+        </m:r>
+        <m:r>
+          <m:t>17</m:t>
+        </m:r>
+        <m:r>
+          <m:rPr>
+            <m:sty m:val="p"/>
+          </m:rPr>
+          <m:t>)</m:t>
+        </m:r>
+      </m:oMath>
+      <w:r>
+        <w:t xml:space="preserve"> </w:t>
+      </w:r>
+      <w:r>
+        <w:t xml:space="preserve">/ 8 inside the training loop as in Section 4.5. Its checkpoint was selected on the P validation list only (selection score 0.00339, against 0.00237 for NICE; Table ST01), so the sixteen gyroid twins and the gyroid lattice entered neither its training nor its selection. Both variants apply the correction 8 /</w:t>
+      </w:r>
+      <w:r>
+        <w:t xml:space="preserve"> </w:t>
+      </w:r>
+      <m:oMath>
+        <m:sSub>
+          <m:e>
+            <m:r>
+              <m:t>Q</m:t>
+            </m:r>
+          </m:e>
+          <m:sub>
+            <m:r>
+              <m:t>1</m:t>
+            </m:r>
+          </m:sub>
+        </m:sSub>
+        <m:r>
+          <m:rPr>
+            <m:sty m:val="p"/>
+          </m:rPr>
+          <m:t>(</m:t>
+        </m:r>
+        <m:r>
+          <m:t>17</m:t>
+        </m:r>
+        <m:r>
+          <m:rPr>
+            <m:sty m:val="p"/>
+          </m:rPr>
+          <m:t>)</m:t>
+        </m:r>
+      </m:oMath>
+      <w:r>
+        <w:t xml:space="preserve"> </w:t>
+      </w:r>
+      <w:r>
+        <w:t xml:space="preserve">/ 8 at evaluation.</w:t>
+      </w:r>
+    </w:p>
+    <w:p>
+      <w:pPr>
+        <w:pStyle w:val="BodyText"/>
+      </w:pPr>
+      <w:r>
+        <w:rPr>
+          <w:b/>
+          <w:bCs/>
+        </w:rPr>
+        <w:t xml:space="preserve">Single cells.</w:t>
+      </w:r>
+      <w:r>
+        <w:t xml:space="preserve"> </w:t>
+      </w:r>
+      <w:r>
+        <w:t xml:space="preserve">Each gyroid twin was evaluated in the identity orientation with 64 validation directions per loading class (Appendix G.2); the directional energy error of Eq. (5) was averaged over the directions of each cell and then over the sixteen cells with equal weights, as in Section 5.1 (Table ST22). Zero-shot, the mean error under consistent tractions is 4.48% (largest cell 25.6%), 66 times the 0.068% of NICE on the P twins of the same cells. Over the six load and support classes the ratio of the means is 56 to 234; under the imposed polynomial and multiscale displacements it is 14 and 7. The degradation is not confined to a few cells: in every cell, the error under each load and support class is 20 to 1,150 times that of its P twin, and under the imposed displacements 2 to 30 times. Under consistent tractions, the three gyroid cells with the largest errors are the twins of the three P cells with the largest NICE errors among the sixteen (fresh_val_2007, 2012 and 2015). The correction is the same as on the P cells; what does not carry over is the accuracy of the network's initial field, which belongs to the family on which the network was trained.</w:t>
+      </w:r>
+    </w:p>
+    <w:p>
+      <w:pPr>
+        <w:pStyle w:val="BodyText"/>
+      </w:pPr>
+      <w:r>
+        <w:t xml:space="preserve">After the continuation, the means under the six load and support classes fall by factors of 5.8 to 10.2, under consistent tractions from 4.48% to 0.74% and the largest cell mean from 25.6% to 2.67%; under the imposed polynomial and multiscale displacements they fall by factors of 1.6 and 1.2. They remain 6 to 23 times those of NICE on the P twins (11 times under consistent tractions). The reduction is uneven across cells: the twin of H2 (fresh_val_2010) now has the largest errors under nodal forces and consistent tractions, 4.36% and 2.67% against 4.73% and 3.33% zero-shot. On the 80 P validation cells, the class means of the continued network are 1.1 to 1.7 times those of NICE in the same evaluation (0.026–0.072% against 0.015–0.065%).</w:t>
+      </w:r>
+    </w:p>
+    <w:p>
+      <w:pPr>
+        <w:pStyle w:val="BodyText"/>
+      </w:pPr>
+      <w:r>
+        <w:rPr>
+          <w:b/>
+          <w:bCs/>
+        </w:rPr>
+        <w:t xml:space="preserve">Table ST22. Directional energy error (%) of the gyroid twins and of the P cells.</w:t>
+      </w:r>
+      <w:r>
+        <w:t xml:space="preserve"> </w:t>
+      </w:r>
+      <w:r>
+        <w:t xml:space="preserve">Geometry-equal mean, with the largest geometry mean in parentheses, identity orientation. Gyroid twins: the sixteen twins of fresh_val_2000 to fresh_val_2015. P twins: these sixteen P validation cells. P validation: the 80 validation cells of Section 5.1 in one evaluation of both variants.</w:t>
+      </w:r>
+    </w:p>
+    <w:tbl>
+      <w:tblPr>
+        <w:tblStyle w:val="Table"/>
+        <w:tblW w:type="pct" w:w="5000"/>
+        <w:tblLayout w:type="fixed"/>
+        <w:tblLook w:firstRow="1" w:lastRow="0" w:firstColumn="0" w:lastColumn="0" w:noHBand="0" w:noVBand="0" w:val="0020"/>
+      </w:tblPr>
+      <w:tblGrid>
+        <w:gridCol w:w="1033"/>
+        <w:gridCol w:w="1377"/>
+        <w:gridCol w:w="1377"/>
+        <w:gridCol w:w="1377"/>
+        <w:gridCol w:w="1377"/>
+        <w:gridCol w:w="1377"/>
+      </w:tblGrid>
+      <w:tr>
+        <w:trPr>
+          <w:tblHeader w:val="on"/>
+        </w:trPr>
+        <w:tc>
+          <w:tcPr/>
+          <w:p>
+            <w:pPr>
+              <w:pStyle w:val="Compact"/>
+            </w:pPr>
+            <w:r>
+              <w:t xml:space="preserve">Loading class</w:t>
+            </w:r>
+          </w:p>
+        </w:tc>
+        <w:tc>
+          <w:tcPr/>
+          <w:p>
+            <w:pPr>
+              <w:pStyle w:val="Compact"/>
+              <w:jc w:val="right"/>
+            </w:pPr>
+            <w:r>
+              <w:t xml:space="preserve">Gyroid twins, NICE, zero-shot</w:t>
+            </w:r>
+          </w:p>
+        </w:tc>
+        <w:tc>
+          <w:tcPr/>
+          <w:p>
+            <w:pPr>
+              <w:pStyle w:val="Compact"/>
+              <w:jc w:val="right"/>
+            </w:pPr>
+            <w:r>
+              <w:t xml:space="preserve">Gyroid twins, NICE, continued</w:t>
+            </w:r>
+          </w:p>
+        </w:tc>
+        <w:tc>
+          <w:tcPr/>
+          <w:p>
+            <w:pPr>
+              <w:pStyle w:val="Compact"/>
+              <w:jc w:val="right"/>
+            </w:pPr>
+            <w:r>
+              <w:t xml:space="preserve">P twins, NICE</w:t>
+            </w:r>
+          </w:p>
+        </w:tc>
+        <w:tc>
+          <w:tcPr/>
+          <w:p>
+            <w:pPr>
+              <w:pStyle w:val="Compact"/>
+              <w:jc w:val="right"/>
+            </w:pPr>
+            <w:r>
+              <w:t xml:space="preserve">P validation, NICE</w:t>
+            </w:r>
+          </w:p>
+        </w:tc>
+        <w:tc>
+          <w:tcPr/>
+          <w:p>
+            <w:pPr>
+              <w:pStyle w:val="Compact"/>
+              <w:jc w:val="right"/>
+            </w:pPr>
+            <w:r>
+              <w:t xml:space="preserve">P validation, NICE, continued</w:t>
+            </w:r>
+          </w:p>
+        </w:tc>
+      </w:tr>
+      <w:tr>
+        <w:tc>
+          <w:tcPr/>
+          <w:p>
+            <w:pPr>
+              <w:pStyle w:val="Compact"/>
+            </w:pPr>
+            <w:r>
+              <w:t xml:space="preserve">Consistent tractions (force_c)</w:t>
+            </w:r>
+          </w:p>
+        </w:tc>
+        <w:tc>
+          <w:tcPr/>
+          <w:p>
+            <w:pPr>
+              <w:pStyle w:val="Compact"/>
+              <w:jc w:val="right"/>
+            </w:pPr>
+            <w:r>
+              <w:t xml:space="preserve">4.48 (25.6)</w:t>
+            </w:r>
+          </w:p>
+        </w:tc>
+        <w:tc>
+          <w:tcPr/>
+          <w:p>
+            <w:pPr>
+              <w:pStyle w:val="Compact"/>
+              <w:jc w:val="right"/>
+            </w:pPr>
+            <w:r>
+              <w:t xml:space="preserve">0.74 (2.67)</w:t>
+            </w:r>
+          </w:p>
+        </w:tc>
+        <w:tc>
+          <w:tcPr/>
+          <w:p>
+            <w:pPr>
+              <w:pStyle w:val="Compact"/>
+              <w:jc w:val="right"/>
+            </w:pPr>
+            <w:r>
+              <w:t xml:space="preserve">0.068 (0.28)</w:t>
+            </w:r>
+          </w:p>
+        </w:tc>
+        <w:tc>
+          <w:tcPr/>
+          <w:p>
+            <w:pPr>
+              <w:pStyle w:val="Compact"/>
+              <w:jc w:val="right"/>
+            </w:pPr>
+            <w:r>
+              <w:t xml:space="preserve">0.065 (0.28)</w:t>
+            </w:r>
+            <m:oMath>
+              <m:sSup>
+                <m:e>
+                  <m:r>
+                    <m:t>​</m:t>
+                  </m:r>
+                </m:e>
+                <m:sup>
+                  <m:r>
+                    <m:t>a</m:t>
+                  </m:r>
+                </m:sup>
+              </m:sSup>
+            </m:oMath>
+          </w:p>
+        </w:tc>
+        <w:tc>
+          <w:tcPr/>
+          <w:p>
+            <w:pPr>
+              <w:pStyle w:val="Compact"/>
+              <w:jc w:val="right"/>
+            </w:pPr>
+            <w:r>
+              <w:t xml:space="preserve">0.072 (0.30)</w:t>
+            </w:r>
+            <m:oMath>
+              <m:sSup>
+                <m:e>
+                  <m:r>
+                    <m:t>​</m:t>
+                  </m:r>
+                </m:e>
+                <m:sup>
+                  <m:r>
+                    <m:t>a</m:t>
+                  </m:r>
+                </m:sup>
+              </m:sSup>
+            </m:oMath>
+          </w:p>
+        </w:tc>
+      </w:tr>
+      <w:tr>
+        <w:tc>
+          <w:tcPr/>
+          <w:p>
+            <w:pPr>
+              <w:pStyle w:val="Compact"/>
+            </w:pPr>
+            <w:r>
+              <w:t xml:space="preserve">Single-face consistent tractions (face_c)</w:t>
+            </w:r>
+          </w:p>
+        </w:tc>
+        <w:tc>
+          <w:tcPr/>
+          <w:p>
+            <w:pPr>
+              <w:pStyle w:val="Compact"/>
+              <w:jc w:val="right"/>
+            </w:pPr>
+            <w:r>
+              <w:t xml:space="preserve">4.30 (27.2)</w:t>
+            </w:r>
+          </w:p>
+        </w:tc>
+        <w:tc>
+          <w:tcPr/>
+          <w:p>
+            <w:pPr>
+              <w:pStyle w:val="Compact"/>
+              <w:jc w:val="right"/>
+            </w:pPr>
+            <w:r>
+              <w:t xml:space="preserve">0.60 (2.52)</w:t>
+            </w:r>
+          </w:p>
+        </w:tc>
+        <w:tc>
+          <w:tcPr/>
+          <w:p>
+            <w:pPr>
+              <w:pStyle w:val="Compact"/>
+              <w:jc w:val="right"/>
+            </w:pPr>
+            <w:r>
+              <w:t xml:space="preserve">0.031 (0.17)</w:t>
+            </w:r>
+          </w:p>
+        </w:tc>
+        <w:tc>
+          <w:tcPr/>
+          <w:p>
+            <w:pPr>
+              <w:pStyle w:val="Compact"/>
+              <w:jc w:val="right"/>
+            </w:pPr>
+            <w:r>
+              <w:t xml:space="preserve">0.029 (0.17)</w:t>
+            </w:r>
+            <m:oMath>
+              <m:sSup>
+                <m:e>
+                  <m:r>
+                    <m:t>​</m:t>
+                  </m:r>
+                </m:e>
+                <m:sup>
+                  <m:r>
+                    <m:t>a</m:t>
+                  </m:r>
+                </m:sup>
+              </m:sSup>
+            </m:oMath>
+          </w:p>
+        </w:tc>
+        <w:tc>
+          <w:tcPr/>
+          <w:p>
+            <w:pPr>
+              <w:pStyle w:val="Compact"/>
+              <w:jc w:val="right"/>
+            </w:pPr>
+            <w:r>
+              <w:t xml:space="preserve">0.037 (0.21)</w:t>
+            </w:r>
+            <m:oMath>
+              <m:sSup>
+                <m:e>
+                  <m:r>
+                    <m:t>​</m:t>
+                  </m:r>
+                </m:e>
+                <m:sup>
+                  <m:r>
+                    <m:t>a</m:t>
+                  </m:r>
+                </m:sup>
+              </m:sSup>
+            </m:oMath>
+          </w:p>
+        </w:tc>
+      </w:tr>
+      <w:tr>
+        <w:tc>
+          <w:tcPr/>
+          <w:p>
+            <w:pPr>
+              <w:pStyle w:val="Compact"/>
+            </w:pPr>
+            <w:r>
+              <w:t xml:space="preserve">Nodal forces (force)</w:t>
+            </w:r>
+          </w:p>
+        </w:tc>
+        <w:tc>
+          <w:tcPr/>
+          <w:p>
+            <w:pPr>
+              <w:pStyle w:val="Compact"/>
+              <w:jc w:val="right"/>
+            </w:pPr>
+            <w:r>
+              <w:t xml:space="preserve">6.10 (14.1)</w:t>
+            </w:r>
+          </w:p>
+        </w:tc>
+        <w:tc>
+          <w:tcPr/>
+          <w:p>
+            <w:pPr>
+              <w:pStyle w:val="Compact"/>
+              <w:jc w:val="right"/>
+            </w:pPr>
+            <w:r>
+              <w:t xml:space="preserve">0.78 (4.36)</w:t>
+            </w:r>
+          </w:p>
+        </w:tc>
+        <w:tc>
+          <w:tcPr/>
+          <w:p>
+            <w:pPr>
+              <w:pStyle w:val="Compact"/>
+              <w:jc w:val="right"/>
+            </w:pPr>
+            <w:r>
+              <w:t xml:space="preserve">0.058 (0.18)</w:t>
+            </w:r>
+          </w:p>
+        </w:tc>
+        <w:tc>
+          <w:tcPr/>
+          <w:p>
+            <w:pPr>
+              <w:pStyle w:val="Compact"/>
+              <w:jc w:val="right"/>
+            </w:pPr>
+            <w:r>
+              <w:t xml:space="preserve">0.058 (0.33)</w:t>
+            </w:r>
+          </w:p>
+        </w:tc>
+        <w:tc>
+          <w:tcPr/>
+          <w:p>
+            <w:pPr>
+              <w:pStyle w:val="Compact"/>
+              <w:jc w:val="right"/>
+            </w:pPr>
+            <w:r>
+              <w:t xml:space="preserve">0.065 (0.31)</w:t>
+            </w:r>
+          </w:p>
+        </w:tc>
+      </w:tr>
+      <w:tr>
+        <w:tc>
+          <w:tcPr/>
+          <w:p>
+            <w:pPr>
+              <w:pStyle w:val="Compact"/>
+            </w:pPr>
+            <w:r>
+              <w:t xml:space="preserve">Single-face nodal forces (face)</w:t>
+            </w:r>
+          </w:p>
+        </w:tc>
+        <w:tc>
+          <w:tcPr/>
+          <w:p>
+            <w:pPr>
+              <w:pStyle w:val="Compact"/>
+              <w:jc w:val="right"/>
+            </w:pPr>
+            <w:r>
+              <w:t xml:space="preserve">7.35 (15.2)</w:t>
+            </w:r>
+          </w:p>
+        </w:tc>
+        <w:tc>
+          <w:tcPr/>
+          <w:p>
+            <w:pPr>
+              <w:pStyle w:val="Compact"/>
+              <w:jc w:val="right"/>
+            </w:pPr>
+            <w:r>
+              <w:t xml:space="preserve">0.72 (1.59)</w:t>
+            </w:r>
+          </w:p>
+        </w:tc>
+        <w:tc>
+          <w:tcPr/>
+          <w:p>
+            <w:pPr>
+              <w:pStyle w:val="Compact"/>
+              <w:jc w:val="right"/>
+            </w:pPr>
+            <w:r>
+              <w:t xml:space="preserve">0.031 (0.28)</w:t>
+            </w:r>
+          </w:p>
+        </w:tc>
+        <w:tc>
+          <w:tcPr/>
+          <w:p>
+            <w:pPr>
+              <w:pStyle w:val="Compact"/>
+              <w:jc w:val="right"/>
+            </w:pPr>
+            <w:r>
+              <w:t xml:space="preserve">0.037 (0.72)</w:t>
+            </w:r>
+          </w:p>
+        </w:tc>
+        <w:tc>
+          <w:tcPr/>
+          <w:p>
+            <w:pPr>
+              <w:pStyle w:val="Compact"/>
+              <w:jc w:val="right"/>
+            </w:pPr>
+            <w:r>
+              <w:t xml:space="preserve">0.044 (0.47)</w:t>
+            </w:r>
+          </w:p>
+        </w:tc>
+      </w:tr>
+      <w:tr>
+        <w:tc>
+          <w:tcPr/>
+          <w:p>
+            <w:pPr>
+              <w:pStyle w:val="Compact"/>
+            </w:pPr>
+            <w:r>
+              <w:t xml:space="preserve">Spring supports (support)</w:t>
+            </w:r>
+          </w:p>
+        </w:tc>
+        <w:tc>
+          <w:tcPr/>
+          <w:p>
+            <w:pPr>
+              <w:pStyle w:val="Compact"/>
+              <w:jc w:val="right"/>
+            </w:pPr>
+            <w:r>
+              <w:t xml:space="preserve">5.78 (14.0)</w:t>
+            </w:r>
+          </w:p>
+        </w:tc>
+        <w:tc>
+          <w:tcPr/>
+          <w:p>
+            <w:pPr>
+              <w:pStyle w:val="Compact"/>
+              <w:jc w:val="right"/>
+            </w:pPr>
+            <w:r>
+              <w:t xml:space="preserve">0.60 (1.54)</w:t>
+            </w:r>
+          </w:p>
+        </w:tc>
+        <w:tc>
+          <w:tcPr/>
+          <w:p>
+            <w:pPr>
+              <w:pStyle w:val="Compact"/>
+              <w:jc w:val="right"/>
+            </w:pPr>
+            <w:r>
+              <w:t xml:space="preserve">0.053 (0.15)</w:t>
+            </w:r>
+          </w:p>
+        </w:tc>
+        <w:tc>
+          <w:tcPr/>
+          <w:p>
+            <w:pPr>
+              <w:pStyle w:val="Compact"/>
+              <w:jc w:val="right"/>
+            </w:pPr>
+            <w:r>
+              <w:t xml:space="preserve">0.055 (0.37)</w:t>
+            </w:r>
+          </w:p>
+        </w:tc>
+        <w:tc>
+          <w:tcPr/>
+          <w:p>
+            <w:pPr>
+              <w:pStyle w:val="Compact"/>
+              <w:jc w:val="right"/>
+            </w:pPr>
+            <w:r>
+              <w:t xml:space="preserve">0.064 (0.28)</w:t>
+            </w:r>
+          </w:p>
+        </w:tc>
+      </w:tr>
+      <w:tr>
+        <w:tc>
+          <w:tcPr/>
+          <w:p>
+            <w:pPr>
+              <w:pStyle w:val="Compact"/>
+            </w:pPr>
+            <w:r>
+              <w:t xml:space="preserve">Stiffness-scaled spring supports (support_k)</w:t>
+            </w:r>
+          </w:p>
+        </w:tc>
+        <w:tc>
+          <w:tcPr/>
+          <w:p>
+            <w:pPr>
+              <w:pStyle w:val="Compact"/>
+              <w:jc w:val="right"/>
+            </w:pPr>
+            <w:r>
+              <w:t xml:space="preserve">3.01 (17.2)</w:t>
+            </w:r>
+          </w:p>
+        </w:tc>
+        <w:tc>
+          <w:tcPr/>
+          <w:p>
+            <w:pPr>
+              <w:pStyle w:val="Compact"/>
+              <w:jc w:val="right"/>
+            </w:pPr>
+            <w:r>
+              <w:t xml:space="preserve">0.52 (2.42)</w:t>
+            </w:r>
+          </w:p>
+        </w:tc>
+        <w:tc>
+          <w:tcPr/>
+          <w:p>
+            <w:pPr>
+              <w:pStyle w:val="Compact"/>
+              <w:jc w:val="right"/>
+            </w:pPr>
+            <w:r>
+              <w:t xml:space="preserve">0.054 (0.22)</w:t>
+            </w:r>
+            <m:oMath>
+              <m:sSup>
+                <m:e>
+                  <m:r>
+                    <m:t>​</m:t>
+                  </m:r>
+                </m:e>
+                <m:sup>
+                  <m:r>
+                    <m:t>b</m:t>
+                  </m:r>
+                </m:sup>
+              </m:sSup>
+            </m:oMath>
+          </w:p>
+        </w:tc>
+        <w:tc>
+          <w:tcPr/>
+          <w:p>
+            <w:pPr>
+              <w:pStyle w:val="Compact"/>
+              <w:jc w:val="right"/>
+            </w:pPr>
+            <w:r>
+              <w:t xml:space="preserve">0.053 (0.22)</w:t>
+            </w:r>
+            <m:oMath>
+              <m:sSup>
+                <m:e>
+                  <m:r>
+                    <m:t>​</m:t>
+                  </m:r>
+                </m:e>
+                <m:sup>
+                  <m:r>
+                    <m:t>a</m:t>
+                  </m:r>
+                </m:sup>
+              </m:sSup>
+            </m:oMath>
+          </w:p>
+        </w:tc>
+        <w:tc>
+          <w:tcPr/>
+          <w:p>
+            <w:pPr>
+              <w:pStyle w:val="Compact"/>
+              <w:jc w:val="right"/>
+            </w:pPr>
+            <w:r>
+              <w:t xml:space="preserve">0.059 (0.24)</w:t>
+            </w:r>
+            <m:oMath>
+              <m:sSup>
+                <m:e>
+                  <m:r>
+                    <m:t>​</m:t>
+                  </m:r>
+                </m:e>
+                <m:sup>
+                  <m:r>
+                    <m:t>a</m:t>
+                  </m:r>
+                </m:sup>
+              </m:sSup>
+            </m:oMath>
+          </w:p>
+        </w:tc>
+      </w:tr>
+      <w:tr>
+        <w:tc>
+          <w:tcPr/>
+          <w:p>
+            <w:pPr>
+              <w:pStyle w:val="Compact"/>
+            </w:pPr>
+            <w:r>
+              <w:t xml:space="preserve">Polynomial displacements (macro)</w:t>
+            </w:r>
+          </w:p>
+        </w:tc>
+        <w:tc>
+          <w:tcPr/>
+          <w:p>
+            <w:pPr>
+              <w:pStyle w:val="Compact"/>
+              <w:jc w:val="right"/>
+            </w:pPr>
+            <w:r>
+              <w:t xml:space="preserve">0.19 (0.89)</w:t>
+            </w:r>
+          </w:p>
+        </w:tc>
+        <w:tc>
+          <w:tcPr/>
+          <w:p>
+            <w:pPr>
+              <w:pStyle w:val="Compact"/>
+              <w:jc w:val="right"/>
+            </w:pPr>
+            <w:r>
+              <w:t xml:space="preserve">0.12 (0.58)</w:t>
+            </w:r>
+          </w:p>
+        </w:tc>
+        <w:tc>
+          <w:tcPr/>
+          <w:p>
+            <w:pPr>
+              <w:pStyle w:val="Compact"/>
+              <w:jc w:val="right"/>
+            </w:pPr>
+            <w:r>
+              <w:t xml:space="preserve">0.014 (0.075)</w:t>
+            </w:r>
+          </w:p>
+        </w:tc>
+        <w:tc>
+          <w:tcPr/>
+          <w:p>
+            <w:pPr>
+              <w:pStyle w:val="Compact"/>
+              <w:jc w:val="right"/>
+            </w:pPr>
+            <w:r>
+              <w:t xml:space="preserve">0.015 (0.12)</w:t>
+            </w:r>
+          </w:p>
+        </w:tc>
+        <w:tc>
+          <w:tcPr/>
+          <w:p>
+            <w:pPr>
+              <w:pStyle w:val="Compact"/>
+              <w:jc w:val="right"/>
+            </w:pPr>
+            <w:r>
+              <w:t xml:space="preserve">0.026 (0.17)</w:t>
+            </w:r>
+          </w:p>
+        </w:tc>
+      </w:tr>
+      <w:tr>
+        <w:tc>
+          <w:tcPr/>
+          <w:p>
+            <w:pPr>
+              <w:pStyle w:val="Compact"/>
+            </w:pPr>
+            <w:r>
+              <w:t xml:space="preserve">Multiscale displacements (grf)</w:t>
+            </w:r>
+          </w:p>
+        </w:tc>
+        <w:tc>
+          <w:tcPr/>
+          <w:p>
+            <w:pPr>
+              <w:pStyle w:val="Compact"/>
+              <w:jc w:val="right"/>
+            </w:pPr>
+            <w:r>
+              <w:t xml:space="preserve">0.16 (0.79)</w:t>
+            </w:r>
+          </w:p>
+        </w:tc>
+        <w:tc>
+          <w:tcPr/>
+          <w:p>
+            <w:pPr>
+              <w:pStyle w:val="Compact"/>
+              <w:jc w:val="right"/>
+            </w:pPr>
+            <w:r>
+              <w:t xml:space="preserve">0.13 (0.68)</w:t>
+            </w:r>
+          </w:p>
+        </w:tc>
+        <w:tc>
+          <w:tcPr/>
+          <w:p>
+            <w:pPr>
+              <w:pStyle w:val="Compact"/>
+              <w:jc w:val="right"/>
+            </w:pPr>
+            <w:r>
+              <w:t xml:space="preserve">0.024 (0.13)</w:t>
+            </w:r>
+          </w:p>
+        </w:tc>
+        <w:tc>
+          <w:tcPr/>
+          <w:p>
+            <w:pPr>
+              <w:pStyle w:val="Compact"/>
+              <w:jc w:val="right"/>
+            </w:pPr>
+            <w:r>
+              <w:t xml:space="preserve">0.025 (0.14)</w:t>
+            </w:r>
+          </w:p>
+        </w:tc>
+        <w:tc>
+          <w:tcPr/>
+          <w:p>
+            <w:pPr>
+              <w:pStyle w:val="Compact"/>
+              <w:jc w:val="right"/>
+            </w:pPr>
+            <w:r>
+              <w:t xml:space="preserve">0.037 (0.21)</w:t>
+            </w:r>
+          </w:p>
+        </w:tc>
+      </w:tr>
+    </w:tbl>
+    <w:p>
+      <w:pPr>
+        <w:pStyle w:val="BodyText"/>
+      </w:pPr>
+      <m:oMath>
+        <m:sSup>
+          <m:e>
+            <m:r>
+              <m:t>​</m:t>
+            </m:r>
+          </m:e>
+          <m:sup>
+            <m:r>
+              <m:t>a</m:t>
+            </m:r>
+          </m:sup>
+        </m:sSup>
+      </m:oMath>
+      <w:r>
+        <w:t xml:space="preserve"> </w:t>
+      </w:r>
+      <w:r>
+        <w:t xml:space="preserve">Evaluated in this run on the 20 checkpoint-selection geometries only (stiffness-scaled spring supports: 19); Table ST03 gives NICE on all 80 (75) geometries.</w:t>
+      </w:r>
+      <w:r>
+        <w:t xml:space="preserve"> </w:t>
+      </w:r>
+      <m:oMath>
+        <m:sSup>
+          <m:e>
+            <m:r>
+              <m:t>​</m:t>
+            </m:r>
+          </m:e>
+          <m:sup>
+            <m:r>
+              <m:t>b</m:t>
+            </m:r>
+          </m:sup>
+        </m:sSup>
+      </m:oMath>
+      <w:r>
+        <w:t xml:space="preserve"> </w:t>
+      </w:r>
+      <w:r>
+        <w:t xml:space="preserve">15 twins; fresh_val_2010 has no stiffness-scaled spring-support directions.</w:t>
+      </w:r>
+    </w:p>
+    <w:p>
+      <w:pPr>
+        <w:pStyle w:val="BodyText"/>
+      </w:pPr>
+      <w:r>
+        <w:rPr>
+          <w:b/>
+          <w:bCs/>
+        </w:rPr>
+        <w:t xml:space="preserve">Lattice.</w:t>
+      </w:r>
+      <w:r>
+        <w:t xml:space="preserve"> </w:t>
+      </w:r>
+      <w:r>
+        <w:t xml:space="preserve">The gyroid twin of the</w:t>
+      </w:r>
+      <w:r>
+        <w:t xml:space="preserve"> </w:t>
+      </w:r>
+      <m:oMath>
+        <m:r>
+          <m:t>2</m:t>
+        </m:r>
+        <m:r>
+          <m:rPr>
+            <m:sty m:val="p"/>
+          </m:rPr>
+          <m:t>×</m:t>
+        </m:r>
+        <m:r>
+          <m:t>2</m:t>
+        </m:r>
+        <m:r>
+          <m:rPr>
+            <m:sty m:val="p"/>
+          </m:rPr>
+          <m:t>×</m:t>
+        </m:r>
+        <m:r>
+          <m:t>2</m:t>
+        </m:r>
+      </m:oMath>
+      <w:r>
+        <w:t xml:space="preserve"> </w:t>
+      </w:r>
+      <w:r>
+        <w:t xml:space="preserve">block of Section 5.8 (eight cells, four of them cut, every cell learned; 160,629 free retained DOFs against 139,002 for the P block) was solved as in Section 5.8, clamped on one face and loaded by the three face loads and three random loads, with the dense exact condensed matrices as reference (Table ST23). Zero-shot, the lattice compliance errors are 0.98–1.53% under the face loads (2.14% under the random loads), and the largest thickness-sensitivity error over the cells is 13.5% (10.6%), against 0.014% (0.069%) and 0.14% (0.45%) for NICE on the P block. With the continued network they are 0.23% (0.35%) and 1.84% (3.57%), and on the P block 0.019% (0.084%) and 0.25% (0.49%). With exact operators, the gyroid lattice needs 414 conjugate-gradient iterations against 183 for the P block; the learned operators add 20 and 22 iterations.</w:t>
+      </w:r>
+    </w:p>
+    <w:p>
+      <w:pPr>
+        <w:pStyle w:val="BodyText"/>
+      </w:pPr>
+      <w:r>
+        <w:rPr>
+          <w:b/>
+          <w:bCs/>
+        </w:rPr>
+        <w:t xml:space="preserve">Table ST23. Lattice compliance and sensitivity errors (%) of the P block and its gyroid twin.</w:t>
+      </w:r>
+      <w:r>
+        <w:t xml:space="preserve"> </w:t>
+      </w:r>
+      <w:r>
+        <w:t xml:space="preserve">Maxima over the three face loads, and over the three random loads in parentheses; sensitivity error: largest relative error of the eight-component vector over the eight cells. Iterations: preconditioned conjugate gradients (Supplementary Note S4.1) with the learned / the exact condensed operators, to a recursive relative residual of</w:t>
+      </w:r>
+      <w:r>
+        <w:t xml:space="preserve"> </w:t>
+      </w:r>
+      <m:oMath>
+        <m:sSup>
+          <m:e>
+            <m:r>
+              <m:t>10</m:t>
+            </m:r>
+          </m:e>
+          <m:sup>
+            <m:r>
+              <m:rPr>
+                <m:sty m:val="p"/>
+              </m:rPr>
+              <m:t>−</m:t>
+            </m:r>
+            <m:r>
+              <m:t>10</m:t>
+            </m:r>
+          </m:sup>
+        </m:sSup>
+      </m:oMath>
+      <w:r>
+        <w:t xml:space="preserve">. The exact gyroid solution reaches a recomputed relative residual of</w:t>
+      </w:r>
+      <w:r>
+        <w:t xml:space="preserve"> </w:t>
+      </w:r>
+      <m:oMath>
+        <m:r>
+          <m:t>9.6</m:t>
+        </m:r>
+        <m:r>
+          <m:rPr>
+            <m:sty m:val="p"/>
+          </m:rPr>
+          <m:t>×</m:t>
+        </m:r>
+        <m:sSup>
+          <m:e>
+            <m:r>
+              <m:t>10</m:t>
+            </m:r>
+          </m:e>
+          <m:sup>
+            <m:r>
+              <m:rPr>
+                <m:sty m:val="p"/>
+              </m:rPr>
+              <m:t>−</m:t>
+            </m:r>
+            <m:r>
+              <m:t>11</m:t>
+            </m:r>
+          </m:sup>
+        </m:sSup>
+      </m:oMath>
+      <w:r>
+        <w:t xml:space="preserve">; for the learned gyroid solves, the recomputed residual stagnates at</w:t>
+      </w:r>
+      <w:r>
+        <w:t xml:space="preserve"> </w:t>
+      </w:r>
+      <m:oMath>
+        <m:r>
+          <m:t>2.7</m:t>
+        </m:r>
+        <m:r>
+          <m:rPr>
+            <m:sty m:val="p"/>
+          </m:rPr>
+          <m:t>×</m:t>
+        </m:r>
+        <m:sSup>
+          <m:e>
+            <m:r>
+              <m:t>10</m:t>
+            </m:r>
+          </m:e>
+          <m:sup>
+            <m:r>
+              <m:rPr>
+                <m:sty m:val="p"/>
+              </m:rPr>
+              <m:t>−</m:t>
+            </m:r>
+            <m:r>
+              <m:t>4</m:t>
+            </m:r>
+          </m:sup>
+        </m:sSup>
+      </m:oMath>
+      <w:r>
+        <w:t xml:space="preserve"> </w:t>
+      </w:r>
+      <w:r>
+        <w:t xml:space="preserve">(zero-shot) and</w:t>
+      </w:r>
+      <w:r>
+        <w:t xml:space="preserve"> </w:t>
+      </w:r>
+      <m:oMath>
+        <m:r>
+          <m:t>2.8</m:t>
+        </m:r>
+        <m:r>
+          <m:rPr>
+            <m:sty m:val="p"/>
+          </m:rPr>
+          <m:t>×</m:t>
+        </m:r>
+        <m:sSup>
+          <m:e>
+            <m:r>
+              <m:t>10</m:t>
+            </m:r>
+          </m:e>
+          <m:sup>
+            <m:r>
+              <m:rPr>
+                <m:sty m:val="p"/>
+              </m:rPr>
+              <m:t>−</m:t>
+            </m:r>
+            <m:r>
+              <m:t>4</m:t>
+            </m:r>
+          </m:sup>
+        </m:sSup>
+      </m:oMath>
+      <w:r>
+        <w:t xml:space="preserve"> </w:t>
+      </w:r>
+      <w:r>
+        <w:t xml:space="preserve">(continued), as for the P block in Section 5.8.</w:t>
+      </w:r>
+    </w:p>
+    <w:tbl>
+      <w:tblPr>
+        <w:tblStyle w:val="Table"/>
+        <w:tblW w:type="pct" w:w="5000"/>
+        <w:tblLayout w:type="fixed"/>
+        <w:tblLook w:firstRow="1" w:lastRow="0" w:firstColumn="0" w:lastColumn="0" w:noHBand="0" w:noVBand="0" w:val="0020"/>
+      </w:tblPr>
+      <w:tblGrid>
+        <w:gridCol w:w="1397"/>
+        <w:gridCol w:w="1397"/>
+        <w:gridCol w:w="1863"/>
+        <w:gridCol w:w="1863"/>
+        <w:gridCol w:w="1397"/>
+      </w:tblGrid>
+      <w:tr>
+        <w:trPr>
+          <w:tblHeader w:val="on"/>
+        </w:trPr>
+        <w:tc>
+          <w:tcPr/>
+          <w:p>
+            <w:pPr>
+              <w:pStyle w:val="Compact"/>
+            </w:pPr>
+            <w:r>
+              <w:t xml:space="preserve">Lattice</w:t>
+            </w:r>
+          </w:p>
+        </w:tc>
+        <w:tc>
+          <w:tcPr/>
+          <w:p>
+            <w:pPr>
+              <w:pStyle w:val="Compact"/>
+            </w:pPr>
+            <w:r>
+              <w:t xml:space="preserve">Variant</w:t>
+            </w:r>
+          </w:p>
+        </w:tc>
+        <w:tc>
+          <w:tcPr/>
+          <w:p>
+            <w:pPr>
+              <w:pStyle w:val="Compact"/>
+              <w:jc w:val="right"/>
+            </w:pPr>
+            <w:r>
+              <w:t xml:space="preserve">Compliance error</w:t>
+            </w:r>
+          </w:p>
+        </w:tc>
+        <w:tc>
+          <w:tcPr/>
+          <w:p>
+            <w:pPr>
+              <w:pStyle w:val="Compact"/>
+              <w:jc w:val="right"/>
+            </w:pPr>
+            <w:r>
+              <w:t xml:space="preserve">Sensitivity error</w:t>
+            </w:r>
+          </w:p>
+        </w:tc>
+        <w:tc>
+          <w:tcPr/>
+          <w:p>
+            <w:pPr>
+              <w:pStyle w:val="Compact"/>
+            </w:pPr>
+            <w:r>
+              <w:t xml:space="preserve">Iterations</w:t>
+            </w:r>
+          </w:p>
+        </w:tc>
+      </w:tr>
+      <w:tr>
+        <w:tc>
+          <w:tcPr/>
+          <w:p>
+            <w:pPr>
+              <w:pStyle w:val="Compact"/>
+            </w:pPr>
+            <w:r>
+              <w:t xml:space="preserve">P block (</w:t>
+            </w:r>
+            <m:oMath>
+              <m:r>
+                <m:t>2</m:t>
+              </m:r>
+              <m:r>
+                <m:rPr>
+                  <m:sty m:val="p"/>
+                </m:rPr>
+                <m:t>×</m:t>
+              </m:r>
+              <m:r>
+                <m:t>2</m:t>
+              </m:r>
+              <m:r>
+                <m:rPr>
+                  <m:sty m:val="p"/>
+                </m:rPr>
+                <m:t>×</m:t>
+              </m:r>
+              <m:r>
+                <m:t>2</m:t>
+              </m:r>
+            </m:oMath>
+            <w:r>
+              <w:t xml:space="preserve">)</w:t>
+            </w:r>
+          </w:p>
+        </w:tc>
+        <w:tc>
+          <w:tcPr/>
+          <w:p>
+            <w:pPr>
+              <w:pStyle w:val="Compact"/>
+            </w:pPr>
+            <w:r>
+              <w:t xml:space="preserve">NICE</w:t>
+            </w:r>
+          </w:p>
+        </w:tc>
+        <w:tc>
+          <w:tcPr/>
+          <w:p>
+            <w:pPr>
+              <w:pStyle w:val="Compact"/>
+              <w:jc w:val="right"/>
+            </w:pPr>
+            <w:r>
+              <w:t xml:space="preserve">0.014 (0.069)</w:t>
+            </w:r>
+          </w:p>
+        </w:tc>
+        <w:tc>
+          <w:tcPr/>
+          <w:p>
+            <w:pPr>
+              <w:pStyle w:val="Compact"/>
+              <w:jc w:val="right"/>
+            </w:pPr>
+            <w:r>
+              <w:t xml:space="preserve">0.14 (0.45)</w:t>
+            </w:r>
+          </w:p>
+        </w:tc>
+        <w:tc>
+          <w:tcPr/>
+          <w:p>
+            <w:pPr>
+              <w:pStyle w:val="Compact"/>
+            </w:pPr>
+            <w:r>
+              <w:t xml:space="preserve">186 / 183</w:t>
+            </w:r>
+          </w:p>
+        </w:tc>
+      </w:tr>
+      <w:tr>
+        <w:tc>
+          <w:tcPr/>
+          <w:p>
+            <w:pPr>
+              <w:pStyle w:val="Compact"/>
+            </w:pPr>
+            <w:r>
+              <w:t xml:space="preserve">P block (</w:t>
+            </w:r>
+            <m:oMath>
+              <m:r>
+                <m:t>2</m:t>
+              </m:r>
+              <m:r>
+                <m:rPr>
+                  <m:sty m:val="p"/>
+                </m:rPr>
+                <m:t>×</m:t>
+              </m:r>
+              <m:r>
+                <m:t>2</m:t>
+              </m:r>
+              <m:r>
+                <m:rPr>
+                  <m:sty m:val="p"/>
+                </m:rPr>
+                <m:t>×</m:t>
+              </m:r>
+              <m:r>
+                <m:t>2</m:t>
+              </m:r>
+            </m:oMath>
+            <w:r>
+              <w:t xml:space="preserve">)</w:t>
+            </w:r>
+          </w:p>
+        </w:tc>
+        <w:tc>
+          <w:tcPr/>
+          <w:p>
+            <w:pPr>
+              <w:pStyle w:val="Compact"/>
+            </w:pPr>
+            <w:r>
+              <w:t xml:space="preserve">NICE, continued</w:t>
+            </w:r>
+          </w:p>
+        </w:tc>
+        <w:tc>
+          <w:tcPr/>
+          <w:p>
+            <w:pPr>
+              <w:pStyle w:val="Compact"/>
+              <w:jc w:val="right"/>
+            </w:pPr>
+            <w:r>
+              <w:t xml:space="preserve">0.019 (0.084)</w:t>
+            </w:r>
+          </w:p>
+        </w:tc>
+        <w:tc>
+          <w:tcPr/>
+          <w:p>
+            <w:pPr>
+              <w:pStyle w:val="Compact"/>
+              <w:jc w:val="right"/>
+            </w:pPr>
+            <w:r>
+              <w:t xml:space="preserve">0.25 (0.49)</w:t>
+            </w:r>
+          </w:p>
+        </w:tc>
+        <w:tc>
+          <w:tcPr/>
+          <w:p>
+            <w:pPr>
+              <w:pStyle w:val="Compact"/>
+            </w:pPr>
+            <w:r>
+              <w:t xml:space="preserve">187 / 183</w:t>
+            </w:r>
+          </w:p>
+        </w:tc>
+      </w:tr>
+      <w:tr>
+        <w:tc>
+          <w:tcPr/>
+          <w:p>
+            <w:pPr>
+              <w:pStyle w:val="Compact"/>
+            </w:pPr>
+            <w:r>
+              <w:t xml:space="preserve">Gyroid block (</w:t>
+            </w:r>
+            <m:oMath>
+              <m:r>
+                <m:t>2</m:t>
+              </m:r>
+              <m:r>
+                <m:rPr>
+                  <m:sty m:val="p"/>
+                </m:rPr>
+                <m:t>×</m:t>
+              </m:r>
+              <m:r>
+                <m:t>2</m:t>
+              </m:r>
+              <m:r>
+                <m:rPr>
+                  <m:sty m:val="p"/>
+                </m:rPr>
+                <m:t>×</m:t>
+              </m:r>
+              <m:r>
+                <m:t>2</m:t>
+              </m:r>
+            </m:oMath>
+            <w:r>
+              <w:t xml:space="preserve">)</w:t>
+            </w:r>
+          </w:p>
+        </w:tc>
+        <w:tc>
+          <w:tcPr/>
+          <w:p>
+            <w:pPr>
+              <w:pStyle w:val="Compact"/>
+            </w:pPr>
+            <w:r>
+              <w:t xml:space="preserve">NICE, zero-shot</w:t>
+            </w:r>
+          </w:p>
+        </w:tc>
+        <w:tc>
+          <w:tcPr/>
+          <w:p>
+            <w:pPr>
+              <w:pStyle w:val="Compact"/>
+              <w:jc w:val="right"/>
+            </w:pPr>
+            <w:r>
+              <w:t xml:space="preserve">1.53 (2.14)</w:t>
+            </w:r>
+          </w:p>
+        </w:tc>
+        <w:tc>
+          <w:tcPr/>
+          <w:p>
+            <w:pPr>
+              <w:pStyle w:val="Compact"/>
+              <w:jc w:val="right"/>
+            </w:pPr>
+            <w:r>
+              <w:t xml:space="preserve">13.5 (10.6)</w:t>
+            </w:r>
+          </w:p>
+        </w:tc>
+        <w:tc>
+          <w:tcPr/>
+          <w:p>
+            <w:pPr>
+              <w:pStyle w:val="Compact"/>
+            </w:pPr>
+            <w:r>
+              <w:t xml:space="preserve">434 / 414</w:t>
+            </w:r>
+          </w:p>
+        </w:tc>
+      </w:tr>
+      <w:tr>
+        <w:tc>
+          <w:tcPr/>
+          <w:p>
+            <w:pPr>
+              <w:pStyle w:val="Compact"/>
+            </w:pPr>
+            <w:r>
+              <w:t xml:space="preserve">Gyroid block (</w:t>
+            </w:r>
+            <m:oMath>
+              <m:r>
+                <m:t>2</m:t>
+              </m:r>
+              <m:r>
+                <m:rPr>
+                  <m:sty m:val="p"/>
+                </m:rPr>
+                <m:t>×</m:t>
+              </m:r>
+              <m:r>
+                <m:t>2</m:t>
+              </m:r>
+              <m:r>
+                <m:rPr>
+                  <m:sty m:val="p"/>
+                </m:rPr>
+                <m:t>×</m:t>
+              </m:r>
+              <m:r>
+                <m:t>2</m:t>
+              </m:r>
+            </m:oMath>
+            <w:r>
+              <w:t xml:space="preserve">)</w:t>
+            </w:r>
+          </w:p>
+        </w:tc>
+        <w:tc>
+          <w:tcPr/>
+          <w:p>
+            <w:pPr>
+              <w:pStyle w:val="Compact"/>
+            </w:pPr>
+            <w:r>
+              <w:t xml:space="preserve">NICE, continued</w:t>
+            </w:r>
+          </w:p>
+        </w:tc>
+        <w:tc>
+          <w:tcPr/>
+          <w:p>
+            <w:pPr>
+              <w:pStyle w:val="Compact"/>
+              <w:jc w:val="right"/>
+            </w:pPr>
+            <w:r>
+              <w:t xml:space="preserve">0.23 (0.35)</w:t>
+            </w:r>
+          </w:p>
+        </w:tc>
+        <w:tc>
+          <w:tcPr/>
+          <w:p>
+            <w:pPr>
+              <w:pStyle w:val="Compact"/>
+              <w:jc w:val="right"/>
+            </w:pPr>
+            <w:r>
+              <w:t xml:space="preserve">1.84 (3.57)</w:t>
+            </w:r>
+          </w:p>
+        </w:tc>
+        <w:tc>
+          <w:tcPr/>
+          <w:p>
+            <w:pPr>
+              <w:pStyle w:val="Compact"/>
+            </w:pPr>
+            <w:r>
+              <w:t xml:space="preserve">436 / 414</w:t>
+            </w:r>
+          </w:p>
+        </w:tc>
+      </w:tr>
+    </w:tbl>
+    <w:p>
+      <w:pPr>
+        <w:pStyle w:val="BodyText"/>
+      </w:pPr>
+      <w:r>
+        <w:rPr>
+          <w:b/>
+          <w:bCs/>
+        </w:rPr>
+        <w:t xml:space="preserve">Reading.</w:t>
+      </w:r>
+      <w:r>
+        <w:t xml:space="preserve"> </w:t>
+      </w:r>
+      <w:r>
+        <w:t xml:space="preserve">The construction carried over unchanged: the energy form, the transpose of the complete extension, the correction and the assembly were applied to the gyroid cells without modification, and the properties that do not depend on the network parameters hold for them as for the P cells. The trained network is specific to its family: zero-shot, the gyroid errors under loads and supports are 56 to 234 times those on the P twins in the mean, and the unchanged correction does not make up the difference. A continuation of 8,000 training steps with eighteen gyroid cells lowers them six- to tenfold, to 6 to 23 times the P level, and brings the gyroid lattice to 0.23% in compliance and 1.84% in sensitivity under the face loads, while its class means on the P validation cells are 1.1 to 1.7 times those of NICE. Whether more gyroid data and training reach the P level was not tested. A new TPMS family therefore needs new training data (Section 6.3), but not a new construction.</w:t>
+      </w:r>
+    </w:p>
+    <w:p>
+      <w:pPr>
+        <w:pStyle w:val="BodyText"/>
+      </w:pPr>
+      <w:r>
+        <w:rPr>
+          <w:b/>
+          <w:bCs/>
+        </w:rPr>
+        <w:t xml:space="preserve">Records.</w:t>
+      </w:r>
+      <w:r>
+        <w:t xml:space="preserve"> </w:t>
+      </w:r>
+      <w:r>
+        <w:t xml:space="preserve">Record identifiers in the data archive (files in</w:t>
+      </w:r>
+      <w:r>
+        <w:t xml:space="preserve"> </w:t>
+      </w:r>
+      <w:r>
+        <w:rPr>
+          <w:rStyle w:val="VerbatimChar"/>
+        </w:rPr>
+        <w:t xml:space="preserve">evidence/gcell/</w:t>
+      </w:r>
+      <w:r>
+        <w:t xml:space="preserve">): gval.json (gyroid twins: P twin, stratum and corner parameters); gval_A3.json and gval_A3G.json (single gyroid cells, NICE zero-shot and continued); newval_A3G.json (80 P validation cells, NICE continued; NICE in the same evaluation:</w:t>
+      </w:r>
+      <w:r>
+        <w:t xml:space="preserve"> </w:t>
+      </w:r>
+      <w:r>
+        <w:rPr>
+          <w:rStyle w:val="VerbatimChar"/>
+        </w:rPr>
+        <w:t xml:space="preserve">evidence/newval_A3_2grid.json</w:t>
+      </w:r>
+      <w:r>
+        <w:t xml:space="preserve">); lat_hetero_g222.json and lat_hetero_g222_A3G.json (gyroid block, NICE zero-shot and continued); lat_hetero222_A3G.json (P block, NICE continued); g_vs_p_222.json (P and gyroid blocks, NICE).</w:t>
+      </w:r>
+    </w:p>
     <w:p>
       <w:pPr>
         <w:pStyle w:val="Heading2"/>
@@ -41824,6 +44503,145 @@
       </w:r>
       <w:r>
         <w:t xml:space="preserve">is the sensitivity-error matrix over all eight design components and evaluated directions. (c,d) Shares of absolute elementwise sensitivity-error contributions and element counts in four mutually exclusive material-volume-fraction groups for the base network under consistent tractions. Each error group sums absolute contributions over its elements, design components and directions before normalisation by the total. Filled markers identify the base network and open markers and hatched bars in (a,b) Uncorrected; Uncorrected is shown for U1, U2, M1, H1 and M2 (Table ST05a).</w:t>
+      </w:r>
+    </w:p>
+    <w:p>
+      <w:pPr>
+        <w:pStyle w:val="BodyText"/>
+      </w:pPr>
+      <w:r>
+        <w:drawing>
+          <wp:inline>
+            <wp:extent cx="5334000" cy="4991242"/>
+            <wp:effectExtent b="0" l="0" r="0" t="0"/>
+            <wp:docPr descr="Figure S04" title="" id="21" name="Picture"/>
+            <a:graphic>
+              <a:graphicData uri="http://schemas.openxmlformats.org/drawingml/2006/picture">
+                <pic:pic>
+                  <pic:nvPicPr>
+                    <pic:cNvPr descr="figures/S07_energy_share_variants.png" id="22" name="Picture"/>
+                    <pic:cNvPicPr>
+                      <a:picLocks noChangeArrowheads="1" noChangeAspect="1"/>
+                    </pic:cNvPicPr>
+                  </pic:nvPicPr>
+                  <pic:blipFill>
+                    <a:blip r:embed="rId20"/>
+                    <a:stretch>
+                      <a:fillRect/>
+                    </a:stretch>
+                  </pic:blipFill>
+                  <pic:spPr bwMode="auto">
+                    <a:xfrm>
+                      <a:off x="0" y="0"/>
+                      <a:ext cx="5334000" cy="4991242"/>
+                    </a:xfrm>
+                    <a:prstGeom prst="rect">
+                      <a:avLst/>
+                    </a:prstGeom>
+                    <a:noFill/>
+                    <a:ln w="9525">
+                      <a:noFill/>
+                      <a:headEnd/>
+                      <a:tailEnd/>
+                    </a:ln>
+                  </pic:spPr>
+                </pic:pic>
+              </a:graphicData>
+            </a:graphic>
+          </wp:inline>
+        </w:drawing>
+      </w:r>
+    </w:p>
+    <w:p>
+      <w:pPr>
+        <w:pStyle w:val="BodyText"/>
+      </w:pPr>
+      <w:r>
+        <w:rPr>
+          <w:b/>
+          <w:bCs/>
+        </w:rPr>
+        <w:t xml:space="preserve">Figure S04. The other four variants follow the relations of Figure 11.</w:t>
+      </w:r>
+      <w:r>
+        <w:t xml:space="preserve"> </w:t>
+      </w:r>
+      <w:r>
+        <w:t xml:space="preserve">The counterpart of Figure 11 for (a–c) the base network, (d–f) Uncorrected, (g–i) Smoothing-trained and (j–l) the base network with the correction applied at deployment. One point per load in the configurations evaluated for each variant (54, 87, 96 and 114 loads; Tables ST08 and ST09); filled markers denote face loads and open markers cut-surface loads. Top row: compliance error against</w:t>
+      </w:r>
+      <w:r>
+        <w:t xml:space="preserve"> </w:t>
+      </w:r>
+      <m:oMath>
+        <m:r>
+          <m:t>β</m:t>
+        </m:r>
+      </m:oMath>
+      <w:r>
+        <w:t xml:space="preserve">; lines denote equality. The ratio of compliance error to</w:t>
+      </w:r>
+      <w:r>
+        <w:t xml:space="preserve"> </w:t>
+      </w:r>
+      <m:oMath>
+        <m:r>
+          <m:t>β</m:t>
+        </m:r>
+      </m:oMath>
+      <w:r>
+        <w:t xml:space="preserve"> </w:t>
+      </w:r>
+      <w:r>
+        <w:t xml:space="preserve">lies between 0.80 and 0.98, 0.79 and 0.99, 0.92 and 0.99, and 0.96 and 1.006 for the four variants; the six ratios above 1 correspond to at most</w:t>
+      </w:r>
+      <w:r>
+        <w:t xml:space="preserve"> </w:t>
+      </w:r>
+      <m:oMath>
+        <m:r>
+          <m:t>1.3</m:t>
+        </m:r>
+        <m:r>
+          <m:rPr>
+            <m:sty m:val="p"/>
+          </m:rPr>
+          <m:t>×</m:t>
+        </m:r>
+        <m:sSup>
+          <m:e>
+            <m:r>
+              <m:t>10</m:t>
+            </m:r>
+          </m:e>
+          <m:sup>
+            <m:r>
+              <m:rPr>
+                <m:sty m:val="p"/>
+              </m:rPr>
+              <m:t>−</m:t>
+            </m:r>
+            <m:r>
+              <m:t>9</m:t>
+            </m:r>
+          </m:sup>
+        </m:sSup>
+      </m:oMath>
+      <w:r>
+        <w:t xml:space="preserve"> </w:t>
+      </w:r>
+      <w:r>
+        <w:t xml:space="preserve">of the compliance. Middle and bottom rows: compliance error and target-cell sensitivity error against the target's exact energy share</w:t>
+      </w:r>
+      <w:r>
+        <w:t xml:space="preserve"> </w:t>
+      </w:r>
+      <m:oMath>
+        <m:r>
+          <m:t>w</m:t>
+        </m:r>
+      </m:oMath>
+      <w:r>
+        <w:t xml:space="preserve">; lines are least-squares fits in logarithmic coordinates, with the slope given in each panel. All panels share the error axis. The circled load in (a–c) is U1/x under the neighbour-face z traction; its values are given in the note to Table ST08.</w:t>
       </w:r>
     </w:p>
     <w:sectPr>

</xml_diff>

<commit_message>
Rebuild advisor PDFs, figure index and Word files from the assembled R5 text
Co-Authored-By: Claude Opus 5.5 <noreply@anthropic.com>
Claude-Session: https://claude.ai/code/session_0114mFUC9kQKF8s1RT519QXM
</commit_message>
<xml_diff>
--- a/docs/paper_p1/word/P1_supp_EN.docx
+++ b/docs/paper_p1/word/P1_supp_EN.docx
@@ -15,7 +15,7 @@
         <w:pStyle w:val="FirstParagraph"/>
       </w:pPr>
       <w:r>
-        <w:t xml:space="preserve">Supplementary Notes, Tables and Figures are numbered in the order in which they appear in this supplement. Variant labels follow the main text (Table 2); the key below also gives each variant's record identifier in the data archive.</w:t>
+        <w:t xml:space="preserve">Supplementary Notes, Tables and Figures are numbered in the order in which they appear in this supplement. Variant labels follow the main text (Table 2). The two variants not listed there, the Uncorrected continuation and the Smoothing-trained variant, are evaluated in this supplement. The key below gives each variant's record identifier in the data archive.</w:t>
       </w:r>
     </w:p>
     <w:p>
@@ -119,7 +119,7 @@
               <w:pStyle w:val="Compact"/>
             </w:pPr>
             <w:r>
-              <w:t xml:space="preserve">Uncorrected</w:t>
+              <w:t xml:space="preserve">Uncorrected continuation</w:t>
             </w:r>
           </w:p>
         </w:tc>
@@ -189,7 +189,7 @@
               <w:pStyle w:val="Compact"/>
             </w:pPr>
             <w:r>
-              <w:t xml:space="preserve">Base network, corrected</w:t>
+              <w:t xml:space="preserve">Base network + correction</w:t>
             </w:r>
           </w:p>
         </w:tc>
@@ -287,7 +287,7 @@
               <w:pStyle w:val="Compact"/>
             </w:pPr>
             <w:r>
-              <w:t xml:space="preserve">Geometry stratum</w:t>
+              <w:t xml:space="preserve">Cut-severity group</w:t>
             </w:r>
           </w:p>
         </w:tc>
@@ -959,7 +959,7 @@
         </m:r>
       </m:oMath>
       <w:r>
-        <w:t xml:space="preserve">, and v0, v1 and v2 give the heavy, moderate and light retained-volume strata. In configuration labels such as U1/x, x and y give the neighbour configuration of Figure 9. The deployment geometries use the G1–G4 labels of Table ST13; the table below gives their identifiers in the data archive.</w:t>
+        <w:t xml:space="preserve">, and v0, v1 and v2 give the heavily, moderately and lightly cut groups, which are defined by the retained volume. In configuration labels such as U1/x, x and y give the neighbour configuration of Figure 9. The deployment geometries use the G1–G4 labels of Table ST13; the table below gives their identifiers in the data archive.</w:t>
       </w:r>
     </w:p>
     <w:tbl>
@@ -996,7 +996,7 @@
               <w:pStyle w:val="Compact"/>
             </w:pPr>
             <w:r>
-              <w:t xml:space="preserve">Geometry stratum</w:t>
+              <w:t xml:space="preserve">Cut-severity group</w:t>
             </w:r>
           </w:p>
         </w:tc>
@@ -1346,7 +1346,7 @@
               <w:pStyle w:val="Compact"/>
             </w:pPr>
             <w:r>
-              <w:t xml:space="preserve">Uncorrected</w:t>
+              <w:t xml:space="preserve">Uncorrected continuation</w:t>
             </w:r>
           </w:p>
         </w:tc>
@@ -1504,7 +1504,7 @@
               <w:pStyle w:val="Compact"/>
             </w:pPr>
             <w:r>
-              <w:t xml:space="preserve">Base network, corrected</w:t>
+              <w:t xml:space="preserve">Base network + correction</w:t>
             </w:r>
           </w:p>
         </w:tc>
@@ -1660,7 +1660,7 @@
         <w:pStyle w:val="BodyText"/>
       </w:pPr>
       <w:r>
-        <w:t xml:space="preserve">All variants are evaluated on the 80 validation geometries of Table ST02. Orientation 17 is one of the 48 cube-symmetry transformations of Appendix G (Eq. (G.2)), applied to the geometry and to the retained directions; orientation 0 is the identity. The training set of 591 comprises 304 of the base network's 305 geometries (one cell that behaved as a near-mechanism was removed) and 287 further training geometries. By the geometry rotation described below, each 15,000-step continuation visits at most 153 of its 591 training geometries; the base network visited all 305 of its own over 40,000 training steps. Uncorrected, Smoothing-trained and NICE use the same seed and split, so they draw their geometries in the same order.</w:t>
+        <w:t xml:space="preserve">All variants are evaluated on the 80 validation geometries of Table ST02. Orientation 17 is one of the 48 cube-symmetry transformations of Appendix G (Eq. (G.2)), applied to the geometry and to the test displacements; orientation 0 is the identity. The training set of 591 comprises 304 of the base network's 305 geometries (one cell that behaved as a near-mechanism was removed) and 287 further training geometries. Under the geometry replacement described below, each 15,000-step continuation visits at most 153 of its 591 training geometries; the base network visited all 305 of its own over 40,000 training steps. The Uncorrected continuation, the Smoothing-trained variant and NICE use the same seed and split, so they draw their geometries in the same order.</w:t>
       </w:r>
     </w:p>
     <w:p>
@@ -1668,7 +1668,7 @@
         <w:pStyle w:val="BodyText"/>
       </w:pPr>
       <w:r>
-        <w:t xml:space="preserve">Training settings, common to the variants of Table 2:</w:t>
+        <w:t xml:space="preserve">Training settings, common to the variants of Table 2, the Uncorrected continuation and the Smoothing-trained variant:</w:t>
       </w:r>
     </w:p>
     <w:p>
@@ -1680,7 +1680,7 @@
         </w:numPr>
       </w:pPr>
       <w:r>
-        <w:t xml:space="preserve">Batches of 16 directions; the geometry changes at every step. Three geometries of the training set are held on the GPU and one of them is replaced every 100 steps, so a run of</w:t>
+        <w:t xml:space="preserve">Batches of 16 test displacements; the geometry changes at every step. Three geometries of the training set are held on the GPU and one of them is replaced every 100 steps, so a run of</w:t>
       </w:r>
       <w:r>
         <w:t xml:space="preserve"> </w:t>
@@ -2057,7 +2057,7 @@
         </w:numPr>
       </w:pPr>
       <w:r>
-        <w:t xml:space="preserve">Eq. (18):</w:t>
+        <w:t xml:space="preserve">Eq. (13):</w:t>
       </w:r>
       <w:r>
         <w:t xml:space="preserve"> </w:t>
@@ -2094,7 +2094,7 @@
         <w:pStyle w:val="FirstParagraph"/>
       </w:pPr>
       <w:r>
-        <w:t xml:space="preserve">Measured to the last training step, the base network's training took 4.6 h and NICE's continuation 3.5 h on the GPU (Section 5.1), or 5.0 h and 4.8 h including all selection evaluations; peak GPU memory during training was 29.6 GiB. The base network was initialised from parameters obtained in three preceding training stages (7.5 GPU-hours together). Together with these stages, the two runs including their selection evaluations and the generation of the direction sets and exact sensitivities of the 691 geometries of the data split, its 591 training and 100 validation geometries (including the 80 of Table ST02), which took about 42 GPU-hours (Section 5.1), make up the offline cost of NICE, about 60 GPU-hours.</w:t>
+        <w:t xml:space="preserve">Measured to the last training step, the base network's training took 4.6 h and NICE's continuation 3.5 h on the GPU (Section 5.1). Including all selection evaluations, they took 5.0 h and 4.8 h; peak GPU memory during training was 29.6 GiB. The base network was initialised from parameters obtained in three preceding training stages (7.5 GPU-hours together). The offline cost of NICE, about 60 GPU-hours, comprises these stages, the two runs including their selection evaluations, and the generation of the test-displacement sets and exact sensitivities. This generation covered the 691 geometries of the data split, its 591 training and 100 validation geometries (including the 80 of Table ST02), and took about 42 GPU-hours (Section 5.1).</w:t>
       </w:r>
     </w:p>
     <w:p>
@@ -2102,7 +2102,7 @@
         <w:pStyle w:val="BodyText"/>
       </w:pPr>
       <w:r>
-        <w:t xml:space="preserve">For the base network, Uncorrected, Smoothing-trained and NICE, checkpoint selection uses the bias-corrected EMA parameters and both the identity orientation (</w:t>
+        <w:t xml:space="preserve">For the base network, the Uncorrected continuation, the Smoothing-trained variant and NICE, checkpoint selection uses the bias-corrected EMA parameters and both the identity orientation (</w:t>
       </w:r>
       <m:oMath>
         <m:r>
@@ -2136,7 +2136,7 @@
         </m:r>
       </m:oMath>
       <w:r>
-        <w:t xml:space="preserve">), although Table ST03 reports only the identity orientation. Within a geometry family</w:t>
+        <w:t xml:space="preserve">), although Table ST03 reports only the identity orientation. A geometry family consists of the geometries of the training-time validation list generated from one thickness field; an independently generated validation cell forms a family of its own. Within a family</w:t>
       </w:r>
       <w:r>
         <w:t xml:space="preserve"> </w:t>
@@ -2150,7 +2150,7 @@
         <w:t xml:space="preserve"> </w:t>
       </w:r>
       <w:r>
-        <w:t xml:space="preserve">(the geometries of the training-time validation list generated from one thickness field; an independently generated validation cell forms a family of its own) and orientation</w:t>
+        <w:t xml:space="preserve">and orientation</w:t>
       </w:r>
       <w:r>
         <w:t xml:space="preserve"> </w:t>
@@ -2194,7 +2194,7 @@
         <w:t xml:space="preserve"> </w:t>
       </w:r>
       <w:r>
-        <w:t xml:space="preserve">be the mean energy error averaged over the selection classes,</w:t>
+        <w:t xml:space="preserve">be the mean energy error averaged over the selection classes and</w:t>
       </w:r>
       <w:r>
         <w:t xml:space="preserve"> </w:t>
@@ -2236,7 +2236,7 @@
         <w:t xml:space="preserve"> </w:t>
       </w:r>
       <w:r>
-        <w:t xml:space="preserve">the mean relative sensitivity-vector error over classes with labels, and</w:t>
+        <w:t xml:space="preserve">the mean relative sensitivity-vector error over the classes with sensitivity labels. Let</w:t>
       </w:r>
       <w:r>
         <w:t xml:space="preserve"> </w:t>
@@ -2279,7 +2279,7 @@
         <w:t xml:space="preserve"> </w:t>
       </w:r>
       <w:r>
-        <w:t xml:space="preserve">the class-average 90th percentile of directional energy error. Each class statistic is first averaged over the available geometries in that family. The selection score is</w:t>
+        <w:t xml:space="preserve">be the class average of the 90th percentile of the energy error over the test displacements. Each class statistic is first averaged over the available geometries in that family. The selection score is</w:t>
       </w:r>
     </w:p>
     <w:p>
@@ -2747,7 +2747,7 @@
         </w:numPr>
       </w:pPr>
       <w:r>
-        <w:t xml:space="preserve">Uncorrected and NICE were scored at 7,500 and 15,000 training steps (0.0944 and 0.0906; 0.00281 and 0.00237); in both cases the final parameters scored lower and were retained.</w:t>
+        <w:t xml:space="preserve">The Uncorrected continuation and NICE were scored at 7,500 and 15,000 training steps (0.0944 and 0.0906; 0.00281 and 0.00237); in both cases the final parameters scored lower and were kept.</w:t>
       </w:r>
     </w:p>
     <w:p>
@@ -2759,7 +2759,7 @@
         </w:numPr>
       </w:pPr>
       <w:r>
-        <w:t xml:space="preserve">Smoothing-trained used the same evaluation schedule and orientations; its selection scores were not recorded, and the parameters of its final step, 15,000, are used.</w:t>
+        <w:t xml:space="preserve">The Smoothing-trained variant used the same evaluation schedule and orientations; its selection scores were not recorded, and the parameters of its final step, 15,000, are used.</w:t>
       </w:r>
     </w:p>
     <w:p>
@@ -2827,7 +2827,7 @@
         </m:r>
       </m:oMath>
       <w:r>
-        <w:t xml:space="preserve">, the corner span to at most 0.47, and the maximum reference-coordinate gradient norm to at most 0.47. In blocks of eight, a uniform-field-equivalent centre volume fraction is stratified between 0.1 and 0.4; nonuniform affine or trilinear shapes are scaled within these constraints. This centre-density parameter is a sampling coordinate, not the material fraction after cutting.</w:t>
+        <w:t xml:space="preserve">, the corner span to at most 0.47, and the maximum reference-coordinate gradient norm to at most 0.47. In each block of eight geometries, a uniform-field-equivalent centre volume fraction is drawn by stratified sampling between 0.1 and 0.4; nonuniform affine or trilinear shapes are scaled within these constraints. This centre-density parameter is a sampling coordinate and is not the material fraction after cutting.</w:t>
       </w:r>
     </w:p>
     <w:p>
@@ -2888,7 +2888,7 @@
         </m:r>
       </m:oMath>
       <w:r>
-        <w:t xml:space="preserve">. The generator stratifies</w:t>
+        <w:t xml:space="preserve">. The generator draws</w:t>
       </w:r>
       <w:r>
         <w:t xml:space="preserve"> </w:t>
@@ -2902,7 +2902,7 @@
         <w:t xml:space="preserve"> </w:t>
       </w:r>
       <w:r>
-        <w:t xml:space="preserve">over the two halves of</w:t>
+        <w:t xml:space="preserve">by stratified sampling over the two halves of</w:t>
       </w:r>
       <w:r>
         <w:t xml:space="preserve"> </w:t>
@@ -3005,7 +3005,7 @@
         </m:r>
       </m:oMath>
       <w:r>
-        <w:t xml:space="preserve">. Two of every eight validation fields are uncut and the other six occupy the angle–volume strata. Training and validation are drawn from separate random streams; the present table describes the 80-geometry validation set.</w:t>
+        <w:t xml:space="preserve">. Two of every eight validation fields are uncut and the other six cover the angle–volume combinations. Training and validation are drawn from separate random streams; the present table describes the 80-geometry validation set.</w:t>
       </w:r>
     </w:p>
     <w:tbl>
@@ -3033,7 +3033,7 @@
               <w:pStyle w:val="Compact"/>
             </w:pPr>
             <w:r>
-              <w:t xml:space="preserve">Stratum</w:t>
+              <w:t xml:space="preserve">Cut-severity group</w:t>
             </w:r>
           </w:p>
         </w:tc>
@@ -3191,7 +3191,7 @@
               <w:pStyle w:val="Compact"/>
             </w:pPr>
             <w:r>
-              <w:t xml:space="preserve">Light cut</w:t>
+              <w:t xml:space="preserve">Lightly cut</w:t>
             </w:r>
           </w:p>
         </w:tc>
@@ -3281,7 +3281,7 @@
               <w:pStyle w:val="Compact"/>
             </w:pPr>
             <w:r>
-              <w:t xml:space="preserve">Moderate cut</w:t>
+              <w:t xml:space="preserve">Moderately cut</w:t>
             </w:r>
           </w:p>
         </w:tc>
@@ -3380,7 +3380,7 @@
               <w:pStyle w:val="Compact"/>
             </w:pPr>
             <w:r>
-              <w:t xml:space="preserve">Heavy cut</w:t>
+              <w:t xml:space="preserve">Heavily cut</w:t>
             </w:r>
           </w:p>
         </w:tc>
@@ -3468,7 +3468,7 @@
         <w:pStyle w:val="BodyText"/>
       </w:pPr>
       <w:r>
-        <w:t xml:space="preserve">The cut volumes refer to the box before intersecting it with the TPMS band. No two validation geometries coincide up to a symmetry of the cube. At</w:t>
+        <w:t xml:space="preserve">The cut volumes refer to the cell box before it is intersected with the TPMS band. No two validation geometries coincide up to a symmetry of the cube. At</w:t>
       </w:r>
       <w:r>
         <w:t xml:space="preserve"> </w:t>
@@ -3488,7 +3488,7 @@
         </m:r>
       </m:oMath>
       <w:r>
-        <w:t xml:space="preserve">, the retained sets of the 80 geometries have a median of 23,604 DOFs and range from 2,679 to 45,900 DOFs; the active DOFs have a median of 221,442 and range from 2,757 to 439,092. The selected spectral and assembly cases are identified in the geometry key of Supplementary Section R1; they are reported as test cases rather than a random sample for population inference.</w:t>
+        <w:t xml:space="preserve">, the numbers of retained DOFs of the 80 geometries have a median of 23,604 and range from 2,679 to 45,900; the numbers of active DOFs have a median of 221,442 and range from 2,757 to 439,092. The selected spectral and assembly cases are identified in the geometry key of Supplementary Section R1; they are reported as test cases and do not form a random sample for population inference.</w:t>
       </w:r>
     </w:p>
     <w:p>
@@ -3496,7 +3496,7 @@
         <w:pStyle w:val="Heading2"/>
       </w:pPr>
       <w:r>
-        <w:t xml:space="preserve">Table ST03. Energy error by direction class (identity orientation)</w:t>
+        <w:t xml:space="preserve">Table ST03. Energy error by load class (identity orientation)</w:t>
       </w:r>
     </w:p>
     <w:p>
@@ -3504,7 +3504,7 @@
         <w:pStyle w:val="FirstParagraph"/>
       </w:pPr>
       <w:r>
-        <w:t xml:space="preserve">Entries are geometry-equal mean / maximum of geometry-level direction means, in percent. The maximum is not a worst individual direction. "Base network, corrected" denotes the base network with NICE's correction applied at deployment, without retraining. The last column restricts NICE to the 60 validation geometries that entered neither training nor checkpoint selection (the other 20 entered checkpoint selection, Table ST01). For NICE under consistent tractions, the 5,120 individual sampled directions of the 80 geometries have a 95th percentile of 0.331%, a 99th percentile of 0.693% and a maximum of 1.24% (3,840 directions of the 60 geometries outside checkpoint selection: 0.355%, 0.734%, 1.24%). Under consistent tractions the mean of the corrected base network is 0.0965% and that of NICE 0.0737%, a ratio of 1.31; resampling the 80 geometries with replacement (paired, ratio of geometry-equal means, percentile interval) gives a 95% interval of 1.20–1.40.</w:t>
+        <w:t xml:space="preserve">Entries are mean / maximum over geometries, in percent: each geometry first contributes its mean over the test displacements, and geometries are weighted equally. The maximum is not the worst individual test displacement. "Base network + correction" denotes the base network with NICE's correction applied at deployment, without retraining. The last column restricts NICE to the 60 validation geometries that entered neither training nor checkpoint selection (the other 20 entered checkpoint selection, Table ST01). For NICE under traction loads, the 5,120 individually sampled test displacements of the 80 geometries have a 95th percentile of 0.331%, a 99th percentile of 0.693% and a maximum of 1.24%. For the 3,840 test displacements of the 60 geometries outside checkpoint selection, these values are 0.355%, 0.734% and 1.24%. Under traction loads the mean of Base network + correction is 0.0965% and that of NICE 0.0737%, a ratio of 1.31. Resampling the 80 geometries with replacement (paired, ratio of geometry-equal means, percentile interval) gives a 95% interval of 1.20–1.40.</w:t>
       </w:r>
     </w:p>
     <w:tbl>
@@ -3568,7 +3568,7 @@
               <w:pStyle w:val="Compact"/>
             </w:pPr>
             <w:r>
-              <w:t xml:space="preserve">Uncorrected</w:t>
+              <w:t xml:space="preserve">Uncorrected continuation</w:t>
             </w:r>
           </w:p>
         </w:tc>
@@ -3590,7 +3590,7 @@
               <w:pStyle w:val="Compact"/>
             </w:pPr>
             <w:r>
-              <w:t xml:space="preserve">Base network, corrected</w:t>
+              <w:t xml:space="preserve">Base network + correction</w:t>
             </w:r>
           </w:p>
         </w:tc>
@@ -4433,7 +4433,7 @@
         <w:pStyle w:val="BodyText"/>
       </w:pPr>
       <w:r>
-        <w:t xml:space="preserve">Under consistent tractions, NICE's stratum means on the 60 geometries outside checkpoint selection are 0.020% (uncut), 0.054% (light), 0.105% (moderate) and 0.126% (heavy), and the five largest geometry means of the 80 (0.651%, 0.540%, 0.487%, 0.303%, 0.287%) all belong to them.</w:t>
+        <w:t xml:space="preserve">Under traction loads, NICE's means by cut-severity group on the 60 geometries outside checkpoint selection are 0.020% (uncut), 0.054% (lightly cut), 0.105% (moderately cut) and 0.126% (heavily cut). The five largest geometry means of the 80 (0.651%, 0.540%, 0.487%, 0.303%, 0.287%) all belong to these geometries.</w:t>
       </w:r>
     </w:p>
     <w:p>
@@ -4441,7 +4441,7 @@
         <w:pStyle w:val="Heading3"/>
       </w:pPr>
       <w:r>
-        <w:t xml:space="preserve">ST03b. Nodal-force and consistent-traction geometry-stratum means (%)</w:t>
+        <w:t xml:space="preserve">ST03b. Means by cut-severity group under nodal point loads and traction loads (%)</w:t>
       </w:r>
     </w:p>
     <w:tbl>
@@ -4471,7 +4471,7 @@
               <w:pStyle w:val="Compact"/>
             </w:pPr>
             <w:r>
-              <w:t xml:space="preserve">Stratum</w:t>
+              <w:t xml:space="preserve">Cut-severity group</w:t>
             </w:r>
           </w:p>
         </w:tc>
@@ -4504,7 +4504,7 @@
               <w:pStyle w:val="Compact"/>
             </w:pPr>
             <w:r>
-              <w:t xml:space="preserve">Uncorrected force/force_c</w:t>
+              <w:t xml:space="preserve">Uncorrected continuation force/force_c</w:t>
             </w:r>
           </w:p>
         </w:tc>
@@ -4526,7 +4526,7 @@
               <w:pStyle w:val="Compact"/>
             </w:pPr>
             <w:r>
-              <w:t xml:space="preserve">Base network, corrected force/force_c</w:t>
+              <w:t xml:space="preserve">Base network + correction force/force_c</w:t>
             </w:r>
           </w:p>
         </w:tc>
@@ -4629,7 +4629,7 @@
               <w:pStyle w:val="Compact"/>
             </w:pPr>
             <w:r>
-              <w:t xml:space="preserve">Light cut (v2)</w:t>
+              <w:t xml:space="preserve">Lightly cut (v2)</w:t>
             </w:r>
           </w:p>
         </w:tc>
@@ -4708,7 +4708,7 @@
               <w:pStyle w:val="Compact"/>
             </w:pPr>
             <w:r>
-              <w:t xml:space="preserve">Moderate cut (v1)</w:t>
+              <w:t xml:space="preserve">Moderately cut (v1)</w:t>
             </w:r>
           </w:p>
         </w:tc>
@@ -4787,7 +4787,7 @@
               <w:pStyle w:val="Compact"/>
             </w:pPr>
             <w:r>
-              <w:t xml:space="preserve">Heavy cut (v0)</w:t>
+              <w:t xml:space="preserve">Heavily cut (v0)</w:t>
             </w:r>
           </w:p>
         </w:tc>
@@ -4872,7 +4872,7 @@
         <w:pStyle w:val="FirstParagraph"/>
       </w:pPr>
       <w:r>
-        <w:t xml:space="preserve">NICE was also evaluated in orientation 17, which entered checkpoint selection (Table ST01), on all 80 geometries with the validation directions of Table ST03. The stiffness-scaled support and neighbour-induced classes are not part of this comparison.</w:t>
+        <w:t xml:space="preserve">NICE was also evaluated in orientation 17, which entered checkpoint selection (Table ST01), on all 80 geometries with the validation test displacements of Table ST03. The class with stiffness-scaled supports and the class with displacements imposed by a neighbouring cell are not part of this comparison.</w:t>
       </w:r>
     </w:p>
     <w:tbl>
@@ -5378,7 +5378,7 @@
         <w:t xml:space="preserve"> </w:t>
       </w:r>
       <w:r>
-        <w:t xml:space="preserve">are the first eight retained-displacement directions of the cell's consistent-traction (force_c) validation set; the maximum relative difference between returned work and field energy, the deployed-versus-training field difference and the maximum rigid-body energy ratio, all over the same eight directions, which also normalise the rigid-body ratio; the ghost-penalty share of the exact field energy, mean over directions (consistent tractions / nodal forces); and the mean</w:t>
+        <w:t xml:space="preserve">are the first eight test displacements of the cell's traction-load (force_c) validation set. The next three columns give the maximum relative difference between returned work and field energy, the deployed-versus-training field difference and the maximum rigid-body energy ratio, all over the same eight test displacements, which also normalise the rigid-body ratio. The ghost-penalty column gives the ghost-penalty fraction of the exact field energy, averaged over the test displacements (traction loads / nodal point loads). The last two columns give the mean</w:t>
       </w:r>
       <w:r>
         <w:t xml:space="preserve"> </w:t>
@@ -5406,7 +5406,7 @@
         <w:t xml:space="preserve"> </w:t>
       </w:r>
       <w:r>
-        <w:t xml:space="preserve">of Section 5.4 for the base network and for NICE under consistent tractions, with the Jacobi weighting</w:t>
+        <w:t xml:space="preserve">of Section 5.4 for the base network and for NICE under traction loads, with the Jacobi weighting</w:t>
       </w:r>
       <w:r>
         <w:t xml:space="preserve"> </w:t>
@@ -5507,7 +5507,7 @@
         </m:r>
       </m:oMath>
       <w:r>
-        <w:t xml:space="preserve">, of Appendix B.3. Over the first eight nodal-force directions the asymmetry, the work–energy difference and the rigid-body energy ratio are at most</w:t>
+        <w:t xml:space="preserve">, of Appendix B.3. Over the first eight nodal-point-load test displacements, the asymmetry, the work–energy difference and the rigid-body energy ratio are at most</w:t>
       </w:r>
       <w:r>
         <w:t xml:space="preserve"> </w:t>
@@ -5701,7 +5701,7 @@
               <w:pStyle w:val="Compact"/>
             </w:pPr>
             <w:r>
-              <w:t xml:space="preserve">Ghost-penalty share (consistent tractions / nodal forces)</w:t>
+              <w:t xml:space="preserve">Ghost-penalty fraction (traction loads / nodal point loads)</w:t>
             </w:r>
           </w:p>
         </w:tc>
@@ -5728,7 +5728,7 @@
               </m:r>
             </m:oMath>
             <w:r>
-              <w:t xml:space="preserve">: base network (consistent tractions)</w:t>
+              <w:t xml:space="preserve">: base network (traction loads)</w:t>
             </w:r>
           </w:p>
         </w:tc>
@@ -5755,7 +5755,7 @@
               </m:r>
             </m:oMath>
             <w:r>
-              <w:t xml:space="preserve">: NICE (consistent tractions)</w:t>
+              <w:t xml:space="preserve">: NICE (traction loads)</w:t>
             </w:r>
           </w:p>
         </w:tc>
@@ -6216,7 +6216,7 @@
         <w:pStyle w:val="Heading2"/>
       </w:pPr>
       <w:r>
-        <w:t xml:space="preserve">Table ST05. Sensitivity and spectral diagnostics at fixed retained displacement</w:t>
+        <w:t xml:space="preserve">Table ST05. Sensitivity and spectral diagnostics at fixed retained displacements</w:t>
       </w:r>
     </w:p>
     <w:p>
@@ -6232,7 +6232,7 @@
         <w:pStyle w:val="FirstParagraph"/>
       </w:pPr>
       <w:r>
-        <w:t xml:space="preserve">Directional means (%) at fixed retained displacement.</w:t>
+        <w:t xml:space="preserve">Means over the test displacements (%) at fixed retained displacements.</w:t>
       </w:r>
       <w:r>
         <w:t xml:space="preserve"> </w:t>
@@ -6272,7 +6272,7 @@
         </m:r>
       </m:oMath>
       <w:r>
-        <w:t xml:space="preserve">; Section 5.5, Figure 8a,b); smoothed values are tabulated for the base network under consistent tractions, and — marks entries not tabulated. The first-order share is the Frobenius norm of the linear error array divided by the sum of the Frobenius norms of the linear and quadratic arrays (%), at</w:t>
+        <w:t xml:space="preserve">; Section 5.5, Figure 8a,b). Smoothed values are tabulated for the base network under traction loads, and — marks entries not tabulated. The first-order fraction, evaluated at</w:t>
       </w:r>
       <w:r>
         <w:t xml:space="preserve"> </w:t>
@@ -6292,7 +6292,7 @@
         </m:r>
       </m:oMath>
       <w:r>
-        <w:t xml:space="preserve">; each array includes all eight corners and all evaluated directions in that cell and class.</w:t>
+        <w:t xml:space="preserve">, is the Frobenius norm of the linear error array divided by the sum of the Frobenius norms of the linear and quadratic arrays (%). Each array includes all eight corners and all evaluated test displacements in that cell and class.</w:t>
       </w:r>
     </w:p>
     <w:tbl>
@@ -6496,7 +6496,7 @@
               <w:pStyle w:val="Compact"/>
             </w:pPr>
             <w:r>
-              <w:t xml:space="preserve">First-order share</w:t>
+              <w:t xml:space="preserve">First-order fraction</w:t>
             </w:r>
           </w:p>
         </w:tc>
@@ -7589,7 +7589,7 @@
               <w:pStyle w:val="Compact"/>
             </w:pPr>
             <w:r>
-              <w:t xml:space="preserve">Uncorrected</w:t>
+              <w:t xml:space="preserve">Uncorrected continuation</w:t>
             </w:r>
           </w:p>
         </w:tc>
@@ -7679,7 +7679,7 @@
               <w:pStyle w:val="Compact"/>
             </w:pPr>
             <w:r>
-              <w:t xml:space="preserve">Uncorrected</w:t>
+              <w:t xml:space="preserve">Uncorrected continuation</w:t>
             </w:r>
           </w:p>
         </w:tc>
@@ -7769,7 +7769,7 @@
               <w:pStyle w:val="Compact"/>
             </w:pPr>
             <w:r>
-              <w:t xml:space="preserve">Uncorrected</w:t>
+              <w:t xml:space="preserve">Uncorrected continuation</w:t>
             </w:r>
           </w:p>
         </w:tc>
@@ -7859,7 +7859,7 @@
               <w:pStyle w:val="Compact"/>
             </w:pPr>
             <w:r>
-              <w:t xml:space="preserve">Uncorrected</w:t>
+              <w:t xml:space="preserve">Uncorrected continuation</w:t>
             </w:r>
           </w:p>
         </w:tc>
@@ -7949,7 +7949,7 @@
               <w:pStyle w:val="Compact"/>
             </w:pPr>
             <w:r>
-              <w:t xml:space="preserve">Uncorrected</w:t>
+              <w:t xml:space="preserve">Uncorrected continuation</w:t>
             </w:r>
           </w:p>
         </w:tc>
@@ -8039,7 +8039,7 @@
               <w:pStyle w:val="Compact"/>
             </w:pPr>
             <w:r>
-              <w:t xml:space="preserve">Uncorrected</w:t>
+              <w:t xml:space="preserve">Uncorrected continuation</w:t>
             </w:r>
           </w:p>
         </w:tc>
@@ -8129,7 +8129,7 @@
               <w:pStyle w:val="Compact"/>
             </w:pPr>
             <w:r>
-              <w:t xml:space="preserve">Uncorrected</w:t>
+              <w:t xml:space="preserve">Uncorrected continuation</w:t>
             </w:r>
           </w:p>
         </w:tc>
@@ -8219,7 +8219,7 @@
               <w:pStyle w:val="Compact"/>
             </w:pPr>
             <w:r>
-              <w:t xml:space="preserve">Uncorrected</w:t>
+              <w:t xml:space="preserve">Uncorrected continuation</w:t>
             </w:r>
           </w:p>
         </w:tc>
@@ -8309,7 +8309,7 @@
               <w:pStyle w:val="Compact"/>
             </w:pPr>
             <w:r>
-              <w:t xml:space="preserve">Uncorrected</w:t>
+              <w:t xml:space="preserve">Uncorrected continuation</w:t>
             </w:r>
           </w:p>
         </w:tc>
@@ -8399,7 +8399,7 @@
               <w:pStyle w:val="Compact"/>
             </w:pPr>
             <w:r>
-              <w:t xml:space="preserve">Uncorrected</w:t>
+              <w:t xml:space="preserve">Uncorrected continuation</w:t>
             </w:r>
           </w:p>
         </w:tc>
@@ -8495,7 +8495,7 @@
         <w:pStyle w:val="FirstParagraph"/>
       </w:pPr>
       <w:r>
-        <w:t xml:space="preserve">Base network, mean over consistent-traction directions; each fraction uses its own interior-energy denominator (Eq. (15)). Cumulative curves, nodal-force results and directional percentiles are shown in Figure 6.</w:t>
+        <w:t xml:space="preserve">Base network, mean over the traction-load test displacements; each fraction uses its own interior-energy denominator (Eq. (10)). Cumulative curves, results for nodal point loads and percentiles over the test displacements are shown in Figure 6.</w:t>
       </w:r>
     </w:p>
     <w:tbl>
@@ -9006,7 +9006,7 @@
         <w:t xml:space="preserve"> </w:t>
       </w:r>
       <w:r>
-        <w:t xml:space="preserve">is the power-iteration estimate, multiplied by 1.05, of the smoothing study of Section 5.5, which starts the power iteration from its own random vector (Appendix F.2); its interval therefore differs from the one used by the correction</w:t>
+        <w:t xml:space="preserve">is the power-iteration estimate, multiplied by 1.05, of the smoothing study of Section 5.5. That study starts the power iteration from its own random vector (Appendix F.2), so its interval differs from the one used by the correction</w:t>
       </w:r>
       <w:r>
         <w:t xml:space="preserve"> </w:t>
@@ -9037,7 +9037,7 @@
         <w:pStyle w:val="FirstParagraph"/>
       </w:pPr>
       <w:r>
-        <w:t xml:space="preserve">Mean energy error (%) under consistent tractions after eight smoothing steps, one coarse-grid correction and eight smoothing steps applied to the base network's field at fixed retained displacement; coarse columns are those surviving the support screen of Appendix F.1 and the removal of columns whose diagonal energy is at most</w:t>
+        <w:t xml:space="preserve">Mean energy error (%) under traction loads after eight smoothing steps, one coarse-grid correction and eight smoothing steps applied to the base network's field at fixed retained displacements. Coarse columns are those surviving the support screen of Appendix F.1 and the removal of columns whose diagonal energy is at most</w:t>
       </w:r>
       <w:r>
         <w:t xml:space="preserve"> </w:t>
@@ -9066,7 +9066,7 @@
         <w:t xml:space="preserve"> </w:t>
       </w:r>
       <w:r>
-        <w:t xml:space="preserve">of the largest, with</w:t>
+        <w:t xml:space="preserve">of the largest;</w:t>
       </w:r>
       <w:r>
         <w:t xml:space="preserve"> </w:t>
@@ -9095,7 +9095,7 @@
         <w:t xml:space="preserve"> </w:t>
       </w:r>
       <w:r>
-        <w:t xml:space="preserve">formed explicitly and factorised without diagonal shift. The enriched partition-of-unity (PU) spaces carry 12 DOFs per vertex of a</w:t>
+        <w:t xml:space="preserve">is formed explicitly and factorised without diagonal shift. The enriched partition-of-unity (PU) spaces carry 12 DOFs per vertex of a</w:t>
       </w:r>
       <w:r>
         <w:t xml:space="preserve"> </w:t>
@@ -9248,7 +9248,7 @@
         </m:r>
       </m:oMath>
       <w:r>
-        <w:t xml:space="preserve">; their generating functions are linearly dependent, so the column count can exceed the dimension of the spanned space, and the PU entries are numerical observations rather than verified Galerkin projections. NICE uses</w:t>
+        <w:t xml:space="preserve">. Their generating functions are linearly dependent, so the column count can exceed the dimension of the spanned space, and the PU entries are numerical observations rather than verified Galerkin projections. NICE uses</w:t>
       </w:r>
       <w:r>
         <w:t xml:space="preserve"> </w:t>
@@ -9931,7 +9931,7 @@
         <w:pStyle w:val="FirstParagraph"/>
       </w:pPr>
       <w:r>
-        <w:t xml:space="preserve">Mean directional energy error (%) under consistent tractions (32 validation directions, fixed retained displacement) after the correction with</w:t>
+        <w:t xml:space="preserve">Mean energy error (%) under traction loads (32 validation test displacements, fixed retained displacements) after the correction with</w:t>
       </w:r>
       <w:r>
         <w:t xml:space="preserve"> </w:t>
@@ -9983,7 +9983,7 @@
         <w:t xml:space="preserve"> </w:t>
       </w:r>
       <w:r>
-        <w:t xml:space="preserve">coarse-grid correction, for three starting fields and six detailed cells; the 8-step entries of M1, M2, H1, H2 and U2 are those of Table 4. Harmonic and zero starting fields receive the exact rigid-body split.</w:t>
+        <w:t xml:space="preserve">coarse-grid correction, for three starting fields and six detailed cells. The 8-step entries of M1, M2, H1, H2 and U2 are those of Table 4. Harmonic and zero starting fields receive the exact rigid-body split.</w:t>
       </w:r>
     </w:p>
     <w:p>
@@ -9991,7 +9991,7 @@
         <w:pStyle w:val="BodyText"/>
       </w:pPr>
       <w:r>
-        <w:t xml:space="preserve">The harmonic starting field is the graph-harmonic extension of the deformation part of the retained displacement. The graph has the active nodes of the cell as vertices and joins every pair of the 27 nodes of each active element, with the element's material volume as weight (summed over the elements that share a pair);</w:t>
+        <w:t xml:space="preserve">The harmonic starting field recovers the interior displacements from the deformation part of the retained displacements by graph-harmonic interpolation. The graph has the active nodes of the cell as vertices and joins every pair of the 27 nodes of each active element, with the element's material volume as weight (summed over the elements that share a pair);</w:t>
       </w:r>
       <w:r>
         <w:t xml:space="preserve"> </w:t>
@@ -10032,7 +10032,7 @@
         <w:t xml:space="preserve"> </w:t>
       </w:r>
       <w:r>
-        <w:t xml:space="preserve">is its Laplacian. With the retained values prescribed, each displacement component is extended separately by</w:t>
+        <w:t xml:space="preserve">is its Laplacian. With the retained values prescribed, each displacement component is recovered separately from</w:t>
       </w:r>
       <w:r>
         <w:t xml:space="preserve"> </w:t>
@@ -10214,7 +10214,7 @@
         </m:r>
       </m:oMath>
       <w:r>
-        <w:t xml:space="preserve">; only the second part is extended, the rigid field</w:t>
+        <w:t xml:space="preserve">; only the second part is recovered in this way, the rigid field</w:t>
       </w:r>
       <w:r>
         <w:t xml:space="preserve"> </w:t>
@@ -10231,7 +10231,7 @@
         <w:t xml:space="preserve"> </w:t>
       </w:r>
       <w:r>
-        <w:t xml:space="preserve">is added, and the retained values are restored. The extension has no trainable parameters and uses only the element connectivity and volumes.</w:t>
+        <w:t xml:space="preserve">is added, and the retained values are restored. This recovery has no trainable parameters and uses only the element connectivity and volumes.</w:t>
       </w:r>
     </w:p>
     <w:tbl>
@@ -11589,21 +11589,19 @@
       <w:r>
         <w:t xml:space="preserve">space of M1 has 5,601 coarse columns for 165,927 interior DOFs.</w:t>
       </w:r>
+      <w:r>
+        <w:t xml:space="preserve"> </w:t>
+      </w:r>
+      <w:r>
+        <w:t xml:space="preserve">## Table ST08. Complete results of the two-cell assemblies with a continuous-thickness neighbour</w:t>
+      </w:r>
     </w:p>
     <w:p>
       <w:pPr>
-        <w:pStyle w:val="Heading2"/>
+        <w:pStyle w:val="BodyText"/>
       </w:pPr>
       <w:r>
-        <w:t xml:space="preserve">Table ST08. Complete continuous-neighbour assembly results</w:t>
-      </w:r>
-    </w:p>
-    <w:p>
-      <w:pPr>
-        <w:pStyle w:val="FirstParagraph"/>
-      </w:pPr>
-      <w:r>
-        <w:t xml:space="preserve">Maximum relative compliance and field-based sensitivity-vector errors (%) over the six face loads, compared with the 3% reference. Sensitivity maxima include both cells. The target cell uses the specified learned variant and its neighbour is exact. Cell labels abbreviate the validation identifiers (Supplementary Section R1).</w:t>
+        <w:t xml:space="preserve">Maximum relative errors (%) of the compliance and of the sensitivity vector over the six face loads, compared with the 3% reference. Sensitivity maxima include both cells. The test cell uses the stated learned variant, and its neighbour is exact. Cell labels abbreviate the validation identifiers (Supplementary Section R1).</w:t>
       </w:r>
     </w:p>
     <w:tbl>
@@ -11631,7 +11629,7 @@
               <w:pStyle w:val="Compact"/>
             </w:pPr>
             <w:r>
-              <w:t xml:space="preserve">Target cell</w:t>
+              <w:t xml:space="preserve">Test cell</w:t>
             </w:r>
           </w:p>
         </w:tc>
@@ -12109,7 +12107,7 @@
               <w:pStyle w:val="Compact"/>
             </w:pPr>
             <w:r>
-              <w:t xml:space="preserve">Uncorrected</w:t>
+              <w:t xml:space="preserve">Uncorrected continuation</w:t>
             </w:r>
           </w:p>
         </w:tc>
@@ -12166,7 +12164,7 @@
               <w:pStyle w:val="Compact"/>
             </w:pPr>
             <w:r>
-              <w:t xml:space="preserve">Uncorrected</w:t>
+              <w:t xml:space="preserve">Uncorrected continuation</w:t>
             </w:r>
           </w:p>
         </w:tc>
@@ -12223,7 +12221,7 @@
               <w:pStyle w:val="Compact"/>
             </w:pPr>
             <w:r>
-              <w:t xml:space="preserve">Uncorrected</w:t>
+              <w:t xml:space="preserve">Uncorrected continuation</w:t>
             </w:r>
           </w:p>
         </w:tc>
@@ -12280,7 +12278,7 @@
               <w:pStyle w:val="Compact"/>
             </w:pPr>
             <w:r>
-              <w:t xml:space="preserve">Uncorrected</w:t>
+              <w:t xml:space="preserve">Uncorrected continuation</w:t>
             </w:r>
           </w:p>
         </w:tc>
@@ -12337,7 +12335,7 @@
               <w:pStyle w:val="Compact"/>
             </w:pPr>
             <w:r>
-              <w:t xml:space="preserve">Uncorrected</w:t>
+              <w:t xml:space="preserve">Uncorrected continuation</w:t>
             </w:r>
           </w:p>
         </w:tc>
@@ -12394,7 +12392,7 @@
               <w:pStyle w:val="Compact"/>
             </w:pPr>
             <w:r>
-              <w:t xml:space="preserve">Uncorrected</w:t>
+              <w:t xml:space="preserve">Uncorrected continuation</w:t>
             </w:r>
           </w:p>
         </w:tc>
@@ -12451,7 +12449,7 @@
               <w:pStyle w:val="Compact"/>
             </w:pPr>
             <w:r>
-              <w:t xml:space="preserve">Uncorrected</w:t>
+              <w:t xml:space="preserve">Uncorrected continuation</w:t>
             </w:r>
           </w:p>
         </w:tc>
@@ -12508,7 +12506,7 @@
               <w:pStyle w:val="Compact"/>
             </w:pPr>
             <w:r>
-              <w:t xml:space="preserve">Uncorrected</w:t>
+              <w:t xml:space="preserve">Uncorrected continuation</w:t>
             </w:r>
           </w:p>
         </w:tc>
@@ -12565,7 +12563,7 @@
               <w:pStyle w:val="Compact"/>
             </w:pPr>
             <w:r>
-              <w:t xml:space="preserve">Uncorrected</w:t>
+              <w:t xml:space="preserve">Uncorrected continuation</w:t>
             </w:r>
           </w:p>
         </w:tc>
@@ -12622,7 +12620,7 @@
               <w:pStyle w:val="Compact"/>
             </w:pPr>
             <w:r>
-              <w:t xml:space="preserve">Uncorrected</w:t>
+              <w:t xml:space="preserve">Uncorrected continuation</w:t>
             </w:r>
           </w:p>
         </w:tc>
@@ -12679,7 +12677,7 @@
               <w:pStyle w:val="Compact"/>
             </w:pPr>
             <w:r>
-              <w:t xml:space="preserve">Uncorrected</w:t>
+              <w:t xml:space="preserve">Uncorrected continuation</w:t>
             </w:r>
           </w:p>
         </w:tc>
@@ -13420,7 +13418,7 @@
               <w:pStyle w:val="Compact"/>
             </w:pPr>
             <w:r>
-              <w:t xml:space="preserve">Base network, corrected</w:t>
+              <w:t xml:space="preserve">Base network + correction</w:t>
             </w:r>
           </w:p>
         </w:tc>
@@ -13477,7 +13475,7 @@
               <w:pStyle w:val="Compact"/>
             </w:pPr>
             <w:r>
-              <w:t xml:space="preserve">Base network, corrected</w:t>
+              <w:t xml:space="preserve">Base network + correction</w:t>
             </w:r>
           </w:p>
         </w:tc>
@@ -13534,7 +13532,7 @@
               <w:pStyle w:val="Compact"/>
             </w:pPr>
             <w:r>
-              <w:t xml:space="preserve">Base network, corrected</w:t>
+              <w:t xml:space="preserve">Base network + correction</w:t>
             </w:r>
           </w:p>
         </w:tc>
@@ -13591,7 +13589,7 @@
               <w:pStyle w:val="Compact"/>
             </w:pPr>
             <w:r>
-              <w:t xml:space="preserve">Base network, corrected</w:t>
+              <w:t xml:space="preserve">Base network + correction</w:t>
             </w:r>
           </w:p>
         </w:tc>
@@ -13648,7 +13646,7 @@
               <w:pStyle w:val="Compact"/>
             </w:pPr>
             <w:r>
-              <w:t xml:space="preserve">Base network, corrected</w:t>
+              <w:t xml:space="preserve">Base network + correction</w:t>
             </w:r>
           </w:p>
         </w:tc>
@@ -13705,7 +13703,7 @@
               <w:pStyle w:val="Compact"/>
             </w:pPr>
             <w:r>
-              <w:t xml:space="preserve">Base network, corrected</w:t>
+              <w:t xml:space="preserve">Base network + correction</w:t>
             </w:r>
           </w:p>
         </w:tc>
@@ -13762,7 +13760,7 @@
               <w:pStyle w:val="Compact"/>
             </w:pPr>
             <w:r>
-              <w:t xml:space="preserve">Base network, corrected</w:t>
+              <w:t xml:space="preserve">Base network + correction</w:t>
             </w:r>
           </w:p>
         </w:tc>
@@ -13819,7 +13817,7 @@
               <w:pStyle w:val="Compact"/>
             </w:pPr>
             <w:r>
-              <w:t xml:space="preserve">Base network, corrected</w:t>
+              <w:t xml:space="preserve">Base network + correction</w:t>
             </w:r>
           </w:p>
         </w:tc>
@@ -13876,7 +13874,7 @@
               <w:pStyle w:val="Compact"/>
             </w:pPr>
             <w:r>
-              <w:t xml:space="preserve">Base network, corrected</w:t>
+              <w:t xml:space="preserve">Base network + correction</w:t>
             </w:r>
           </w:p>
         </w:tc>
@@ -13933,7 +13931,7 @@
               <w:pStyle w:val="Compact"/>
             </w:pPr>
             <w:r>
-              <w:t xml:space="preserve">Base network, corrected</w:t>
+              <w:t xml:space="preserve">Base network + correction</w:t>
             </w:r>
           </w:p>
         </w:tc>
@@ -13990,7 +13988,7 @@
               <w:pStyle w:val="Compact"/>
             </w:pPr>
             <w:r>
-              <w:t xml:space="preserve">Base network, corrected</w:t>
+              <w:t xml:space="preserve">Base network + correction</w:t>
             </w:r>
           </w:p>
         </w:tc>
@@ -14047,7 +14045,7 @@
               <w:pStyle w:val="Compact"/>
             </w:pPr>
             <w:r>
-              <w:t xml:space="preserve">Base network, corrected</w:t>
+              <w:t xml:space="preserve">Base network + correction</w:t>
             </w:r>
           </w:p>
         </w:tc>
@@ -14104,7 +14102,7 @@
               <w:pStyle w:val="Compact"/>
             </w:pPr>
             <w:r>
-              <w:t xml:space="preserve">Base network, corrected</w:t>
+              <w:t xml:space="preserve">Base network + correction</w:t>
             </w:r>
           </w:p>
         </w:tc>
@@ -14161,7 +14159,7 @@
               <w:pStyle w:val="Compact"/>
             </w:pPr>
             <w:r>
-              <w:t xml:space="preserve">Base network, corrected</w:t>
+              <w:t xml:space="preserve">Base network + correction</w:t>
             </w:r>
           </w:p>
         </w:tc>
@@ -14992,7 +14990,7 @@
         <w:pStyle w:val="BodyText"/>
       </w:pPr>
       <w:r>
-        <w:t xml:space="preserve">Combinations without a row were not evaluated. All cells in this table belong to the 20 validation geometries used for checkpoint selection (Section 5.1). Cut-surface responses of the same configurations are in Table ST09. For the base network on U1/x under the neighbour-face z traction (circled in Figure S04(a–c)), the target cell carries 0.1274669% of the exact assembled energy and has a local energy error of 2.312168%; the product</w:t>
+        <w:t xml:space="preserve">Combinations without a row were not evaluated. All cells in this table belong to the 20 validation geometries used for checkpoint selection (Section 5.1). Table ST09 gives the responses of the same configurations under cut-surface tractions. For the base network on U1/x under the z traction on the neighbour face (circled in Figure S04(a–c)), the test cell carries 0.1274669% of the exact assembled energy and has a local energy error of 2.312168%. The product</w:t>
       </w:r>
       <w:r>
         <w:t xml:space="preserve"> </w:t>
@@ -15018,7 +15016,7 @@
         <w:t xml:space="preserve"> </w:t>
       </w:r>
       <w:r>
-        <w:t xml:space="preserve">is 0.002947249%, the compliance error 0.002827394% and the target-cell sensitivity error 5.82992%.</w:t>
+        <w:t xml:space="preserve">is 0.002947249%, the compliance error 0.002827394% and the test-cell sensitivity error 5.82992%.</w:t>
       </w:r>
     </w:p>
     <w:p>
@@ -15034,7 +15032,7 @@
         <w:pStyle w:val="FirstParagraph"/>
       </w:pPr>
       <w:r>
-        <w:t xml:space="preserve">Cells outside checkpoint selection: the five validation geometries with NICE's largest single-cell errors and one random evaluable cell per stratum. Maximum relative errors (%) over the six face loads (compliance) and over both cells (thickness sensitivity); the neighbour is exact and the target learned, as in Table ST08. Cell labels are defined in Supplementary Section R1.</w:t>
+        <w:t xml:space="preserve">The cells lie outside checkpoint selection: the five validation geometries with NICE's largest single-cell errors and one randomly chosen evaluable cell per cut-severity group. Entries are maximum relative errors (%), over the six face loads for the compliance and over both cells for the thickness sensitivity. As in Table ST08, the neighbour is exact and the test cell learned. Cell labels are defined in Supplementary Section R1.</w:t>
       </w:r>
     </w:p>
     <w:tbl>
@@ -15860,7 +15858,7 @@
         <w:pStyle w:val="FirstParagraph"/>
       </w:pPr>
       <w:r>
-        <w:t xml:space="preserve">Maximum relative errors (%) over the three cut-surface traction directions, for every variant and configuration of Table ST08 with a cut target; combinations without a row were not evaluated. Sensitivity maxima include both cells. The target is learned and the neighbour exact. Values above the common 3% line are marked in bold, as in the cut-surface-traction comparison of Section 5.6.</w:t>
+        <w:t xml:space="preserve">Maximum relative errors (%) over the three cut-surface traction directions, for every variant and configuration of Table ST08 with a cut test cell. Combinations without a row were not evaluated. Sensitivity maxima include both cells. The test cell is learned and the neighbour exact. As in the comparison of cut-surface tractions in Section 5.6, values above the common 3% line are in bold.</w:t>
       </w:r>
     </w:p>
     <w:tbl>
@@ -16181,7 +16179,7 @@
               <w:pStyle w:val="Compact"/>
             </w:pPr>
             <w:r>
-              <w:t xml:space="preserve">Uncorrected</w:t>
+              <w:t xml:space="preserve">Uncorrected continuation</w:t>
             </w:r>
           </w:p>
         </w:tc>
@@ -16242,7 +16240,7 @@
               <w:pStyle w:val="Compact"/>
             </w:pPr>
             <w:r>
-              <w:t xml:space="preserve">Uncorrected</w:t>
+              <w:t xml:space="preserve">Uncorrected continuation</w:t>
             </w:r>
           </w:p>
         </w:tc>
@@ -16307,7 +16305,7 @@
               <w:pStyle w:val="Compact"/>
             </w:pPr>
             <w:r>
-              <w:t xml:space="preserve">Uncorrected</w:t>
+              <w:t xml:space="preserve">Uncorrected continuation</w:t>
             </w:r>
           </w:p>
         </w:tc>
@@ -16364,7 +16362,7 @@
               <w:pStyle w:val="Compact"/>
             </w:pPr>
             <w:r>
-              <w:t xml:space="preserve">Uncorrected</w:t>
+              <w:t xml:space="preserve">Uncorrected continuation</w:t>
             </w:r>
           </w:p>
         </w:tc>
@@ -16421,7 +16419,7 @@
               <w:pStyle w:val="Compact"/>
             </w:pPr>
             <w:r>
-              <w:t xml:space="preserve">Uncorrected</w:t>
+              <w:t xml:space="preserve">Uncorrected continuation</w:t>
             </w:r>
           </w:p>
         </w:tc>
@@ -16482,7 +16480,7 @@
               <w:pStyle w:val="Compact"/>
             </w:pPr>
             <w:r>
-              <w:t xml:space="preserve">Uncorrected</w:t>
+              <w:t xml:space="preserve">Uncorrected continuation</w:t>
             </w:r>
           </w:p>
         </w:tc>
@@ -16539,7 +16537,7 @@
               <w:pStyle w:val="Compact"/>
             </w:pPr>
             <w:r>
-              <w:t xml:space="preserve">Uncorrected</w:t>
+              <w:t xml:space="preserve">Uncorrected continuation</w:t>
             </w:r>
           </w:p>
         </w:tc>
@@ -17068,7 +17066,7 @@
               <w:pStyle w:val="Compact"/>
             </w:pPr>
             <w:r>
-              <w:t xml:space="preserve">Base network, corrected</w:t>
+              <w:t xml:space="preserve">Base network + correction</w:t>
             </w:r>
           </w:p>
         </w:tc>
@@ -17125,7 +17123,7 @@
               <w:pStyle w:val="Compact"/>
             </w:pPr>
             <w:r>
-              <w:t xml:space="preserve">Base network, corrected</w:t>
+              <w:t xml:space="preserve">Base network + correction</w:t>
             </w:r>
           </w:p>
         </w:tc>
@@ -17182,7 +17180,7 @@
               <w:pStyle w:val="Compact"/>
             </w:pPr>
             <w:r>
-              <w:t xml:space="preserve">Base network, corrected</w:t>
+              <w:t xml:space="preserve">Base network + correction</w:t>
             </w:r>
           </w:p>
         </w:tc>
@@ -17239,7 +17237,7 @@
               <w:pStyle w:val="Compact"/>
             </w:pPr>
             <w:r>
-              <w:t xml:space="preserve">Base network, corrected</w:t>
+              <w:t xml:space="preserve">Base network + correction</w:t>
             </w:r>
           </w:p>
         </w:tc>
@@ -17296,7 +17294,7 @@
               <w:pStyle w:val="Compact"/>
             </w:pPr>
             <w:r>
-              <w:t xml:space="preserve">Base network, corrected</w:t>
+              <w:t xml:space="preserve">Base network + correction</w:t>
             </w:r>
           </w:p>
         </w:tc>
@@ -17353,7 +17351,7 @@
               <w:pStyle w:val="Compact"/>
             </w:pPr>
             <w:r>
-              <w:t xml:space="preserve">Base network, corrected</w:t>
+              <w:t xml:space="preserve">Base network + correction</w:t>
             </w:r>
           </w:p>
         </w:tc>
@@ -17410,7 +17408,7 @@
               <w:pStyle w:val="Compact"/>
             </w:pPr>
             <w:r>
-              <w:t xml:space="preserve">Base network, corrected</w:t>
+              <w:t xml:space="preserve">Base network + correction</w:t>
             </w:r>
           </w:p>
         </w:tc>
@@ -17467,7 +17465,7 @@
               <w:pStyle w:val="Compact"/>
             </w:pPr>
             <w:r>
-              <w:t xml:space="preserve">Base network, corrected</w:t>
+              <w:t xml:space="preserve">Base network + correction</w:t>
             </w:r>
           </w:p>
         </w:tc>
@@ -17524,7 +17522,7 @@
               <w:pStyle w:val="Compact"/>
             </w:pPr>
             <w:r>
-              <w:t xml:space="preserve">Base network, corrected</w:t>
+              <w:t xml:space="preserve">Base network + correction</w:t>
             </w:r>
           </w:p>
         </w:tc>
@@ -17581,7 +17579,7 @@
               <w:pStyle w:val="Compact"/>
             </w:pPr>
             <w:r>
-              <w:t xml:space="preserve">Base network, corrected</w:t>
+              <w:t xml:space="preserve">Base network + correction</w:t>
             </w:r>
           </w:p>
         </w:tc>
@@ -18214,7 +18212,7 @@
         <w:pStyle w:val="FirstParagraph"/>
       </w:pPr>
       <w:r>
-        <w:t xml:space="preserve">Figure S01 and Table ST10 verify the CutFEM reference against background refinement and the ghost-penalty coefficient, and Table ST10b compares it with a body-fitted discretisation on uncut cells; the last paragraph of this note verifies the numerical thickness derivative.</w:t>
+        <w:t xml:space="preserve">Figure S01 and Table ST10 verify the CutFEM reference under refinement of the background grid and under changes of the ghost-penalty coefficient. Table ST10b compares the reference with a body-fitted discretisation on uncut cells. The last paragraph of this note verifies the numerical thickness derivative.</w:t>
       </w:r>
     </w:p>
     <w:p>
@@ -18288,7 +18286,7 @@
         </m:r>
       </m:oMath>
       <w:r>
-        <w:t xml:space="preserve">, because its retained part carries no material on its</w:t>
+        <w:t xml:space="preserve">, because its retained part has no material on its</w:t>
       </w:r>
       <w:r>
         <w:t xml:space="preserve"> </w:t>
@@ -18299,7 +18297,7 @@
         </m:r>
       </m:oMath>
       <w:r>
-        <w:t xml:space="preserve">-faces; at</w:t>
+        <w:t xml:space="preserve">-faces. At</w:t>
       </w:r>
       <w:r>
         <w:t xml:space="preserve"> </w:t>
@@ -18368,7 +18366,7 @@
         <w:t xml:space="preserve"> </w:t>
       </w:r>
       <w:r>
-        <w:t xml:space="preserve">by only 0.07% and 0.08%, while</w:t>
+        <w:t xml:space="preserve">by only 0.07% and 0.08%. Between</w:t>
       </w:r>
       <w:r>
         <w:t xml:space="preserve"> </w:t>
@@ -18391,7 +18389,7 @@
         <w:t xml:space="preserve"> </w:t>
       </w:r>
       <w:r>
-        <w:t xml:space="preserve">differs from</w:t>
+        <w:t xml:space="preserve">and</w:t>
       </w:r>
       <w:r>
         <w:t xml:space="preserve"> </w:t>
@@ -18414,7 +18412,7 @@
         <w:t xml:space="preserve"> </w:t>
       </w:r>
       <w:r>
-        <w:t xml:space="preserve">by 1.08%: H1 does not converge monotonically (Figure S01(d), Table ST10). On U1, M1, M2 and H1, varying the ghost-penalty coefficient between</w:t>
+        <w:t xml:space="preserve">the difference is 1.08%, so H1 does not converge monotonically (Figure S01(d), Table ST10). On U1, M1, M2 and H1, varying the ghost-penalty coefficient between</w:t>
       </w:r>
       <w:r>
         <w:t xml:space="preserve"> </w:t>
@@ -18472,7 +18470,42 @@
         <w:t xml:space="preserve"> </w:t>
       </w:r>
       <w:r>
-        <w:t xml:space="preserve">changes the compliance by at most 0.053% and the sensitivities by at most 0.12% (penalty energy</w:t>
+        <w:t xml:space="preserve">changes the compliance by at most 0.053% and the sensitivities by at most 0.12%. At</w:t>
+      </w:r>
+      <w:r>
+        <w:t xml:space="preserve"> </w:t>
+      </w:r>
+      <m:oMath>
+        <m:r>
+          <m:t>γ</m:t>
+        </m:r>
+        <m:r>
+          <m:rPr>
+            <m:sty m:val="p"/>
+          </m:rPr>
+          <m:t>=</m:t>
+        </m:r>
+        <m:sSup>
+          <m:e>
+            <m:r>
+              <m:t>10</m:t>
+            </m:r>
+          </m:e>
+          <m:sup>
+            <m:r>
+              <m:rPr>
+                <m:sty m:val="p"/>
+              </m:rPr>
+              <m:t>−</m:t>
+            </m:r>
+            <m:r>
+              <m:t>3</m:t>
+            </m:r>
+          </m:sup>
+        </m:sSup>
+      </m:oMath>
+      <w:r>
+        <w:t xml:space="preserve">, the penalty energy is</w:t>
       </w:r>
       <w:r>
         <w:t xml:space="preserve"> </w:t>
@@ -18548,42 +18581,7 @@
         <w:t xml:space="preserve"> </w:t>
       </w:r>
       <w:r>
-        <w:t xml:space="preserve">of the total at</w:t>
-      </w:r>
-      <w:r>
-        <w:t xml:space="preserve"> </w:t>
-      </w:r>
-      <m:oMath>
-        <m:r>
-          <m:t>γ</m:t>
-        </m:r>
-        <m:r>
-          <m:rPr>
-            <m:sty m:val="p"/>
-          </m:rPr>
-          <m:t>=</m:t>
-        </m:r>
-        <m:sSup>
-          <m:e>
-            <m:r>
-              <m:t>10</m:t>
-            </m:r>
-          </m:e>
-          <m:sup>
-            <m:r>
-              <m:rPr>
-                <m:sty m:val="p"/>
-              </m:rPr>
-              <m:t>−</m:t>
-            </m:r>
-            <m:r>
-              <m:t>3</m:t>
-            </m:r>
-          </m:sup>
-        </m:sSup>
-      </m:oMath>
-      <w:r>
-        <w:t xml:space="preserve">), and refining the volume integration changes both by at most 0.010%.</w:t>
+        <w:t xml:space="preserve">of the total. Refining the volume integration changes both quantities by at most 0.010%.</w:t>
       </w:r>
     </w:p>
     <w:p>
@@ -18616,7 +18614,7 @@
         <w:pStyle w:val="FirstParagraph"/>
       </w:pPr>
       <w:r>
-        <w:t xml:space="preserve">Single cells clamped on one box face and loaded by unit consistent tractions in the three directions on another face, solved at</w:t>
+        <w:t xml:space="preserve">Single cells are clamped on one cell face and loaded on another face by unit traction loads in the three coordinate directions, and they are solved at</w:t>
       </w:r>
       <w:r>
         <w:t xml:space="preserve"> </w:t>
@@ -18639,7 +18637,7 @@
         <w:t xml:space="preserve"> </w:t>
       </w:r>
       <w:r>
-        <w:t xml:space="preserve">to 64 by a sparse direct solver; H2, whose only material-bearing box face is the clamped one, is loaded instead by a unit-resultant consistent body force. Entries: signed compliance deviation from</w:t>
+        <w:t xml:space="preserve">to 64 by a sparse direct solver. H2 is loaded instead by a body force with unit resultant, because its only cell face that carries material is the clamped one. Each entry gives the signed compliance deviation from</w:t>
       </w:r>
       <w:r>
         <w:t xml:space="preserve"> </w:t>
@@ -18662,7 +18660,7 @@
         <w:t xml:space="preserve"> </w:t>
       </w:r>
       <w:r>
-        <w:t xml:space="preserve">with the largest magnitude over the three loads / largest relative deviation of the thickness sensitivity vector, both in percent. H2 could not be meshed at</w:t>
+        <w:t xml:space="preserve">with the largest magnitude over the three loads, followed after the slash by the largest relative deviation of the thickness sensitivity vector, both in percent. H2 could not be meshed at</w:t>
       </w:r>
       <w:r>
         <w:t xml:space="preserve"> </w:t>
@@ -18682,7 +18680,7 @@
         </m:r>
       </m:oMath>
       <w:r>
-        <w:t xml:space="preserve">. Production references use</w:t>
+        <w:t xml:space="preserve">. Elsewhere in this work, the reference solutions are computed at</w:t>
       </w:r>
       <w:r>
         <w:t xml:space="preserve"> </w:t>
@@ -19124,7 +19122,7 @@
         <w:pStyle w:val="BodyText"/>
       </w:pPr>
       <w:r>
-        <w:t xml:space="preserve">On uncut cells, the discrete model was also compared with an independent body-fitted discretisation that meshes the same implicit geometry with quadratic tetrahedra and shares no geometry, quadrature or stabilisation code with it (Table ST10b).</w:t>
+        <w:t xml:space="preserve">On uncut cells, the discrete model was also compared with an independent body-fitted discretisation (Table ST10b). This discretisation meshes the same implicit geometry with quadratic tetrahedra and shares no geometry, quadrature or stabilisation code with the discrete model.</w:t>
       </w:r>
     </w:p>
     <w:p>
@@ -19349,7 +19347,7 @@
         <w:pStyle w:val="BodyText"/>
       </w:pPr>
       <w:r>
-        <w:t xml:space="preserve">Figure S01(c) reports a step-refinement study of the numerical thickness derivative on four cells: relative to the production step</w:t>
+        <w:t xml:space="preserve">Figure S01(c) reports a step-refinement study of the numerical thickness derivative on four cells. Relative to the step used in the computations,</w:t>
       </w:r>
       <w:r>
         <w:t xml:space="preserve"> </w:t>
@@ -19618,7 +19616,7 @@
         </m:sSub>
       </m:oMath>
       <w:r>
-        <w:t xml:space="preserve">; the hundredfold reduction per decade is the second-order truncation of the central difference, consistent with a derivative that is smooth within</w:t>
+        <w:t xml:space="preserve">. The hundredfold reduction per decade is the second-order truncation error of the central difference. It is consistent with a derivative that is smooth within</w:t>
       </w:r>
       <w:r>
         <w:t xml:space="preserve"> </w:t>
@@ -19665,7 +19663,7 @@
         <w:t xml:space="preserve"> </w:t>
       </w:r>
       <w:r>
-        <w:t xml:space="preserve">at the fixed active set on these cells. On the same cells, the central-difference stiffness derivative agrees with differences of the compliance recomputed at the perturbed designs to</w:t>
+        <w:t xml:space="preserve">at the fixed active set on these cells. On the same cells, the central-difference stiffness derivative agrees to</w:t>
       </w:r>
       <w:r>
         <w:t xml:space="preserve"> </w:t>
@@ -19700,7 +19698,10 @@
         </m:sSup>
       </m:oMath>
       <w:r>
-        <w:t xml:space="preserve">. An element-level check over the partially filled elements of the eight detailed cells shows that the discrete moments do not preserve the nesting behind Eq. (H.7) everywhere. The element stiffnesses are positive semidefinite to rounding, but the exact derivative of the discrete moments at fixed clipping topology gives element derivative matrices with negative eigenvalues: in the uncut cells the smallest ratio</w:t>
+        <w:t xml:space="preserve"> </w:t>
+      </w:r>
+      <w:r>
+        <w:t xml:space="preserve">with differences of the compliance recomputed at the perturbed designs. An element-level check over the partially filled elements of the eight detailed cells shows that the discrete moments do not everywhere preserve the nesting on which Eq. (H.7) relies. The element stiffness matrices are positive semidefinite to rounding. However, the exact derivative of the discrete moments at fixed clipping topology gives element derivative matrices with negative eigenvalues. In the uncut cells, the smallest ratio</w:t>
       </w:r>
       <w:r>
         <w:t xml:space="preserve"> </w:t>
@@ -19794,7 +19795,7 @@
         </m:sSup>
       </m:oMath>
       <w:r>
-        <w:t xml:space="preserve">, and in four of the six cut cells between 2 and 11 partially filled elements (of 762 to 6,033) have a uniform-thickening derivative whose most negative eigenvalue exceeds</w:t>
+        <w:t xml:space="preserve">. In four of the six cut cells, between 2 and 11 partially filled elements (of 762 to 6,033) have a uniform-thickening derivative whose most negative eigenvalue exceeds</w:t>
       </w:r>
       <w:r>
         <w:t xml:space="preserve"> </w:t>
@@ -19823,7 +19824,7 @@
         <w:t xml:space="preserve"> </w:t>
       </w:r>
       <w:r>
-        <w:t xml:space="preserve">of its largest in magnitude; these derivatives are indefinite, with a largest eigenvalue of at least</w:t>
+        <w:t xml:space="preserve">of its largest eigenvalue in magnitude. These derivatives are indefinite, with a largest eigenvalue of at least</w:t>
       </w:r>
       <w:r>
         <w:t xml:space="preserve"> </w:t>
@@ -19852,7 +19853,7 @@
         <w:t xml:space="preserve"> </w:t>
       </w:r>
       <w:r>
-        <w:t xml:space="preserve">of the largest magnitude. The production central difference agrees with this exact discrete derivative to</w:t>
+        <w:t xml:space="preserve">of the largest magnitude. The central difference used in the computations agrees with this exact discrete derivative to</w:t>
       </w:r>
       <w:r>
         <w:t xml:space="preserve"> </w:t>
@@ -19895,7 +19896,7 @@
         <w:pStyle w:val="Heading2"/>
       </w:pPr>
       <w:r>
-        <w:t xml:space="preserve">Supplementary Note S2. Ablation of the retained representation: Bernstein-restricted box faces</w:t>
+        <w:t xml:space="preserve">Supplementary Note S2. Ablation: Bernstein-restricted cell faces</w:t>
       </w:r>
     </w:p>
     <w:p>
@@ -19903,7 +19904,7 @@
         <w:pStyle w:val="FirstParagraph"/>
       </w:pPr>
       <w:r>
-        <w:t xml:space="preserve">This note gives the complete results of the ablation summarised in Section 5.7: every cell operator is the exact Schur complement, and only the representation of the retained box-face displacements is reduced.</w:t>
+        <w:t xml:space="preserve">This note gives the complete results of the ablation summarised in Section 5.7. Every cell uses its exact condensed stiffness matrix (the Schur complement), and only the representation of the retained cell-face displacements is reduced.</w:t>
       </w:r>
     </w:p>
     <w:p>
@@ -19933,7 +19934,7 @@
         <w:t xml:space="preserve"> </w:t>
       </w:r>
       <w:r>
-        <w:t xml:space="preserve">on the selected box faces of each cell. Its global map</w:t>
+        <w:t xml:space="preserve">on the selected cell faces of each cell. Its global map</w:t>
       </w:r>
       <w:r>
         <w:t xml:space="preserve"> </w:t>
@@ -19956,7 +19957,7 @@
         <w:t xml:space="preserve"> </w:t>
       </w:r>
       <w:r>
-        <w:t xml:space="preserve">respects the DOFs shared between cells, while cut-band DOFs outside the box trace retain identity columns. The supported Galerkin system is</w:t>
+        <w:t xml:space="preserve">respects the DOFs shared between cells. DOFs of the cut-plane elements that do not lie on the cell faces keep identity columns. With the supports applied, the Galerkin system is</w:t>
       </w:r>
     </w:p>
     <w:p>
@@ -20195,7 +20196,7 @@
         <w:pStyle w:val="FirstParagraph"/>
       </w:pPr>
       <w:r>
-        <w:t xml:space="preserve">The comparison evaluates exact local Schur operators within this restricted trace space, so the interior is exact and every error comes from the restricted boundary. Two variants are examined: every box face restricted, as in a lattice built entirely from such substructures, and only the shared interface restricted.</w:t>
+        <w:t xml:space="preserve">The comparison evaluates the exact condensed stiffness matrices of the cells within this restricted space of cell-face displacements. The interior is therefore exact, and every error comes from the restricted boundary. Two cases are examined: every cell face restricted, as in a lattice built entirely from such substructures, and only the shared interface restricted.</w:t>
       </w:r>
     </w:p>
     <w:p>
@@ -20221,7 +20222,7 @@
         <w:t xml:space="preserve"> </w:t>
       </w:r>
       <w:r>
-        <w:t xml:space="preserve">act on different trial spaces. Exact condensation followed by the restriction</w:t>
+        <w:t xml:space="preserve">act on different displacement spaces. Exact condensation followed by the restriction</w:t>
       </w:r>
       <w:r>
         <w:t xml:space="preserve"> </w:t>
@@ -20256,7 +20257,7 @@
         <w:t xml:space="preserve"> </w:t>
       </w:r>
       <w:r>
-        <w:t xml:space="preserve">solves over a subspace of the retained space, and nested boundary spaces give a nondecreasing Ritz compliance. The correction preserves every retained DOF and changes the interior field</w:t>
+        <w:t xml:space="preserve">solves over a subspace of the space of retained displacements, and nested boundary spaces give a nondecreasing Ritz compliance. The correction keeps every retained DOF fixed and changes the interior displacements of</w:t>
       </w:r>
       <w:r>
         <w:t xml:space="preserve"> </w:t>
@@ -20282,7 +20283,7 @@
         </m:r>
       </m:oMath>
       <w:r>
-        <w:t xml:space="preserve">; its ordering comes from the contraction of</w:t>
+        <w:t xml:space="preserve">. Its ordering holds because the two-grid cycle that defines</w:t>
       </w:r>
       <w:r>
         <w:t xml:space="preserve"> </w:t>
@@ -20296,7 +20297,7 @@
         <w:t xml:space="preserve"> </w:t>
       </w:r>
       <w:r>
-        <w:t xml:space="preserve">(Section 4.4), although two such interior spaces need not be nested. In neither case is a local sensitivity norm ordered.</w:t>
+        <w:t xml:space="preserve">does not increase the energy error (Section 3.4), although two such interior spaces need not be nested. In neither case is a norm of the local sensitivity ordered.</w:t>
       </w:r>
     </w:p>
     <w:p>
@@ -20316,7 +20317,7 @@
         </w:numPr>
       </w:pPr>
       <w:r>
-        <w:t xml:space="preserve">Pairs in configuration x (Figure 9; Supplementary Note S4), each target with its exact continuous-thickness neighbour, for U1, M1, M2 and H1; the interface-only variant was run for U1, M1 and M2.</w:t>
+        <w:t xml:space="preserve">Pairs in configuration x (Figure 9; Supplementary Note S4), each test cell with its exact neighbour of continuous thickness, for U1, M1, M2 and H1; the interface-only case was run for U1, M1 and M2.</w:t>
       </w:r>
     </w:p>
     <w:p>
@@ -20328,7 +20329,7 @@
         </w:numPr>
       </w:pPr>
       <w:r>
-        <w:t xml:space="preserve">One cell per substructure, the fine-scale consistent face tractions used throughout, and no oversampling.</w:t>
+        <w:t xml:space="preserve">One cell per substructure, the fine-scale face traction loads used throughout, and no oversampling.</w:t>
       </w:r>
     </w:p>
     <w:p>
@@ -20340,7 +20341,7 @@
         </w:numPr>
       </w:pPr>
       <w:r>
-        <w:t xml:space="preserve">Loads: the three target-face tractions and the three neighbour-face tractions.</w:t>
+        <w:t xml:space="preserve">Loads: the three tractions on the test-cell face and the three tractions on the neighbour face.</w:t>
       </w:r>
     </w:p>
     <w:p>
@@ -20352,7 +20353,7 @@
         </w:numPr>
       </w:pPr>
       <w:r>
-        <w:t xml:space="preserve">The non-box cut-band DOFs remain unrestricted, which favours the restricted model (controlled DOFs in Table ST11).</w:t>
+        <w:t xml:space="preserve">The DOFs of the cut-plane elements that are not on the cell faces remain unrestricted, which favours the restricted model (controlled DOFs in Table ST11).</w:t>
       </w:r>
     </w:p>
     <w:p>
@@ -20364,7 +20365,7 @@
         </w:numPr>
       </w:pPr>
       <w:r>
-        <w:t xml:space="preserve">The comparison concerns accuracy, not accuracy at equal cost.</w:t>
+        <w:t xml:space="preserve">The comparison concerns accuracy only and does not compare accuracy at equal cost.</w:t>
       </w:r>
     </w:p>
     <w:p>
@@ -20372,7 +20373,7 @@
         <w:pStyle w:val="Heading3"/>
       </w:pPr>
       <w:r>
-        <w:t xml:space="preserve">Table ST11. Bernstein restriction of the box-face displacements</w:t>
+        <w:t xml:space="preserve">Table ST11. Bernstein restriction of the cell-face displacements</w:t>
       </w:r>
     </w:p>
     <w:p>
@@ -20380,7 +20381,7 @@
         <w:pStyle w:val="FirstParagraph"/>
       </w:pPr>
       <w:r>
-        <w:t xml:space="preserve">Each target cell and its continuous-thickness neighbour are assembled in configuration x using exact cell operators. Degree r applies to the restricted box faces; cut-band DOFs retain their identity representation. Controlled DOFs include these unrestricted cut-band DOFs. All errors are maxima in the stated load set (%), relative to the full retained-space solution; sensitivity columns refer to the target-cell vector. Target-face loads are the three unit consistent tractions on the target's loaded face, and the six-load set adds the three neighbour-face tractions; the maxima of the two load sets need not occur under the same load.</w:t>
+        <w:t xml:space="preserve">Each test cell and its neighbour of continuous thickness are assembled in configuration x with exact condensed stiffness matrices. Degree r applies to the restricted cell faces; the DOFs of the cut-plane elements keep their identity representation. Controlled DOFs include these unrestricted DOFs of the cut-plane elements. All errors are maxima over the stated load set (%), relative to the solution with all retained DOFs; the sensitivity columns refer to the test-cell vector. Test-face loads are the three unit traction loads on the loaded face of the test cell, and the six-load set adds the three tractions on the neighbour face. The maxima of the two load sets need not occur under the same load.</w:t>
       </w:r>
     </w:p>
     <w:p>
@@ -20388,7 +20389,7 @@
         <w:pStyle w:val="Heading4"/>
       </w:pPr>
       <w:r>
-        <w:t xml:space="preserve">ST11a. Every box face restricted</w:t>
+        <w:t xml:space="preserve">ST11a. Every cell face restricted</w:t>
       </w:r>
     </w:p>
     <w:tbl>
@@ -20451,18 +20452,18 @@
               <w:pStyle w:val="Compact"/>
             </w:pPr>
             <w:r>
-              <w:t xml:space="preserve">Target-face compliance (3 loads)</w:t>
-            </w:r>
-          </w:p>
-        </w:tc>
-        <w:tc>
-          <w:tcPr/>
-          <w:p>
-            <w:pPr>
-              <w:pStyle w:val="Compact"/>
-            </w:pPr>
-            <w:r>
-              <w:t xml:space="preserve">Target-face sensitivity (3 loads)</w:t>
+              <w:t xml:space="preserve">Test-face compliance (3 loads)</w:t>
+            </w:r>
+          </w:p>
+        </w:tc>
+        <w:tc>
+          <w:tcPr/>
+          <w:p>
+            <w:pPr>
+              <w:pStyle w:val="Compact"/>
+            </w:pPr>
+            <w:r>
+              <w:t xml:space="preserve">Test-face sensitivity (3 loads)</w:t>
             </w:r>
           </w:p>
         </w:tc>
@@ -22138,18 +22139,18 @@
               <w:pStyle w:val="Compact"/>
             </w:pPr>
             <w:r>
-              <w:t xml:space="preserve">Target-face compliance (3 loads)</w:t>
-            </w:r>
-          </w:p>
-        </w:tc>
-        <w:tc>
-          <w:tcPr/>
-          <w:p>
-            <w:pPr>
-              <w:pStyle w:val="Compact"/>
-            </w:pPr>
-            <w:r>
-              <w:t xml:space="preserve">Target-face sensitivity (3 loads)</w:t>
+              <w:t xml:space="preserve">Test-face compliance (3 loads)</w:t>
+            </w:r>
+          </w:p>
+        </w:tc>
+        <w:tc>
+          <w:tcPr/>
+          <w:p>
+            <w:pPr>
+              <w:pStyle w:val="Compact"/>
+            </w:pPr>
+            <w:r>
+              <w:t xml:space="preserve">Test-face sensitivity (3 loads)</w:t>
             </w:r>
           </w:p>
         </w:tc>
@@ -23367,153 +23368,13 @@
         <w:pStyle w:val="BodyText"/>
       </w:pPr>
       <w:r>
-        <w:t xml:space="preserve">The supported systems on the full retained space have 28,206 (U1), 39,996 (M1), 39,120 (M2) and 32,991 (H1) free DOFs.</w:t>
-      </w:r>
-    </w:p>
-    <w:p>
-      <w:pPr>
-        <w:pStyle w:val="Heading2"/>
-      </w:pPr>
-      <w:r>
-        <w:t xml:space="preserve">Supplementary Note S3. Cost records: whole-lattice direct solution and per-cell condensation</w:t>
-      </w:r>
-    </w:p>
-    <w:p>
-      <w:pPr>
-        <w:pStyle w:val="FirstParagraph"/>
-      </w:pPr>
-      <w:r>
-        <w:t xml:space="preserve">This note defines the three routes of Table 6 and records their phases (Table ST12), together with a per-cell cost comparison of conventional condensation and NICE (Table ST13). The four-cell lattices are the two layers</w:t>
+        <w:t xml:space="preserve">With all retained DOFs and the supports applied, the systems have 28,206 (U1), 39,996 (M1), 39,120 (M2) and 32,991 (H1) free DOFs.</w:t>
       </w:r>
       <w:r>
         <w:t xml:space="preserve"> </w:t>
       </w:r>
-      <m:oMath>
-        <m:r>
-          <m:t>z</m:t>
-        </m:r>
-        <m:r>
-          <m:rPr>
-            <m:sty m:val="p"/>
-          </m:rPr>
-          <m:t>=</m:t>
-        </m:r>
-        <m:r>
-          <m:t>0</m:t>
-        </m:r>
-      </m:oMath>
-      <w:r>
-        <w:t xml:space="preserve"> </w:t>
-      </w:r>
-      <w:r>
-        <w:t xml:space="preserve">and</w:t>
-      </w:r>
-      <w:r>
-        <w:t xml:space="preserve"> </w:t>
-      </w:r>
-      <m:oMath>
-        <m:r>
-          <m:t>z</m:t>
-        </m:r>
-        <m:r>
-          <m:rPr>
-            <m:sty m:val="p"/>
-          </m:rPr>
-          <m:t>=</m:t>
-        </m:r>
-        <m:r>
-          <m:t>1</m:t>
-        </m:r>
-      </m:oMath>
-      <w:r>
-        <w:t xml:space="preserve"> </w:t>
-      </w:r>
-      <w:r>
-        <w:t xml:space="preserve">of the</w:t>
-      </w:r>
-      <w:r>
-        <w:t xml:space="preserve"> </w:t>
-      </w:r>
-      <m:oMath>
-        <m:r>
-          <m:t>2</m:t>
-        </m:r>
-        <m:r>
-          <m:rPr>
-            <m:sty m:val="p"/>
-          </m:rPr>
-          <m:t>×</m:t>
-        </m:r>
-        <m:r>
-          <m:t>2</m:t>
-        </m:r>
-        <m:r>
-          <m:rPr>
-            <m:sty m:val="p"/>
-          </m:rPr>
-          <m:t>×</m:t>
-        </m:r>
-        <m:r>
-          <m:t>2</m:t>
-        </m:r>
-      </m:oMath>
-      <w:r>
-        <w:t xml:space="preserve"> </w:t>
-      </w:r>
-      <w:r>
-        <w:t xml:space="preserve">block of Section 5.8, taken with their thickness corners unchanged: each layer holds two uncut cells and two cut cells with retained volume fractions 0.616 and 0.252. All lattices are clamped on the face</w:t>
-      </w:r>
-      <w:r>
-        <w:t xml:space="preserve"> </w:t>
-      </w:r>
-      <m:oMath>
-        <m:r>
-          <m:t>y</m:t>
-        </m:r>
-        <m:r>
-          <m:rPr>
-            <m:sty m:val="p"/>
-          </m:rPr>
-          <m:t>=</m:t>
-        </m:r>
-        <m:r>
-          <m:rPr>
-            <m:sty m:val="p"/>
-          </m:rPr>
-          <m:t>min</m:t>
-        </m:r>
-      </m:oMath>
-      <w:r>
-        <w:t xml:space="preserve"> </w:t>
-      </w:r>
-      <w:r>
-        <w:t xml:space="preserve">and loaded by unit consistent tractions on the face</w:t>
-      </w:r>
-      <w:r>
-        <w:t xml:space="preserve"> </w:t>
-      </w:r>
-      <m:oMath>
-        <m:r>
-          <m:t>y</m:t>
-        </m:r>
-        <m:r>
-          <m:rPr>
-            <m:sty m:val="p"/>
-          </m:rPr>
-          <m:t>=</m:t>
-        </m:r>
-        <m:r>
-          <m:rPr>
-            <m:sty m:val="p"/>
-          </m:rPr>
-          <m:t>max</m:t>
-        </m:r>
-      </m:oMath>
-      <w:r>
-        <w:t xml:space="preserve"> </w:t>
-      </w:r>
-      <w:r>
-        <w:t xml:space="preserve">in the three Cartesian directions; routes (a) and (b) additionally solve three random loads.</w:t>
+      <w:r>
+        <w:t xml:space="preserve">## Supplementary Note S3. Cost records: whole-lattice direct solution and per-cell condensation</w:t>
       </w:r>
     </w:p>
     <w:p>
@@ -23521,66 +23382,137 @@
         <w:pStyle w:val="BodyText"/>
       </w:pPr>
       <w:r>
-        <w:t xml:space="preserve">Route (a), the whole-lattice direct solution, assembles the full cut-cell stiffness of every cell, retained and interior degrees of freedom, into one global matrix. The retained degrees of freedom are numbered and coupled exactly as in the learned lattice, with the same clamp, free set and load vectors, and the interior degrees of freedom of each cell follow the free retained ones. The matrix is scaled symmetrically by its diagonal and factorised by MKL PARDISO 2026.1 on the CPU as a symmetric positive definite Cholesky factorisation of the upper triangle (mtype 2), with nested-dissection ordering (iparm(2) = 3) and 16 threads; the PARDISO phases are called directly with explicitly set parameters, and all six loads are solved at once. Relative residuals</w:t>
+        <w:t xml:space="preserve">This note defines the three routes of Table 5 and records their phases (Table ST12). It also compares the per-cell cost of conventional condensation and NICE (Table ST13). The four-cell lattices are the two layers</w:t>
       </w:r>
       <w:r>
         <w:t xml:space="preserve"> </w:t>
       </w:r>
       <m:oMath>
+        <m:r>
+          <m:t>z</m:t>
+        </m:r>
         <m:r>
           <m:rPr>
             <m:sty m:val="p"/>
           </m:rPr>
-          <m:t>∥</m:t>
-        </m:r>
-        <m:r>
-          <m:t>K</m:t>
-        </m:r>
-        <m:r>
-          <m:t>u</m:t>
+          <m:t>=</m:t>
+        </m:r>
+        <m:r>
+          <m:t>0</m:t>
+        </m:r>
+      </m:oMath>
+      <w:r>
+        <w:t xml:space="preserve"> </w:t>
+      </w:r>
+      <w:r>
+        <w:t xml:space="preserve">and</w:t>
+      </w:r>
+      <w:r>
+        <w:t xml:space="preserve"> </w:t>
+      </w:r>
+      <m:oMath>
+        <m:r>
+          <m:t>z</m:t>
         </m:r>
         <m:r>
           <m:rPr>
             <m:sty m:val="p"/>
           </m:rPr>
-          <m:t>−</m:t>
-        </m:r>
-        <m:r>
-          <m:t>f</m:t>
+          <m:t>=</m:t>
+        </m:r>
+        <m:r>
+          <m:t>1</m:t>
+        </m:r>
+      </m:oMath>
+      <w:r>
+        <w:t xml:space="preserve"> </w:t>
+      </w:r>
+      <w:r>
+        <w:t xml:space="preserve">of the</w:t>
+      </w:r>
+      <w:r>
+        <w:t xml:space="preserve"> </w:t>
+      </w:r>
+      <m:oMath>
+        <m:r>
+          <m:t>2</m:t>
         </m:r>
         <m:r>
           <m:rPr>
             <m:sty m:val="p"/>
           </m:rPr>
-          <m:t>∥</m:t>
+          <m:t>×</m:t>
+        </m:r>
+        <m:r>
+          <m:t>2</m:t>
         </m:r>
         <m:r>
           <m:rPr>
             <m:sty m:val="p"/>
           </m:rPr>
-          <m:t>/</m:t>
+          <m:t>×</m:t>
+        </m:r>
+        <m:r>
+          <m:t>2</m:t>
+        </m:r>
+      </m:oMath>
+      <w:r>
+        <w:t xml:space="preserve"> </w:t>
+      </w:r>
+      <w:r>
+        <w:t xml:space="preserve">block of Section 5.8, with their corner thickness parameters unchanged. Each layer holds two uncut cells and two cut cells with retained volume fractions 0.616 and 0.252. All lattices are clamped on the face</w:t>
+      </w:r>
+      <w:r>
+        <w:t xml:space="preserve"> </w:t>
+      </w:r>
+      <m:oMath>
+        <m:r>
+          <m:t>y</m:t>
         </m:r>
         <m:r>
           <m:rPr>
             <m:sty m:val="p"/>
           </m:rPr>
-          <m:t>∥</m:t>
-        </m:r>
-        <m:r>
-          <m:t>f</m:t>
+          <m:t>=</m:t>
         </m:r>
         <m:r>
           <m:rPr>
             <m:sty m:val="p"/>
           </m:rPr>
-          <m:t>∥</m:t>
+          <m:t>min</m:t>
         </m:r>
       </m:oMath>
       <w:r>
         <w:t xml:space="preserve"> </w:t>
       </w:r>
       <w:r>
-        <w:t xml:space="preserve">are recomputed with the unscaled matrix.</w:t>
+        <w:t xml:space="preserve">and loaded on the face</w:t>
+      </w:r>
+      <w:r>
+        <w:t xml:space="preserve"> </w:t>
+      </w:r>
+      <m:oMath>
+        <m:r>
+          <m:t>y</m:t>
+        </m:r>
+        <m:r>
+          <m:rPr>
+            <m:sty m:val="p"/>
+          </m:rPr>
+          <m:t>=</m:t>
+        </m:r>
+        <m:r>
+          <m:rPr>
+            <m:sty m:val="p"/>
+          </m:rPr>
+          <m:t>max</m:t>
+        </m:r>
+      </m:oMath>
+      <w:r>
+        <w:t xml:space="preserve"> </w:t>
+      </w:r>
+      <w:r>
+        <w:t xml:space="preserve">by unit traction loads along the three Cartesian axes. Routes (a) and (b) also solve three random loads.</w:t>
       </w:r>
     </w:p>
     <w:p>
@@ -23588,7 +23520,66 @@
         <w:pStyle w:val="BodyText"/>
       </w:pPr>
       <w:r>
-        <w:t xml:space="preserve">Route (b), conventional exact condensation, processes the cells one at a time on the CPU with 16 threads: cell setup and assembly as in route (a), then the dense condensed matrix of the cell on its retained degrees of freedom by PARDISO's Cholesky factorisation with the Schur-complement option (iparm(36)), after which the cell is released. The condensed lattice system is solved exactly by a block Cholesky factorisation in substructuring order: for each cell, its private retained block is factorised and eliminated with dense kernels, the dense interface matrix over the retained DOFs shared by several cells is factorised and solved, and the private DOFs are recovered by back-substitution. The condensed cell matrices are held until their elimination.</w:t>
+        <w:t xml:space="preserve">Route (a), the whole-lattice direct solution, assembles the full cut-cell stiffness of every cell, on its retained and interior degrees of freedom, into one global matrix. The retained degrees of freedom are numbered and coupled exactly as in the learned lattice, with the same clamp, free set and load vectors. The interior degrees of freedom of each cell follow the free retained ones. The matrix is scaled symmetrically by its diagonal and factorised by MKL PARDISO 2026.1 on the CPU. The factorisation is a symmetric positive definite Cholesky factorisation of the upper triangle (mtype 2), with nested-dissection ordering (iparm(2) = 3) and 16 threads. The PARDISO phases are called directly with explicitly set parameters, and all six loads are solved at once. Relative residuals</w:t>
+      </w:r>
+      <w:r>
+        <w:t xml:space="preserve"> </w:t>
+      </w:r>
+      <m:oMath>
+        <m:r>
+          <m:rPr>
+            <m:sty m:val="p"/>
+          </m:rPr>
+          <m:t>∥</m:t>
+        </m:r>
+        <m:r>
+          <m:t>K</m:t>
+        </m:r>
+        <m:r>
+          <m:t>u</m:t>
+        </m:r>
+        <m:r>
+          <m:rPr>
+            <m:sty m:val="p"/>
+          </m:rPr>
+          <m:t>−</m:t>
+        </m:r>
+        <m:r>
+          <m:t>f</m:t>
+        </m:r>
+        <m:r>
+          <m:rPr>
+            <m:sty m:val="p"/>
+          </m:rPr>
+          <m:t>∥</m:t>
+        </m:r>
+        <m:r>
+          <m:rPr>
+            <m:sty m:val="p"/>
+          </m:rPr>
+          <m:t>/</m:t>
+        </m:r>
+        <m:r>
+          <m:rPr>
+            <m:sty m:val="p"/>
+          </m:rPr>
+          <m:t>∥</m:t>
+        </m:r>
+        <m:r>
+          <m:t>f</m:t>
+        </m:r>
+        <m:r>
+          <m:rPr>
+            <m:sty m:val="p"/>
+          </m:rPr>
+          <m:t>∥</m:t>
+        </m:r>
+      </m:oMath>
+      <w:r>
+        <w:t xml:space="preserve"> </w:t>
+      </w:r>
+      <w:r>
+        <w:t xml:space="preserve">are recomputed with the unscaled matrix.</w:t>
       </w:r>
     </w:p>
     <w:p>
@@ -23596,7 +23587,15 @@
         <w:pStyle w:val="BodyText"/>
       </w:pPr>
       <w:r>
-        <w:t xml:space="preserve">Route (c) runs one lattice analysis with sensitivities in the deployed implementation with NICE on the GPU: cell preparation (cell construction, stiffness and moment assembly, network input and encoding, and a first application that prepares the correction), assembly of the lattice and of</w:t>
+        <w:t xml:space="preserve">Route (b), conventional exact condensation, processes the cells one at a time on the CPU with 16 threads. Cell setup and assembly are as in route (a). PARDISO's Cholesky factorisation with the Schur-complement option (iparm(36)) then gives the dense condensed matrix of the cell on its retained degrees of freedom, after which the cell is released. The condensed lattice system is solved exactly by a block Cholesky factorisation in substructuring order. For each cell, its private retained block is factorised and eliminated with dense kernels. The dense interface matrix over the retained DOFs shared by several cells is then factorised and solved, and the private DOFs are recovered by back-substitution. The condensed cell matrices are held until their elimination.</w:t>
+      </w:r>
+    </w:p>
+    <w:p>
+      <w:pPr>
+        <w:pStyle w:val="BodyText"/>
+      </w:pPr>
+      <w:r>
+        <w:t xml:space="preserve">Route (c) runs one lattice analysis with sensitivities in the deployed implementation of NICE on the GPU. Cell preparation comprises cell construction, stiffness and moment assembly, network input and encoding, and a first application that prepares the correction. The lattice and</w:t>
       </w:r>
       <w:r>
         <w:t xml:space="preserve"> </w:t>
@@ -23623,7 +23622,10 @@
         </m:sSub>
       </m:oMath>
       <w:r>
-        <w:t xml:space="preserve">, preconditioner setup (the balanced two-level action of Supplementary Note S4.1), conjugate gradients for the three consistent loads to a recursive relative residual of</w:t>
+        <w:t xml:space="preserve"> </w:t>
+      </w:r>
+      <w:r>
+        <w:t xml:space="preserve">are then assembled, and the preconditioner is set up (the balanced two-level action of Supplementary Note S4.1). Conjugate gradients solve the three traction loads to a recursive relative residual of</w:t>
       </w:r>
       <w:r>
         <w:t xml:space="preserve"> </w:t>
@@ -23649,10 +23651,7 @@
         </m:sSup>
       </m:oMath>
       <w:r>
-        <w:t xml:space="preserve"> </w:t>
-      </w:r>
-      <w:r>
-        <w:t xml:space="preserve">(reached at</w:t>
+        <w:t xml:space="preserve">; the residuals reached are</w:t>
       </w:r>
       <w:r>
         <w:t xml:space="preserve"> </w:t>
@@ -23725,7 +23724,7 @@
         </m:sSup>
       </m:oMath>
       <w:r>
-        <w:t xml:space="preserve">), and the field-based sensitivities</w:t>
+        <w:t xml:space="preserve">. Finally, the sensitivities</w:t>
       </w:r>
       <w:r>
         <w:t xml:space="preserve"> </w:t>
@@ -23755,7 +23754,7 @@
         <w:t xml:space="preserve"> </w:t>
       </w:r>
       <w:r>
-        <w:t xml:space="preserve">of Eq. (9) for the three loads, obtained by reverse-mode differentiation of the moment integrals at the fixed recovered fields. Its arithmetic is that of the timed route of Table 1: the network and the correction's smoothing and coarse solve in single precision, the stiffness products of the condensed action in double precision (Appendix F.2). The three routes read the same generated cell geometries; geometry generation is not timed.</w:t>
+        <w:t xml:space="preserve">of Eq. (17) for the three loads are obtained by reverse-mode differentiation of the moment integrals at the fixed recovered displacement fields. Route (c) uses the arithmetic of the timed route of Table 1. The network and the smoothing and coarse solve of the correction run in single precision, and the stiffness products of the condensed action in double precision (Appendix F.2). The three routes read the same generated cell geometries; geometry generation is not timed.</w:t>
       </w:r>
     </w:p>
     <w:p>
@@ -23763,7 +23762,7 @@
         <w:pStyle w:val="BodyText"/>
       </w:pPr>
       <w:r>
-        <w:t xml:space="preserve">Whole-lattice iterative solvers (Table ST12e) use the global matrix, load vectors, clamp and numbering of route (a), exported once and solved with PETSc 3.26</w:t>
+        <w:t xml:space="preserve">Whole-lattice iterative solvers (Table ST12e) use the global matrix, load vectors, clamp and numbering of route (a). These are exported once and solved with PETSc 3.26</w:t>
       </w:r>
       <w:r>
         <w:t xml:space="preserve"> </w:t>
@@ -23780,7 +23779,7 @@
         <w:t xml:space="preserve"> </w:t>
       </w:r>
       <w:r>
-        <w:t xml:space="preserve">on the CPU of routes (a) and (b) with 16 MPI processes. Conjugate gradients run on the unscaled system and stop on the unpreconditioned relative residual</w:t>
+        <w:t xml:space="preserve">with 16 MPI processes on the CPU used for routes (a) and (b). Conjugate gradients run on the unscaled system and stop on the unpreconditioned relative residual</w:t>
       </w:r>
       <w:r>
         <w:t xml:space="preserve"> </w:t>
@@ -23860,7 +23859,7 @@
         </m:sSup>
       </m:oMath>
       <w:r>
-        <w:t xml:space="preserve">; the iterate is recorded where the residual first falls below</w:t>
+        <w:t xml:space="preserve">. The iterate is recorded where the residual first falls below</w:t>
       </w:r>
       <w:r>
         <w:t xml:space="preserve"> </w:t>
@@ -23922,7 +23921,7 @@
         </m:r>
       </m:oMath>
       <w:r>
-        <w:t xml:space="preserve">, with its compliance and energy-norm difference from the final iterate. GAMG (smoothed aggregation, PETSc defaults) uses block size 3 and the six rigid-body modes of the DOF positions as near-null space; BoomerAMG uses HMIS coarsening, extended+i interpolation, nodal coarsening, strong threshold 0.5 and its default relaxation. For BDDC with exact local solvers and one subdomain per cell, the Dirichlet matrix of a cell is its stiffness on the DOFs it shares with no other cell and its Neumann matrix the whole cell stiffness on its free DOFs. Each is factorised once, cell after cell, with the PARDISO configuration of route (a) (symmetric Jacobi scaling, real SPD Cholesky, tuned iparm, 16 threads); the singular Neumann matrices of floating cells are shifted by</w:t>
+        <w:t xml:space="preserve">, together with its compliance and energy-norm difference from the final iterate. GAMG (smoothed aggregation, PETSc defaults) uses block size 3 and the six rigid-body modes of the DOF positions as near-null space. BoomerAMG uses HMIS coarsening, extended+i interpolation, nodal coarsening, strong threshold 0.5 and its default relaxation. The BDDC configuration considered has exact local solvers and one subdomain per cell. The Dirichlet matrix of a cell is its stiffness on the DOFs it shares with no other cell, and its Neumann matrix is the whole cell stiffness on its free DOFs. Each is factorised once, cell after cell, with the PARDISO configuration of route (a) (symmetric Jacobi scaling, real SPD Cholesky, tuned iparm, 16 threads). The singular Neumann matrices of floating cells are shifted by</w:t>
       </w:r>
       <w:r>
         <w:t xml:space="preserve"> </w:t>
@@ -23951,7 +23950,7 @@
         <w:t xml:space="preserve"> </w:t>
       </w:r>
       <w:r>
-        <w:t xml:space="preserve">on the diagonal of the scaled matrix. The sum of these factorisations is a reference for the local factorisation cost of BDDC with exact local solvers in this configuration; the treatment of the primal constraints and the null space in the local Neumann problems, the coarse problem and the iterations are not included. With MUMPS for the local and coarse problems on eight processes, BDDC with all local factors resident exceeded 90 GiB during its setup.</w:t>
+        <w:t xml:space="preserve">on the diagonal of the scaled matrix. The sum of these factorisations is a reference for the local factorisation cost of BDDC with exact local solvers in this configuration. It does not include the treatment of the primal constraints and the null space in the local Neumann problems, the coarse problem or the iterations. With MUMPS for the local and coarse problems on eight processes, BDDC with all local factors resident exceeded 90 GiB during its setup.</w:t>
       </w:r>
     </w:p>
     <w:p>
@@ -23987,7 +23986,7 @@
         <w:t xml:space="preserve"> </w:t>
       </w:r>
       <w:r>
-        <w:t xml:space="preserve">bytes): PARDISO memory is its permanent plus factorisation storage (iparm(16) + iparm(17)) reported by the analysis phase, with kilobytes taken as 1024 bytes. Totals, iteration counts, peak process memory and the memory of route (c) are given in Table 6.</w:t>
+        <w:t xml:space="preserve">bytes). PARDISO memory is its permanent plus factorisation storage (iparm(16) + iparm(17)) reported by the analysis phase, with kilobytes taken as 1024 bytes. Totals, iteration counts, peak process memory and the memory of route (c) are given in Table 5.</w:t>
       </w:r>
     </w:p>
     <w:p>
@@ -24043,7 +24042,7 @@
               <w:pStyle w:val="Compact"/>
             </w:pPr>
             <w:r>
-              <w:t xml:space="preserve">Cut-band DOFs off the box faces (share of free retained)</w:t>
+              <w:t xml:space="preserve">Cut-plane-element DOFs off the cell faces (fraction of free retained DOFs)</w:t>
             </w:r>
           </w:p>
         </w:tc>
@@ -24194,7 +24193,7 @@
         <w:pStyle w:val="BodyText"/>
       </w:pPr>
       <w:r>
-        <w:t xml:space="preserve">Total and free retained DOFs: Table 6.</w:t>
+        <w:t xml:space="preserve">Total and free retained DOFs: Table 5.</w:t>
       </w:r>
     </w:p>
     <w:p>
@@ -25250,7 +25249,7 @@
         <w:pStyle w:val="BodyText"/>
       </w:pPr>
       <w:r>
-        <w:t xml:space="preserve">Total: sum of the phases; the 16-thread totals are those of Table 6. With 32 threads, the whole direct solution takes 378.5, 341.1, 823.4 and 955.5 s instead of 484.4, 349.2, 867.8 and 1,041.6 s, because cell setup and assembly do not speed up.</w:t>
+        <w:t xml:space="preserve">Total: sum of the phases; the 16-thread totals are those of Table 5. With 32 threads, the whole direct solution takes 378.5, 341.1, 823.4 and 955.5 s instead of 484.4, 349.2, 867.8 and 1,041.6 s, because cell setup and assembly do not speed up.</w:t>
       </w:r>
     </w:p>
     <w:p>
@@ -25625,7 +25624,7 @@
         <w:pStyle w:val="BodyText"/>
       </w:pPr>
       <w:r>
-        <w:t xml:space="preserve">Condensed solve: private elimination, interface factorisation and solution, and back-substitution for the six loads. The total of Table 6 also includes the per-cell lattice geometry, the matrix scaling and data movement between phases (17 to 35 s). Compliance vs. (a): largest relative difference over the six loads from the whole-lattice direct solution.</w:t>
+        <w:t xml:space="preserve">Condensed solve: private elimination, interface factorisation and solution, and back-substitution for the six loads. The total of Table 5 also includes the per-cell lattice geometry, the matrix scaling and data movement between phases (17 to 35 s). Compliance vs. (a): largest relative difference over the six loads from the whole-lattice direct solution.</w:t>
       </w:r>
     </w:p>
     <w:p>
@@ -26030,7 +26029,7 @@
         <w:pStyle w:val="BodyText"/>
       </w:pPr>
       <w:r>
-        <w:t xml:space="preserve">Total, iterations and memory: Table 6; the phases sum to 0.2–0.5 s less than the totals, the remainder being bookkeeping between phases (GPU memory: peak allocated by the process; CPU memory: resident set size after cell preparation). Learned substructures resident on the GPU (Supplementary Note S4.1): all cells of the four-cell lattices and four cells of each eight-cell lattice.</w:t>
+        <w:t xml:space="preserve">Total, iterations and memory: Table 5. The phases sum to 0.2–0.5 s less than the totals; the remainder is bookkeeping between phases. GPU memory is the peak allocated by the process; CPU memory is the resident set size after cell preparation. Learned substructures resident on the GPU (Supplementary Note S4.1): all cells of the four-cell lattices and four cells of each eight-cell lattice.</w:t>
       </w:r>
     </w:p>
     <w:p>
@@ -26410,7 +26409,7 @@
         <w:pStyle w:val="BodyText"/>
       </w:pPr>
       <w:r>
-        <w:t xml:space="preserve">Differences relative to the iterate at a relative residual of</w:t>
+        <w:t xml:space="preserve">Differences are relative to the iterate at a relative residual of</w:t>
       </w:r>
       <w:r>
         <w:t xml:space="preserve"> </w:t>
@@ -26436,7 +26435,7 @@
         </m:sSup>
       </m:oMath>
       <w:r>
-        <w:t xml:space="preserve">, reached in 235–274 (2×2×2) and 204–220 (3×3×1) GAMG iterations. Loads: three consistent tractions, then three random loads, as in route (a). Cell setup and assembly and the global assembly and scaling, taken from route (a) and common to all fine-scale routes, are not included (Table ST12b: 416 and 474 s).</w:t>
+        <w:t xml:space="preserve">, which GAMG reaches in 235–274 (2×2×2) and 204–220 (3×3×1) iterations. Loads: three traction loads, then three random loads, as in route (a). Cell setup and assembly and the global assembly and scaling are taken from route (a) and are common to all fine-scale routes. They are not included (Table ST12b: 416 and 474 s).</w:t>
       </w:r>
     </w:p>
     <w:p>
@@ -26452,7 +26451,7 @@
         <w:pStyle w:val="FirstParagraph"/>
       </w:pPr>
       <w:r>
-        <w:t xml:space="preserve">Four deployment cells, two cut and two uncut (Supplementary Section R1). Cell preparation: geometry preprocessing plus cell setup, moment integration and stiffness assembly, on the GPU for NICE and on the CPU for the conventional route. Condensation: network encoding plus correction setup (smoothing interval and coarse factorisation) for NICE; symbolic analysis and Cholesky factorisation of the interior by MKL PARDISO (16 threads) for the conventional route. Memory, in GiB: GPU memory held by NICE's network state and correction, or PARDISO's factorisation storage (iparm(17)); neither includes the cell stiffness</w:t>
+        <w:t xml:space="preserve">Four deployment cells, two cut and two uncut (Supplementary Section R1). Cell preparation: geometry preprocessing plus cell setup, moment integration and stiffness assembly, on the GPU for NICE and on the CPU for the conventional route. Condensation: network encoding plus correction setup (smoothing interval and coarse factorisation) for NICE; symbolic analysis and Cholesky factorisation of the interior by MKL PARDISO (16 threads) for the conventional route. Memory, in GiB: GPU memory held by NICE's network state and correction, or PARDISO's factorisation storage (iparm(17)). Neither includes the cell stiffness</w:t>
       </w:r>
       <w:r>
         <w:t xml:space="preserve"> </w:t>
@@ -27404,7 +27403,7 @@
         <w:t xml:space="preserve"> </w:t>
       </w:r>
       <w:r>
-        <w:t xml:space="preserve">used to correct local extensions. The exact and learned lattice solves of Section 5.8, the learned route (c) of Section 5.9 and the learned solves of Section 5.10 use this balanced action with the stiffness-block fine action and this coarse basis.</w:t>
+        <w:t xml:space="preserve">used to correct the network's interior displacements in each cell. The exact and learned lattice solves of Section 5.8, the learned route (c) of Section 5.9 and the learned solves of Section 5.10 use this balanced action with the stiffness-block fine action and this coarse basis.</w:t>
       </w:r>
     </w:p>
     <w:p>
@@ -27506,7 +27505,7 @@
         <w:t xml:space="preserve"> </w:t>
       </w:r>
       <w:r>
-        <w:t xml:space="preserve">times the largest are retained, and the corresponding normalised columns</w:t>
+        <w:t xml:space="preserve">times the largest are kept, and the corresponding normalised columns</w:t>
       </w:r>
       <w:r>
         <w:t xml:space="preserve"> </w:t>
@@ -27668,7 +27667,7 @@
         <w:pStyle w:val="FirstParagraph"/>
       </w:pPr>
       <w:r>
-        <w:t xml:space="preserve">In both configurations of Figure 9, the six face loads are the three Cartesian traction directions applied to the target face and the same three directions applied to the neighbour face. The consistent-load implementation integrates the Q2 surface shape functions, normalises each nodal load to unit resultant before support elimination, and then eliminates clamped entries. Three similarly normalised consistent tractions on the target cut surface are reported separately when present. The neighbour is an uncut cell; where the target's cut plane meets the shared face, the pair is therefore a test configuration rather than a physically cut specimen.</w:t>
+        <w:t xml:space="preserve">In both configurations of Figure 9, the six face loads are traction loads along the three Cartesian axes on the loaded face of the test cell and the same three loads on the loaded face of the neighbouring cell. The traction loads are obtained by integrating the Q2 surface shape functions. Each nodal load vector is normalised to unit resultant before support elimination, and clamped entries are then eliminated. Three traction loads on the cut surface of the test cell, normalised in the same way, are reported separately when present. The neighbouring cell is uncut. Where the cut plane of the test cell meets the shared face, the pair is therefore a test configuration and not a physically cut specimen.</w:t>
       </w:r>
     </w:p>
     <w:p>
@@ -27713,7 +27712,7 @@
         <w:pStyle w:val="Heading3"/>
       </w:pPr>
       <w:r>
-        <w:t xml:space="preserve">S4.3. Residual work, gradient checks and difference quotients of the surrogate compliance</w:t>
+        <w:t xml:space="preserve">S4.3. Residual work, gradient checks and difference quotients of the approximate compliance</w:t>
       </w:r>
     </w:p>
     <w:p>
@@ -27721,7 +27720,7 @@
         <w:pStyle w:val="FirstParagraph"/>
       </w:pPr>
       <w:r>
-        <w:t xml:space="preserve">For the lattices of Section 5.8 and their two</w:t>
+        <w:t xml:space="preserve">The lattices of Section 5.8 and their two</w:t>
       </w:r>
       <w:r>
         <w:t xml:space="preserve"> </w:t>
@@ -27753,7 +27752,7 @@
         <w:t xml:space="preserve"> </w:t>
       </w:r>
       <w:r>
-        <w:t xml:space="preserve">layers, solved with NICE in double-precision correction arithmetic to a recursive residual of</w:t>
+        <w:t xml:space="preserve">layers are solved with NICE to a recursive residual of</w:t>
       </w:r>
       <w:r>
         <w:t xml:space="preserve"> </w:t>
@@ -27779,7 +27778,7 @@
         </m:sSup>
       </m:oMath>
       <w:r>
-        <w:t xml:space="preserve">, the following are recorded at the final iterate</w:t>
+        <w:t xml:space="preserve">, with the correction in double precision. Three quantities are recorded at the final iterate</w:t>
       </w:r>
       <w:r>
         <w:t xml:space="preserve"> </w:t>
@@ -27797,7 +27796,7 @@
         </m:acc>
       </m:oMath>
       <w:r>
-        <w:t xml:space="preserve">: the signed residual work</w:t>
+        <w:t xml:space="preserve">. The first is the signed residual work</w:t>
       </w:r>
       <w:r>
         <w:t xml:space="preserve"> </w:t>
@@ -27827,10 +27826,7 @@
         </m:r>
       </m:oMath>
       <w:r>
-        <w:t xml:space="preserve"> </w:t>
-      </w:r>
-      <w:r>
-        <w:t xml:space="preserve">with</w:t>
+        <w:t xml:space="preserve">, with</w:t>
       </w:r>
       <w:r>
         <w:t xml:space="preserve"> </w:t>
@@ -27907,7 +27903,7 @@
         <w:t xml:space="preserve"> </w:t>
       </w:r>
       <w:r>
-        <w:t xml:space="preserve">the applied learned action; the action–energy inconsistency</w:t>
+        <w:t xml:space="preserve">the applied learned action. The second is the action–energy inconsistency</w:t>
       </w:r>
       <w:r>
         <w:t xml:space="preserve"> </w:t>
@@ -28110,7 +28106,7 @@
         </m:sSub>
       </m:oMath>
       <w:r>
-        <w:t xml:space="preserve">, with</w:t>
+        <w:t xml:space="preserve">. Here</w:t>
       </w:r>
       <w:r>
         <w:t xml:space="preserve"> </w:t>
@@ -28255,7 +28251,7 @@
         <w:t xml:space="preserve"> </w:t>
       </w:r>
       <w:r>
-        <w:t xml:space="preserve">the applied action of cell</w:t>
+        <w:t xml:space="preserve">is the applied action of cell</w:t>
       </w:r>
       <w:r>
         <w:t xml:space="preserve"> </w:t>
@@ -28402,7 +28398,7 @@
         <w:t xml:space="preserve"> </w:t>
       </w:r>
       <w:r>
-        <w:t xml:space="preserve">is the quantity of Appendix C.2; and the dual-norm bound on</w:t>
+        <w:t xml:space="preserve">is the quantity of Appendix C.2. The third is the dual-norm bound on</w:t>
       </w:r>
       <w:r>
         <w:t xml:space="preserve"> </w:t>
@@ -28666,7 +28662,7 @@
         <w:t xml:space="preserve"> </w:t>
       </w:r>
       <w:r>
-        <w:t xml:space="preserve">(layer). Running the correction in single instead of double precision changes this residual of the block by less than 1%, the compliance errors of the block by less than</w:t>
+        <w:t xml:space="preserve">(layer). Running the correction in single instead of double precision changes this residual of the block by less than 1%. It changes the compliance errors of the block by less than</w:t>
       </w:r>
       <w:r>
         <w:t xml:space="preserve"> </w:t>
@@ -28773,7 +28769,7 @@
         <w:pStyle w:val="BodyText"/>
       </w:pPr>
       <w:r>
-        <w:t xml:space="preserve">The gradient metrics compare the field-based sensitivities with the exact ones after aggregation over the shared lattice vertices (the sum of the cells' thickness sensitivity components at each vertex), which is the gradient an optimiser with shared thickness variables receives; loads are held fixed. For the complete derivative of the surrogate compliance, every cell's condensed stiffness was rebuilt at</w:t>
+        <w:t xml:space="preserve">The gradient metrics compare the sensitivities from NICE with the exact ones after aggregation over the shared lattice vertices, that is, after summing the cells' thickness sensitivity components at each vertex. The aggregated vector is the gradient that an optimiser with shared thickness variables receives; loads are held fixed. For the complete derivative of the approximate compliance, every cell's condensed stiffness was rebuilt at</w:t>
       </w:r>
       <w:r>
         <w:t xml:space="preserve"> </w:t>
@@ -28820,7 +28816,7 @@
         <w:t xml:space="preserve"> </w:t>
       </w:r>
       <w:r>
-        <w:t xml:space="preserve">for each corner and applied to the solved retained displacements at fixed</w:t>
+        <w:t xml:space="preserve">for each corner. The rebuilt stiffness was applied to the solved retained displacements at fixed</w:t>
       </w:r>
       <w:r>
         <w:t xml:space="preserve"> </w:t>
@@ -28838,10 +28834,7 @@
         </m:acc>
       </m:oMath>
       <w:r>
-        <w:t xml:space="preserve"> </w:t>
-      </w:r>
-      <w:r>
-        <w:t xml:space="preserve">(the action-energy difference quotient</w:t>
+        <w:t xml:space="preserve">, which gives the action-energy difference quotient</w:t>
       </w:r>
       <w:r>
         <w:t xml:space="preserve"> </w:t>
@@ -28876,7 +28869,7 @@
         </m:sSub>
       </m:oMath>
       <w:r>
-        <w:t xml:space="preserve">). A rebuild counts as switched when it changes a binary node indicator, the set of weak-region element or face stencils (stencils containing a weakly supported node, Appendix G.1), the active element set or the diagonal shift of the coarse factorisation (Appendix F.1) relative to the unperturbed build.</w:t>
+        <w:t xml:space="preserve">. A rebuild counts as switched when, relative to the unperturbed build, it changes any of the following: a binary node indicator; the set of weak-region element or face stencils (stencils containing a weakly connected node, Appendix G.1); the active element set; or the diagonal shift of the coarse factorisation (Appendix F.1).</w:t>
       </w:r>
     </w:p>
     <w:p>
@@ -28884,7 +28877,7 @@
         <w:pStyle w:val="Heading4"/>
       </w:pPr>
       <w:r>
-        <w:t xml:space="preserve">Table ST14. Residual work, dual-norm bound, field-based gradient and difference quotients of the surrogate compliance</w:t>
+        <w:t xml:space="preserve">Table ST14. Residual work, dual-norm bound, gradient and difference quotients of the approximate compliance</w:t>
       </w:r>
     </w:p>
     <w:p>
@@ -28892,7 +28885,7 @@
         <w:pStyle w:val="FirstParagraph"/>
       </w:pPr>
       <w:r>
-        <w:t xml:space="preserve">Face = the three consistent face loads; random = the three random loads. Gradient error:</w:t>
+        <w:t xml:space="preserve">Face = the three face traction loads; random = the three random loads. Gradient error:</w:t>
       </w:r>
       <w:r>
         <w:t xml:space="preserve"> </w:t>
@@ -30240,7 +30233,7 @@
         <w:t xml:space="preserve"> </w:t>
       </w:r>
       <w:r>
-        <w:t xml:space="preserve">grows as the step decreases, so the difference quotient does not resolve the complete derivative of the surrogate compliance. On the fourteen two-cell configurations of the selection cells (Section 5.6), the same records give</w:t>
+        <w:t xml:space="preserve">grows as the step decreases, so the difference quotient does not resolve the complete derivative of the approximate compliance. The same records were made on the fourteen two-cell configurations of the selection cells (Section 5.6). They give</w:t>
       </w:r>
       <w:r>
         <w:t xml:space="preserve"> </w:t>
@@ -30424,7 +30417,7 @@
         </m:sSup>
       </m:oMath>
       <w:r>
-        <w:t xml:space="preserve">, field-based thickness sensitivity errors of 0.07–0.67% with cosines of at least 0.999998, and</w:t>
+        <w:t xml:space="preserve">, thickness-sensitivity errors of 0.07–0.67% with cosines of at least 0.999998, and</w:t>
       </w:r>
       <w:r>
         <w:t xml:space="preserve"> </w:t>
@@ -30508,7 +30501,7 @@
         <w:pStyle w:val="BodyText"/>
       </w:pPr>
       <w:r>
-        <w:t xml:space="preserve">The accuracy of the two eight-cell lattices in these runs, reported in Section 5.8, is, for the</w:t>
+        <w:t xml:space="preserve">The accuracy of the two eight-cell lattices in these runs is reported in Section 5.8. The values below are given for the</w:t>
       </w:r>
       <w:r>
         <w:t xml:space="preserve"> </w:t>
@@ -30572,7 +30565,7 @@
         <w:t xml:space="preserve"> </w:t>
       </w:r>
       <w:r>
-        <w:t xml:space="preserve">layer: compliance errors under the three face loads 0.0137, 0.0110 and 0.0094% / 0.0147, 0.0134 and 0.0103%, and at most 0.069% / 0.056% under the random loads; largest thickness-sensitivity error over all cells 0.144% / 0.144% under the face loads and 0.454% / 0.426% under the random loads; relative Euclidean difference between the learned and exact assembled retained solutions over all six loads 0.130% / 0.123%; cell energy errors</w:t>
+        <w:t xml:space="preserve">layer. The compliance errors under the three face loads are 0.0137, 0.0110 and 0.0094% / 0.0147, 0.0134 and 0.0103%, and at most 0.069% / 0.056% under the random loads. The largest thickness-sensitivity error over all cells is 0.144% / 0.144% under the face loads and 0.454% / 0.426% under the random loads. The relative Euclidean difference between the learned and exact assembled retained solutions over all six loads is 0.130% / 0.123%. The cell energy errors</w:t>
       </w:r>
       <w:r>
         <w:t xml:space="preserve"> </w:t>
@@ -30595,7 +30588,7 @@
         <w:t xml:space="preserve"> </w:t>
       </w:r>
       <w:r>
-        <w:t xml:space="preserve">at the exact traces 0.0061–0.026% / 0.0051–0.052% under the face loads and 0.027–0.123% / 0.023–0.077% under the random loads; and excess of</w:t>
+        <w:t xml:space="preserve">at the exact retained displacements are 0.0061–0.026% / 0.0051–0.052% under the face loads and 0.027–0.123% / 0.023–0.077% under the random loads. The excess of</w:t>
       </w:r>
       <w:r>
         <w:t xml:space="preserve"> </w:t>
@@ -30609,7 +30602,7 @@
         <w:t xml:space="preserve"> </w:t>
       </w:r>
       <w:r>
-        <w:t xml:space="preserve">(Eq. (7)) over the lattice compliance error 0.13–0.28% / 0.21–0.33% of that error under the face loads and 4.4–5.1% / 4.2–5.0% under the random loads. The exact references, assembled from the dense exact condensed matrices, reach recomputed relative residuals of</w:t>
+        <w:t xml:space="preserve">(Eq. (15)) over the lattice compliance error is 0.13–0.28% / 0.21–0.33% of that error under the face loads and 4.4–5.1% / 4.2–5.0% under the random loads. The exact references, assembled from the dense exact condensed matrices, reach recomputed relative residuals of</w:t>
       </w:r>
       <w:r>
         <w:t xml:space="preserve"> </w:t>
@@ -30690,7 +30683,7 @@
         <w:pStyle w:val="BodyText"/>
       </w:pPr>
       <w:r>
-        <w:t xml:space="preserve">One-corner sweeps test the smoothness of the surrogate compliance across these switches. In the two-cell configurations M1/x and U1/y, one corner parameter of the target cell, the largest- or the median-sensitivity corner, was varied over up to ±10% of its value, every design with its own regenerated geometry and learned substructure, and the compliance change between neighbouring designs was compared with the change predicted by the trapezoidal rule from the sensitivities at both ends; the same comparison was made for the exact discrete model at every tenth design. Every interval on M1/x and 24 of the 26 intervals on U1/y change at least one discrete choice, most of them the active elements, ghost faces and retained DOFs, which belong to the discrete model itself. There the surrogate compliance departs from the predicted change by up to 0.25% (M1/x), 0.17% and 0.085% (U1/y) of the compliance, and the exact model by the same amount: 0.230, 0.252 and 0.228% against 0.228, 0.249 and 0.225% on M1/x, and identical to three significant digits on U1/y. On the two U1/y intervals without a switch the departure is</w:t>
+        <w:t xml:space="preserve">One-corner sweeps test the smoothness of the approximate compliance across these switches. In the two-cell configurations M1/x and U1/y, one corner parameter of the test cell was varied over up to ±10% of its value; this was the corner with the largest or the median sensitivity. Every design had its own regenerated geometry and learned substructure. The compliance change between neighbouring designs was compared with the change predicted by the trapezoidal rule from the sensitivities at both ends. The same comparison was made for the exact discrete model at every tenth design. Every interval on M1/x and 24 of the 26 intervals on U1/y change at least one discrete choice. Most of these changes concern the active elements, ghost faces and retained DOFs, which belong to the discrete model itself. On these intervals the approximate compliance departs from the predicted change by up to 0.25% (M1/x), 0.17% and 0.085% (U1/y) of the compliance, and the exact model departs by the same amount. On M1/x the departures are 0.230, 0.252 and 0.228% against 0.228, 0.249 and 0.225%; on U1/y they are identical to three significant digits. On the two U1/y intervals without a switch the departure is</w:t>
       </w:r>
       <w:r>
         <w:t xml:space="preserve"> </w:t>
@@ -30725,7 +30718,7 @@
         </m:sSup>
       </m:oMath>
       <w:r>
-        <w:t xml:space="preserve">. At the reference designs the error of the surrogate compliance stays at its bound</w:t>
+        <w:t xml:space="preserve">. At the reference designs the error of the approximate compliance stays at its bound</w:t>
       </w:r>
       <w:r>
         <w:t xml:space="preserve"> </w:t>
@@ -30812,7 +30805,7 @@
         <w:t xml:space="preserve"> </w:t>
       </w:r>
       <w:r>
-        <w:t xml:space="preserve">on U1/y). On the checked intervals the dominant departure of the surrogate objective is therefore also present in the exact discrete model, which an optimiser driven by exact condensation meets in the same way.</w:t>
+        <w:t xml:space="preserve">on U1/y). On the checked intervals the dominant departure of the approximate objective is therefore also present in the exact discrete model, which an optimiser driven by exact condensation meets in the same way.</w:t>
       </w:r>
     </w:p>
     <w:p>
@@ -31298,7 +31291,7 @@
               </m:rad>
             </m:oMath>
             <w:r>
-              <w:t xml:space="preserve">; slot tables:</w:t>
+              <w:t xml:space="preserve">; position-embedding tables:</w:t>
             </w:r>
             <w:r>
               <w:t xml:space="preserve"> </w:t>
@@ -31440,7 +31433,7 @@
               <w:pStyle w:val="Compact"/>
             </w:pPr>
             <w:r>
-              <w:t xml:space="preserve">Element encoder 12,288; node encoder 9,024; message passing 49,664; face encoder 12,608; slot tables 432; element, face and weak-region coefficient heads 12,928, 15,008 and 10,848; restriction/prolongation heads 12,870; convolution-coefficient heads 37,440. Total 173,110</w:t>
+              <w:t xml:space="preserve">Element encoder 12,288; node encoder 9,024; message passing 49,664; face encoder 12,608; position-embedding tables 432; element, face and weak-region coefficient heads 12,928, 15,008 and 10,848; restriction/prolongation heads 12,870; convolution-coefficient heads 37,440. Total 173,110</w:t>
             </w:r>
           </w:p>
         </w:tc>
@@ -31665,7 +31658,7 @@
         </m:r>
       </m:oMath>
       <w:r>
-        <w:t xml:space="preserve">, unit cell), memory in GiB (</w:t>
+        <w:t xml:space="preserve">, unit cell) and memory in GiB (</w:t>
       </w:r>
       <m:oMath>
         <m:sSup>
@@ -31685,7 +31678,7 @@
         <w:t xml:space="preserve"> </w:t>
       </w:r>
       <w:r>
-        <w:t xml:space="preserve">bytes), and times are wall-clock times of complete design iterations, geometry generation included, except at iteration 0, whose geometry was generated beforehand.</w:t>
+        <w:t xml:space="preserve">bytes). Times are wall-clock times of complete design iterations and include geometry generation, except at iteration 0, whose geometry was generated beforehand.</w:t>
       </w:r>
     </w:p>
     <w:p>
@@ -31701,7 +31694,7 @@
         <w:pStyle w:val="FirstParagraph"/>
       </w:pPr>
       <w:r>
-        <w:t xml:space="preserve">Table ST16 lists the settings. The method of moving asymptotes builds one convex separable approximation per analysis from the field-based gradient estimate and never tests the decrease of</w:t>
+        <w:t xml:space="preserve">Table ST16 lists the settings. The method of moving asymptotes builds one convex separable approximation per analysis from the estimated gradient. It never tests the decrease of</w:t>
       </w:r>
       <w:r>
         <w:t xml:space="preserve"> </w:t>
@@ -31722,7 +31715,7 @@
         <w:t xml:space="preserve"> </w:t>
       </w:r>
       <w:r>
-        <w:t xml:space="preserve">along a search direction, where the inconsistency discussed in Section 3.3 would matter. Neither the gradient norm nor a KKT residual is used for stopping, since the estimate is not the gradient of</w:t>
+        <w:t xml:space="preserve">along a search direction, where the inconsistency discussed in Section 4.2 would matter. Neither the gradient norm nor a KKT residual is used for stopping, since the estimate is not the gradient of</w:t>
       </w:r>
       <w:r>
         <w:t xml:space="preserve"> </w:t>
@@ -31764,7 +31757,7 @@
         <w:t xml:space="preserve"> </w:t>
       </w:r>
       <w:r>
-        <w:t xml:space="preserve">changes its discrete model between iterations (S6.4). A design iteration differs from an analysis of Table 6 in that it regenerates every cell's geometry and solves for one load instead of three: for case A, a NICE design iteration takes 74 s on average (Table ST17c) against 79 s for the analysis of the same block in Table 6, which needs no geometry generation but solves for three loads.</w:t>
+        <w:t xml:space="preserve">changes its discrete model between iterations (S6.4). A design iteration differs from an analysis of Table 5 in that it regenerates every cell's geometry and solves for one load instead of three. For case A, a NICE design iteration takes 74 s on average (Table ST17c), against 79 s for the analysis of the same block in Table 5, which needs no geometry generation but solves for three loads.</w:t>
       </w:r>
     </w:p>
     <w:p>
@@ -31953,7 +31946,7 @@
               <w:pStyle w:val="Compact"/>
             </w:pPr>
             <w:r>
-              <w:t xml:space="preserve">The vertices in the plane of the loaded face (9 in case A, 10 in the plate), so that the consistent nodal load does not change with the design (Appendix H: no load-derivative term)</w:t>
+              <w:t xml:space="preserve">The vertices in the plane of the loaded face (9 in case A, 10 in the plate), so that the nodal load obtained by consistent integration of the traction load does not change with the design (Appendix H: no load-derivative term)</w:t>
             </w:r>
           </w:p>
         </w:tc>
@@ -31995,7 +31988,10 @@
               </m:acc>
             </m:oMath>
             <w:r>
-              <w:t xml:space="preserve">, evaluated as the work</w:t>
+              <w:t xml:space="preserve"> </w:t>
+            </w:r>
+            <w:r>
+              <w:t xml:space="preserve">under one face traction load of unit resultant, evaluated as the work</w:t>
             </w:r>
             <w:r>
               <w:t xml:space="preserve"> </w:t>
@@ -32033,7 +32029,7 @@
               <w:t xml:space="preserve"> </w:t>
             </w:r>
             <w:r>
-              <w:t xml:space="preserve">of the final conjugate-gradient iterate, under one consistent face traction of unit resultant, divided by its value at the first iteration</w:t>
+              <w:t xml:space="preserve">of the final conjugate-gradient iterate and divided by its value at the first iteration</w:t>
             </w:r>
           </w:p>
         </w:tc>
@@ -32057,7 +32053,7 @@
               <w:pStyle w:val="Compact"/>
             </w:pPr>
             <w:r>
-              <w:t xml:space="preserve">Field-based estimate of Section 5.10, from one reverse-mode pass through the moment integrals at the fixed recovered field; the complete surrogate derivative of Eq. (10) is not used. Exact twin: exact sensitivities from the exact field with the moment derivatives of Eq. (H.3)</w:t>
+              <w:t xml:space="preserve">Sensitivity estimate of Section 5.10, from one reverse-mode pass through the moment integrals at the fixed recovered displacement field; the complete derivative of the approximate compliance, Eq. (18), is not used. Exact twin: exact sensitivities from the exact displacement field with the moment derivatives of Eq. (H.3)</w:t>
             </w:r>
           </w:p>
         </w:tc>
@@ -32937,7 +32933,7 @@
               <w:t xml:space="preserve"> </w:t>
             </w:r>
             <w:r>
-              <w:t xml:space="preserve">(at most 3,000 iterations), in the arithmetic of the timed route of Table 6, with the coarse-factor pivot rule of Appendix F.1; a run stops if a solve reaches 3,000 iterations or a recomputed relative residual above</w:t>
+              <w:t xml:space="preserve">(at most 3,000 iterations), in the arithmetic of the timed route of Table 5, with the coarse-factor pivot rule of Appendix F.1; a run stops if a solve reaches 3,000 iterations or a recomputed relative residual above</w:t>
             </w:r>
             <w:r>
               <w:t xml:space="preserve"> </w:t>
@@ -33010,7 +33006,7 @@
               <w:pStyle w:val="Compact"/>
             </w:pPr>
             <w:r>
-              <w:t xml:space="preserve">From the previous iteration's solution, matched DOF by DOF on absolute grid position, displacement component and private cut-band flag; unmatched DOFs start at zero; the start is scaled by the energy-optimal factor</w:t>
+              <w:t xml:space="preserve">From the previous iteration's solution, matched DOF by DOF on absolute grid position, displacement component and the private flag of the cut-plane elements; unmatched DOFs start at zero; the start is scaled by the energy-optimal factor</w:t>
             </w:r>
             <w:r>
               <w:t xml:space="preserve"> </w:t>
@@ -33411,7 +33407,7 @@
         <w:pStyle w:val="BodyText"/>
       </w:pPr>
       <w:r>
-        <w:t xml:space="preserve">Over every design analysed on the fine scale (all iterations of the runs of Tables ST17 and ST18 and the homogenisation design), the largest corner span is 0.4500, the largest gradient norm 0.4518 and the corner parameters lie in [0.1800, 0.6900], so every analysed cell lay within the training limits.</w:t>
+        <w:t xml:space="preserve">The designs analysed on the fine scale are all iterations of the runs of Tables ST17 and ST18 and the homogenisation design. Over these designs, the largest corner span is 0.4500, the largest gradient norm 0.4518 and the corner parameters lie in [0.1800, 0.6900], so every analysed cell lay within the training limits.</w:t>
       </w:r>
     </w:p>
     <w:p>
@@ -33459,7 +33455,7 @@
         <w:t xml:space="preserve"> </w:t>
       </w:r>
       <w:r>
-        <w:t xml:space="preserve">block of Section 5.8, loaded by the consistent traction in</w:t>
+        <w:t xml:space="preserve">block of Section 5.8, loaded by a traction load in</w:t>
       </w:r>
       <w:r>
         <w:t xml:space="preserve"> </w:t>
@@ -33499,7 +33495,7 @@
         <w:t xml:space="preserve"> </w:t>
       </w:r>
       <w:r>
-        <w:t xml:space="preserve">opposite the clamp. The exact twin runs the same optimisation from the same start, with the same settings, constraints and geometry regeneration, but with exact condensation (Table ST16). The NICE run was checked with the exact model at iterations 0, 12 and 23 (Table ST17b). The twin is a verification run, not a cost baseline; the cost comparison of the exact and learned routes is that of Section 5.9.</w:t>
+        <w:t xml:space="preserve">opposite the clamp. The exact twin runs the same optimisation from the same start, with the same settings, constraints and geometry regeneration, but with exact condensation (Table ST16). The NICE run was checked with the exact model at iterations 0, 12 and 23 (Table ST17b). The twin serves as a verification run and is not used as a cost baseline; the cost comparison of the exact and learned routes is that of Section 5.9.</w:t>
       </w:r>
     </w:p>
     <w:p>
@@ -34821,7 +34817,7 @@
         <w:t xml:space="preserve"> </w:t>
       </w:r>
       <w:r>
-        <w:t xml:space="preserve">at the same iteration index. The designs coincide (to 4e-14) at iterations 0–4, where every free parameter moves by the move limit or to the lower bound while the volume bound is violated; there the column is the surrogate compliance error of the same design. From iteration 5 the corner parameters differ, by at most 8.8e-04. Largest</w:t>
+        <w:t xml:space="preserve">at the same iteration index. The designs coincide (to 4e-14) at iterations 0–4, where every free parameter moves by the move limit or to the lower bound while the volume bound is violated; there the column is the approximate compliance error of the same design. From iteration 5 the corner parameters differ, by at most 8.8e-04. Largest</w:t>
       </w:r>
       <w:r>
         <w:t xml:space="preserve"> </w:t>
@@ -35922,7 +35918,7 @@
         <w:pStyle w:val="BodyText"/>
       </w:pPr>
       <w:r>
-        <w:t xml:space="preserve">Final designs: exact compliance of the NICE design relative to that of the twin's design −1.25e-05; corner parameters differ by at most 0.0051 (root mean square 0.0011). Iterations and first and last compliances of both runs: Table 7. Mean phases over all iterations; the geometry phase is zero at iteration 0.</w:t>
+        <w:t xml:space="preserve">Final designs: exact compliance of the NICE design relative to that of the twin's design −1.25e-05; corner parameters differ by at most 0.0051 (root mean square 0.0011). Iterations and first and last compliances of both runs: Table 6. Mean phases over all iterations; the geometry phase is zero at iteration 0.</w:t>
       </w:r>
     </w:p>
     <w:p>
@@ -35938,7 +35934,7 @@
         <w:pStyle w:val="FirstParagraph"/>
       </w:pPr>
       <w:r>
-        <w:t xml:space="preserve">The plate of Section 5.10 is cut by a plane that runs from the bottom-right corner to the top edge at two cells from the left end; its eight cut cells have retained volume fractions 0.917, 0.667, 0.333 and 0.083, two each. The layout is stored with its two in-plane axes interchanged, a cube-symmetry image of the plate, so that the cut normal lies at</w:t>
+        <w:t xml:space="preserve">The plate of Section 5.10 is cut by a plane that runs from the bottom-right corner to the top edge at two cells from the left end. Its eight cut cells have retained volume fractions 0.917, 0.667, 0.333 and 0.083, two each. The layout is stored with its two in-plane axes interchanged, a cube-symmetry image of the plate, so that the cut normal lies at</w:t>
       </w:r>
       <w:r>
         <w:t xml:space="preserve"> </w:t>
@@ -36011,7 +36007,7 @@
         <w:t xml:space="preserve"> </w:t>
       </w:r>
       <w:r>
-        <w:t xml:space="preserve">of the validation geometries (Section 5.1), rather than at its image, 56.31°; the network is not equivariant under the cube symmetries (Section 6.3). Apart from the clamped cut band, no DOF is fixed.</w:t>
+        <w:t xml:space="preserve">of the validation geometries (Section 5.1), rather than at its image, 56.31°. The network is not equivariant under the cube symmetries (Section 6.3). Apart from the DOFs of the clamped cut-plane elements, no DOF is fixed.</w:t>
       </w:r>
     </w:p>
     <w:p>
@@ -36088,7 +36084,7 @@
         <w:t xml:space="preserve"> </w:t>
       </w:r>
       <w:r>
-        <w:t xml:space="preserve">with its ghost penalty). Nodes on opposite faces of the cell are identified, the fluctuation is periodic with one node fixed, and six unit macroscopic strains give</w:t>
+        <w:t xml:space="preserve">with its ghost penalty). Nodes on opposite faces of the cell are identified, and the fluctuation is periodic with one node fixed. Six unit macroscopic strains give</w:t>
       </w:r>
       <w:r>
         <w:t xml:space="preserve"> </w:t>
@@ -36157,7 +36153,7 @@
         <w:t xml:space="preserve"> </w:t>
       </w:r>
       <w:r>
-        <w:t xml:space="preserve">for the unit cell; the material volume fraction</w:t>
+        <w:t xml:space="preserve">for the unit cell, and the material volume fraction</w:t>
       </w:r>
       <w:r>
         <w:t xml:space="preserve"> </w:t>
@@ -36442,7 +36438,7 @@
         </m:r>
       </m:oMath>
       <w:r>
-        <w:t xml:space="preserve">; it integrates the elements intersected by the cut with</w:t>
+        <w:t xml:space="preserve">. It integrates the elements intersected by the cut with</w:t>
       </w:r>
       <w:r>
         <w:t xml:space="preserve"> </w:t>
@@ -36667,7 +36663,10 @@
         </m:sSub>
       </m:oMath>
       <w:r>
-        <w:t xml:space="preserve">,</w:t>
+        <w:t xml:space="preserve"> </w:t>
+      </w:r>
+      <w:r>
+        <w:t xml:space="preserve">and</w:t>
       </w:r>
       <w:r>
         <w:t xml:space="preserve"> </w:t>
@@ -36705,7 +36704,7 @@
         </m:r>
       </m:oMath>
       <w:r>
-        <w:t xml:space="preserve">, integrated with a seven-point rule on the triangles of the section polygon of every intersected element. The load is a uniform traction of unit resultant on the loaded face. It was optimised with adjoint sensitivities and the same MMA settings, constraints, fixed vertices and volume fraction.</w:t>
+        <w:t xml:space="preserve">. The penalty is integrated with a seven-point rule on the triangles of the section polygon of every intersected element. The load is a uniform traction of unit resultant on the loaded face. It was optimised with adjoint sensitivities and the same MMA settings, constraints, fixed vertices and volume fraction.</w:t>
       </w:r>
     </w:p>
     <w:p>
@@ -36713,7 +36712,7 @@
         <w:pStyle w:val="BodyText"/>
       </w:pPr>
       <w:r>
-        <w:t xml:space="preserve">In iterations 0–3, while the volume bound is violated, the macroscale and NICE runs move every free parameter by the move limit or to the lower bound and analyse the same designs; the macroscale compliance lies 27.0–31.8% below the NICE compliance there and 29–33% below it along the rest of its path. At the uniform start, refining the macroscale mesh to 12 elements per cell and axis (35,136 elements, 39,949 nodes) raises the macroscale compliance from 55.192 to 56.088 (+1.6%), 25.8% instead of 27.0% below the exact compliance 75.599; raising the penalty factor from</w:t>
+        <w:t xml:space="preserve">In iterations 0–3, while the volume bound is violated, the macroscale and NICE runs move every free parameter by the move limit or to the lower bound and analyse the same designs. There the macroscale compliance lies 27.0–31.8% below the NICE compliance, and along the rest of its path it lies 29–33% below it. At the uniform start, refining the macroscale mesh to 12 elements per cell and axis (35,136 elements, 39,949 nodes) raises the macroscale compliance from 55.192 to 56.088 (+1.6%), 25.8% instead of 27.0% below the exact compliance 75.599. Raising the penalty factor from</w:t>
       </w:r>
       <w:r>
         <w:t xml:space="preserve"> </w:t>
@@ -36847,7 +36846,7 @@
         <w:t xml:space="preserve"> </w:t>
       </w:r>
       <w:r>
-        <w:t xml:space="preserve">(12 elements), relative. The optimisation used the six-element mesh. The fine-scale model fixes every cut-band DOF of the cut cells (Table ST21), a support at least as stiff as one acting on the cut surface alone; it lowers the exact compliance and so narrows the macroscale underestimation rather than widening it. For the graded homogenisation design the macroscale volume model no longer equals the fine-scale material volume exactly (Table ST18c).</w:t>
+        <w:t xml:space="preserve">(12 elements), relative. The optimisation used the six-element mesh. The fine-scale model fixes every DOF of the cut-plane elements of the cut cells (Table ST21). This support is at least as stiff as one acting on the cut surface alone; it lowers the exact compliance and therefore narrows the macroscale underestimation. For the graded homogenisation design, the macroscale volume model no longer equals the fine-scale material volume exactly (Table ST18c).</w:t>
       </w:r>
     </w:p>
     <w:p>
@@ -37414,7 +37413,7 @@
         <w:pStyle w:val="BodyText"/>
       </w:pPr>
       <w:r>
-        <w:t xml:space="preserve">Every fine-scale value is a NICE value; exact checks in Table ST21. Iterations and first and last compliances: Table 7. Figure 15a,b draws the corner parameters in the layer</w:t>
+        <w:t xml:space="preserve">Every fine-scale value is a NICE value; exact checks in Table ST21. Iterations and first and last compliances: Table 6. Figure 15a,b draws the corner parameters in the layer</w:t>
       </w:r>
       <w:r>
         <w:t xml:space="preserve"> </w:t>
@@ -39186,7 +39185,7 @@
         <w:pStyle w:val="FirstParagraph"/>
       </w:pPr>
       <w:r>
-        <w:t xml:space="preserve">Table ST19a lists the four applications of the geometry-generation fallback of Table ST16; a failure means that the geometry generator could not certify the material patches of an element (Appendix A.1). Table ST19b counts the cells whose discrete description changed between consecutive iterations: each iteration evaluates the objective on a different discrete model, and the derivatives of Section 3.3 hold only within each model.</w:t>
+        <w:t xml:space="preserve">Table ST19a lists the four applications of the geometry-generation fallback of Table ST16; a failure means that the geometry generator could not certify the material patches of an element (Appendix A.1). Table ST19b counts the cells whose discrete description changed between consecutive iterations. Each iteration evaluates the objective on a different discrete model, and the derivatives of Section 4.2 hold only within each model.</w:t>
       </w:r>
     </w:p>
     <w:p>
@@ -39775,18 +39774,18 @@
               <w:pStyle w:val="Compact"/>
             </w:pPr>
             <w:r>
-              <w:t xml:space="preserve">Cut-band nodes</w:t>
-            </w:r>
-          </w:p>
-        </w:tc>
-        <w:tc>
-          <w:tcPr/>
-          <w:p>
-            <w:pPr>
-              <w:pStyle w:val="Compact"/>
-            </w:pPr>
-            <w:r>
-              <w:t xml:space="preserve">Weak-support nodes</w:t>
+              <w:t xml:space="preserve">Cut-plane-element nodes</w:t>
+            </w:r>
+          </w:p>
+        </w:tc>
+        <w:tc>
+          <w:tcPr/>
+          <w:p>
+            <w:pPr>
+              <w:pStyle w:val="Compact"/>
+            </w:pPr>
+            <w:r>
+              <w:t xml:space="preserve">Weakly connected nodes</w:t>
             </w:r>
           </w:p>
         </w:tc>
@@ -40043,7 +40042,7 @@
         <w:pStyle w:val="BodyText"/>
       </w:pPr>
       <w:r>
-        <w:t xml:space="preserve">Minimum / median / maximum over the steps between consecutive iterations of the number of cells whose count changed: active elements and ghost-penalty faces (identical counts), retained DOFs, nodes flagged by the network's binary node indicators for cut-band membership and weak support, element and face stencils selected for the weak-region layers (Appendix G.1), and the diagonal shift of the coarse factorisation (Appendix F.1). A change that leaves a count unchanged is not detected, so the numbers are lower bounds. The exact twin (8 cells, 22 steps), which recorded active elements and retained DOFs only, gives 2 / 8 / 8 and 0 / 8 / 8.</w:t>
+        <w:t xml:space="preserve">Minimum / median / maximum, over the steps between consecutive iterations, of the number of cells whose count changed. Counts were taken of active elements and ghost-penalty faces (identical counts), retained DOFs, nodes flagged by the network's binary node indicators as nodes of the cut-plane elements or as weakly connected nodes, element and face stencils selected for the weak-region layers (Appendix G.1), and the diagonal shift of the coarse factorisation (Appendix F.1). A change that leaves a count unchanged is not detected, so the numbers are lower bounds. The exact twin (8 cells, 22 steps), which recorded active elements and retained DOFs only, gives 2 / 8 / 8 and 0 / 8 / 8.</w:t>
       </w:r>
     </w:p>
     <w:p>
@@ -40069,7 +40068,7 @@
         <w:t xml:space="preserve"> </w:t>
       </w:r>
       <w:r>
-        <w:t xml:space="preserve">Plates with the proportions of the plate of S6.3 (short side : long side 1 : 2, one cell thick) and its planar cut scaled with the plate were generated with 24, 51, 88 and 110 cells (Table ST20); all cut cells have the four retained volume fractions of S6.3. They are clamped on the uncut long side and loaded on the opposite face, which after the cut is two cells wide in the 24-cell plate, by a consistent traction of unit resultant in the plane along the long side; the 24-cell plate is the plate of S6.3 with this clamp and load. Each run starts from the uniform</w:t>
+        <w:t xml:space="preserve">Plates were generated with 24, 51, 88 and 110 cells (Table ST20). They have the proportions of the plate of S6.3 (short side : long side 1 : 2, one cell thick), with its planar cut scaled with the plate, and all cut cells have the four retained volume fractions of S6.3. The plates are clamped on the uncut long side and loaded on the opposite face by a traction load of unit resultant, acting in the plane along the long side. After the cut, this face is two cells wide in the 24-cell plate. The 24-cell plate is the plate of S6.3 with this clamp and load. Each run starts from the uniform</w:t>
       </w:r>
       <w:r>
         <w:t xml:space="preserve"> </w:t>
@@ -40896,7 +40895,7 @@
         </m:r>
       </m:oMath>
       <w:r>
-        <w:t xml:space="preserve">, surrogate compliance error</w:t>
+        <w:t xml:space="preserve">, approximate compliance error</w:t>
       </w:r>
       <w:r>
         <w:t xml:space="preserve"> </w:t>
@@ -41033,7 +41032,7 @@
         <w:t xml:space="preserve"> </w:t>
       </w:r>
       <w:r>
-        <w:t xml:space="preserve">for comparison; the intermediate designs were not checked. Exact condensation of the 55 distinct cells with PARDISO's Schur-complement option, verified column-wise against interior solves; assembled solve, with every cut-band DOF of the cut cells fixed, to a recursive relative residual of</w:t>
+        <w:t xml:space="preserve">for comparison; the intermediate designs were not checked. Exact condensation of the 55 distinct cells with PARDISO's Schur-complement option, verified column-wise against interior solves; assembled solve, with every DOF of the cut-plane elements of the cut cells fixed, to a recursive relative residual of</w:t>
       </w:r>
       <w:r>
         <w:t xml:space="preserve"> </w:t>
@@ -41095,7 +41094,7 @@
         </m:r>
       </m:oMath>
       <w:r>
-        <w:t xml:space="preserve">. Gradient: vertex gradient with exact sensitivities (central moment differences, Eq. (H.3)) against the field-based NICE estimate, over the 64 free vertex parameters. Exact solves: 136 / 9.4e-11, 190 / 8.8e-11, 191 / 9.5e-11 conjugate-gradient iterations / recomputed residual, in the order of the rows.</w:t>
+        <w:t xml:space="preserve">. Gradient: vertex gradient with exact sensitivities (central moment differences, Eq. (H.3)) against the NICE sensitivity estimate, over the 64 free vertex parameters. Exact solves: 136 / 9.4e-11, 190 / 8.8e-11, 191 / 9.5e-11 conjugate-gradient iterations / recomputed residual, in the order of the rows.</w:t>
       </w:r>
     </w:p>
     <w:tbl>
@@ -41797,7 +41796,7 @@
         <w:pStyle w:val="FirstParagraph"/>
       </w:pPr>
       <w:r>
-        <w:t xml:space="preserve">The construction of Sections 3 and 4, that is, the condensed energy with the transpose of the complete extension, Propositions 1–4 and the correction</w:t>
+        <w:t xml:space="preserve">The construction of Sections 3 and 4 comprises the condensed energy with the transpose of the complete recovery operator, Propositions 1–4 and the correction</w:t>
       </w:r>
       <w:r>
         <w:t xml:space="preserve"> </w:t>
@@ -41812,7 +41811,7 @@
         </m:r>
       </m:oMath>
       <w:r>
-        <w:t xml:space="preserve">, uses the symmetry and positive semidefiniteness of the cell stiffness and the positive definiteness of its interior block, not the level-set function of Eq. (1). The trained network, in contrast, has seen Schwarz-P cells only (Sections 6.1 and 6.3). This note applies NICE to gyroid sheet cells, first with the network parameters of Table 2 unchanged (zero-shot) and then after a short continuation of training that includes a few gyroid cells. It is not part of the evidence of Section 5.</w:t>
+        <w:t xml:space="preserve">. It uses the symmetry and positive semidefiniteness of the cell stiffness and the positive definiteness of its interior block, and it does not use the level-set function of Eq. (1). The trained network, in contrast, has seen Schwarz-P cells only (Sections 6.1 and 6.3). This note applies NICE to gyroid sheet cells, first with the network parameters of Table 2 unchanged (zero-shot) and then after a short continuation of training that includes a few gyroid cells. It is not part of the evidence of Section 5.</w:t>
       </w:r>
     </w:p>
     <w:p>
@@ -42030,7 +42029,7 @@
         <w:t xml:space="preserve"> </w:t>
       </w:r>
       <w:r>
-        <w:t xml:space="preserve">and keeps the box, the trilinear corner parameters, the optional planar cut and the settings of Table 1 (background mesh</w:t>
+        <w:t xml:space="preserve">and keeps the cell box, the trilinear corner parameters, the optional planar cut and the settings of Table 1 (background mesh</w:t>
       </w:r>
       <w:r>
         <w:t xml:space="preserve"> </w:t>
@@ -42050,7 +42049,7 @@
         </m:r>
       </m:oMath>
       <w:r>
-        <w:t xml:space="preserve">, material, ghost penalty, retained space and correction 8 /</w:t>
+        <w:t xml:space="preserve">, material, ghost penalty, retained DOFs and correction 8 /</w:t>
       </w:r>
       <w:r>
         <w:t xml:space="preserve"> </w:t>
@@ -42088,7 +42087,7 @@
         <w:t xml:space="preserve"> </w:t>
       </w:r>
       <w:r>
-        <w:t xml:space="preserve">/ 8). Every gyroid cell is the twin of one P cell: it keeps the P cell's position, cut plane and stratum (uncut or cut), and its corner parameters are mapped from the P values so that a uniform-thickness cell keeps its sheet volume fraction (for example 23.3% against 23.2% and 5.8% against 6.2% for two twins). The cells are generated by a version of the geometry stage that takes the level-set function as input; with the P function it reproduces the eight cells of the</w:t>
+        <w:t xml:space="preserve">/ 8). Every gyroid cell is the twin of one P cell and keeps the P cell's position, cut plane and cut-severity group (uncut or cut). Its corner parameters are mapped from the P values so that a uniform-thickness cell keeps its sheet volume fraction (for example 23.3% against 23.2% and 5.8% against 6.2% for two twins). The cells are generated by a version of the geometry stage that takes the level-set function as input; with the P function it reproduces the eight cells of the</w:t>
       </w:r>
       <w:r>
         <w:t xml:space="preserve"> </w:t>
@@ -42120,7 +42119,7 @@
         <w:t xml:space="preserve"> </w:t>
       </w:r>
       <w:r>
-        <w:t xml:space="preserve">block of Section 5.8 cell by cell. When a lattice is generated, it keeps the largest face-connected set of active elements of the whole lattice rather than of each cell and removes fragments of less than a quarter of an element that have no ghost-penalty support, repeating both steps until nothing changes; the retained DOFs of neighbouring cells then coincide on their shared faces except along the cell edges (unmatched DOFs are treated as in Section 2.3). The sixteen single cells are the twins of the validation cells fresh_val_2000 to fresh_val_2015 (geometry identifiers gval_000 to gval_1500 in the data archive), which include U1, U2, L1, M1, M2 and H1–H3 of R1 and belong to the 20 checkpoint-selection geometries of Table ST01; the lattice is the twin of the</w:t>
+        <w:t xml:space="preserve">block of Section 5.8 cell by cell. When this version generates a lattice, it keeps the largest face-connected set of active elements of the whole lattice rather than of each cell. It also removes fragments of less than a quarter of an element that have no ghost-penalty support, and it repeats both steps until nothing changes. The retained DOFs of neighbouring cells then coincide on their shared faces except along the cell edges (unmatched DOFs are treated as in Section 2.3). The sixteen single cells are the twins of the validation cells fresh_val_2000 to fresh_val_2015 (geometry identifiers gval_000 to gval_1500 in the data archive). These validation cells include U1, U2, L1, M1, M2 and H1–H3 of R1 and belong to the 20 checkpoint-selection geometries of Table ST01. The lattice is the twin of the</w:t>
       </w:r>
       <w:r>
         <w:t xml:space="preserve"> </w:t>
@@ -42152,7 +42151,7 @@
         <w:t xml:space="preserve"> </w:t>
       </w:r>
       <w:r>
-        <w:t xml:space="preserve">block (glat222). No gyroid cell entered the training or checkpoint selection of any variant of Table 2.</w:t>
+        <w:t xml:space="preserve">block (glat222). No gyroid cell entered the training or checkpoint selection of any variant of Table 2 or of the two variants evaluated only in this supplement.</w:t>
       </w:r>
     </w:p>
     <w:p>
@@ -42160,7 +42159,7 @@
         <w:pStyle w:val="BodyText"/>
       </w:pPr>
       <w:r>
-        <w:t xml:space="preserve">Propositions 1–3 and the properties of Section 4.1 hold for these cells as for the P cells, since assumptions (A1)–(A3) concern the stiffness and the assembly, and the network extension is admissible and reproduces rigid-body motion by construction. Proposition 4 holds under its spectral condition, which, as for the cells of Sections 5.8–5.10, was not checked on the gyroid cells.</w:t>
+        <w:t xml:space="preserve">Propositions 1, 3 and 4 and the properties of Section 3.1 hold for these cells as for the P cells. They hold because assumptions (A1)–(A3) concern the stiffness and the assembly, and because the network's displacement recovery reproduces the retained displacements and rigid-body motion by construction. Proposition 2 holds under its spectral condition, which was not checked on the gyroid cells, as for the cells of Sections 5.8–5.10.</w:t>
       </w:r>
     </w:p>
     <w:p>
@@ -42201,7 +42200,7 @@
         <w:t xml:space="preserve"> </w:t>
       </w:r>
       <w:r>
-        <w:t xml:space="preserve">(record identifier A3G_ft): NICE's parameters continued for 8,000 training steps on 96 P training cells and 18 gyroid twins of P training cells (cells with at most 420,000 DOFs), with the correction 8 /</w:t>
+        <w:t xml:space="preserve">(record identifier A3G_ft): NICE's parameters, trained for a further 8,000 steps. The training set comprises 96 P training cells and 18 gyroid twins of P training cells (cells with at most 420,000 DOFs), and the correction 8 /</w:t>
       </w:r>
       <w:r>
         <w:t xml:space="preserve"> </w:t>
@@ -42239,7 +42238,7 @@
         <w:t xml:space="preserve"> </w:t>
       </w:r>
       <w:r>
-        <w:t xml:space="preserve">/ 8 inside the training loop as in Section 4.5. Its checkpoint was selected on the P validation list only (selection score 0.00339, against 0.00237 for NICE; Table ST01), so the sixteen gyroid twins and the gyroid lattice entered neither its training nor its selection. Both variants apply the correction 8 /</w:t>
+        <w:t xml:space="preserve">/ 8 is inside the training loop as in Section 3.5. Its checkpoint was selected on the P validation list only (selection score 0.00339, against 0.00237 for NICE; Table ST01). The sixteen gyroid twins and the gyroid lattice therefore entered neither its training nor its selection. Both variants apply the correction 8 /</w:t>
       </w:r>
       <w:r>
         <w:t xml:space="preserve"> </w:t>
@@ -42295,7 +42294,7 @@
         <w:t xml:space="preserve"> </w:t>
       </w:r>
       <w:r>
-        <w:t xml:space="preserve">Each gyroid twin was evaluated in the identity orientation with 64 validation directions per loading class (Appendix G.2); the directional energy error of Eq. (5) was averaged over the directions of each cell and then over the sixteen cells with equal weights, as in Section 5.1 (Table ST22). Zero-shot, the mean error under consistent tractions is 4.48% (largest cell 25.6%), 66 times the 0.068% of NICE on the P twins of the same cells. Over the six load and support classes the ratio of the means is 56 to 234; under the imposed polynomial and multiscale displacements it is 14 and 7. The degradation is not confined to a few cells: in every cell, the error under each load and support class is 20 to 1,150 times that of its P twin, and under the imposed displacements 2 to 30 times. Under consistent tractions, the three gyroid cells with the largest errors are the twins of the three P cells with the largest NICE errors among the sixteen (fresh_val_2007, 2012 and 2015). The correction is the same as on the P cells; what does not carry over is the accuracy of the network's initial field, which belongs to the family on which the network was trained.</w:t>
+        <w:t xml:space="preserve">Each gyroid twin was evaluated in the identity orientation with 64 validation test displacements per load class (Appendix G.2). The energy error of Eq. (7) was averaged over the test displacements of each cell and then over the sixteen cells with equal weights, as in Section 5.1 (Table ST22). Zero-shot, the mean error under traction loads is 4.48% (largest cell 25.6%), 66 times the 0.068% of NICE on the P twins of the same cells. Over the six load and support classes the ratio of the means is 56 to 234; under the imposed polynomial and multiscale displacements it is 14 and 7. The degradation is not confined to a few cells. In every cell, the error under each load and support class is 20 to 1,150 times that of its P twin, and under the imposed displacements 2 to 30 times. Under traction loads, the three gyroid cells with the largest errors are the twins of the three P cells with the largest NICE errors among the sixteen (fresh_val_2007, 2012 and 2015). The correction is the same as on the P cells. The accuracy of the network's interior displacements does not carry over, since it is tied to the family on which the network was trained.</w:t>
       </w:r>
     </w:p>
     <w:p>
@@ -42303,7 +42302,7 @@
         <w:pStyle w:val="BodyText"/>
       </w:pPr>
       <w:r>
-        <w:t xml:space="preserve">After the continuation, the means under the six load and support classes fall by factors of 5.8 to 10.2, under consistent tractions from 4.48% to 0.74% and the largest cell mean from 25.6% to 2.67%; under the imposed polynomial and multiscale displacements they fall by factors of 1.6 and 1.2. They remain 6 to 23 times those of NICE on the P twins (11 times under consistent tractions). The reduction is uneven across cells: the twin of H2 (fresh_val_2010) now has the largest errors under nodal forces and consistent tractions, 4.36% and 2.67% against 4.73% and 3.33% zero-shot. On the 80 P validation cells, the class means of the continued network are 1.1 to 1.7 times those of NICE in the same evaluation (0.026–0.072% against 0.015–0.065%).</w:t>
+        <w:t xml:space="preserve">After the continuation, the means under the six load and support classes fall by factors of 5.8 to 10.2. Under traction loads the mean falls from 4.48% to 0.74%, and the largest cell mean from 25.6% to 2.67%. Under the imposed polynomial and multiscale displacements the means fall by factors of 1.6 and 1.2. The means remain 6 to 23 times those of NICE on the P twins (11 times under traction loads). The reduction is uneven across cells: the twin of H2 (fresh_val_2010) now has the largest errors under nodal point loads and traction loads, 4.36% and 2.67% against 4.73% and 3.33% zero-shot. On the 80 P validation cells, the class means of the continued network are 1.1 to 1.7 times those of NICE in the same evaluation (0.026–0.072% against 0.015–0.065%).</w:t>
       </w:r>
     </w:p>
     <w:p>
@@ -42315,7 +42314,7 @@
           <w:b/>
           <w:bCs/>
         </w:rPr>
-        <w:t xml:space="preserve">Table ST22. Directional energy error (%) of the gyroid twins and of the P cells.</w:t>
+        <w:t xml:space="preserve">Table ST22. Energy error (%) of the gyroid twins and of the P cells.</w:t>
       </w:r>
       <w:r>
         <w:t xml:space="preserve"> </w:t>
@@ -42350,7 +42349,7 @@
               <w:pStyle w:val="Compact"/>
             </w:pPr>
             <w:r>
-              <w:t xml:space="preserve">Loading class</w:t>
+              <w:t xml:space="preserve">Load class</w:t>
             </w:r>
           </w:p>
         </w:tc>
@@ -42423,7 +42422,7 @@
               <w:pStyle w:val="Compact"/>
             </w:pPr>
             <w:r>
-              <w:t xml:space="preserve">Consistent tractions (force_c)</w:t>
+              <w:t xml:space="preserve">Traction loads (force_c)</w:t>
             </w:r>
           </w:p>
         </w:tc>
@@ -42524,7 +42523,7 @@
               <w:pStyle w:val="Compact"/>
             </w:pPr>
             <w:r>
-              <w:t xml:space="preserve">Single-face consistent tractions (face_c)</w:t>
+              <w:t xml:space="preserve">Single-face traction loads (face_c)</w:t>
             </w:r>
           </w:p>
         </w:tc>
@@ -42625,7 +42624,7 @@
               <w:pStyle w:val="Compact"/>
             </w:pPr>
             <w:r>
-              <w:t xml:space="preserve">Nodal forces (force)</w:t>
+              <w:t xml:space="preserve">Nodal point loads (force)</w:t>
             </w:r>
           </w:p>
         </w:tc>
@@ -42698,7 +42697,7 @@
               <w:pStyle w:val="Compact"/>
             </w:pPr>
             <w:r>
-              <w:t xml:space="preserve">Single-face nodal forces (face)</w:t>
+              <w:t xml:space="preserve">Single-face nodal point loads (face)</w:t>
             </w:r>
           </w:p>
         </w:tc>
@@ -43143,7 +43142,7 @@
         <w:t xml:space="preserve"> </w:t>
       </w:r>
       <w:r>
-        <w:t xml:space="preserve">15 twins; fresh_val_2010 has no stiffness-scaled spring-support directions.</w:t>
+        <w:t xml:space="preserve">15 twins; fresh_val_2010 has no stiffness-scaled spring-support test displacements.</w:t>
       </w:r>
     </w:p>
     <w:p>
@@ -43193,7 +43192,7 @@
         <w:t xml:space="preserve"> </w:t>
       </w:r>
       <w:r>
-        <w:t xml:space="preserve">block of Section 5.8 (eight cells, four of them cut, every cell learned; 160,629 free retained DOFs against 139,002 for the P block) was solved as in Section 5.8, clamped on one face and loaded by the three face loads and three random loads, with the dense exact condensed matrices as reference (Table ST23). Zero-shot, the lattice compliance errors are 0.98–1.53% under the face loads (2.14% under the random loads), and the largest thickness-sensitivity error over the cells is 13.5% (10.6%), against 0.014% (0.069%) and 0.14% (0.45%) for NICE on the P block. With the continued network they are 0.23% (0.35%) and 1.84% (3.57%), and on the P block 0.019% (0.084%) and 0.25% (0.49%). With exact operators, the gyroid lattice needs 414 conjugate-gradient iterations against 183 for the P block; the learned operators add 20 and 22 iterations.</w:t>
+        <w:t xml:space="preserve">block of Section 5.8 has eight cells, four of them cut, and every cell is learned; it has 160,629 free retained DOFs against 139,002 for the P block. It was solved as in Section 5.8, clamped on one face and loaded by the three face loads and three random loads, with the dense exact condensed matrices as reference (Table ST23). Zero-shot, the lattice compliance errors are 0.98–1.53% under the face loads (2.14% under the random loads), and the largest thickness-sensitivity error over the cells is 13.5% (10.6%), against 0.014% (0.069%) and 0.14% (0.45%) for NICE on the P block. With the continued network they are 0.23% (0.35%) and 1.84% (3.57%), and on the P block 0.019% (0.084%) and 0.25% (0.49%). With exact operators, the gyroid lattice needs 414 conjugate-gradient iterations against 183 for the P block; on the gyroid lattice, the learned operators add 20 (zero-shot) and 22 (continued) iterations.</w:t>
       </w:r>
     </w:p>
     <w:p>
@@ -43783,7 +43782,7 @@
         <w:t xml:space="preserve"> </w:t>
       </w:r>
       <w:r>
-        <w:t xml:space="preserve">The construction carried over unchanged: the energy form, the transpose of the complete extension, the correction and the assembly were applied to the gyroid cells without modification, and the properties that do not depend on the network parameters hold for them as for the P cells. The trained network is specific to its family: zero-shot, the gyroid errors under loads and supports are 56 to 234 times those on the P twins in the mean, and the unchanged correction does not make up the difference. A continuation of 8,000 training steps with eighteen gyroid cells lowers them six- to tenfold, to 6 to 23 times the P level, and brings the gyroid lattice to 0.23% in compliance and 1.84% in sensitivity under the face loads, while its class means on the P validation cells are 1.1 to 1.7 times those of NICE. Whether more gyroid data and training reach the P level was not tested. A new TPMS family therefore needs new training data (Section 6.3), but not a new construction.</w:t>
+        <w:t xml:space="preserve">The construction carried over unchanged: the energy form, the transpose of the complete recovery operator, the correction and the assembly were applied to the gyroid cells without modification. The properties that do not depend on the network parameters hold for them as for the P cells. The trained network is specific to its family: zero-shot, the gyroid errors under loads and supports are 56 to 234 times those on the P twins in the mean, and the unchanged correction does not make up the difference. A continuation of 8,000 training steps with eighteen gyroid cells lowers them six- to tenfold, to 6 to 23 times the P level. It brings the gyroid lattice to 0.23% in compliance and 1.84% in sensitivity under the face loads, while the class means of the continued network on the P validation cells are 1.1 to 1.7 times those of NICE. Whether more gyroid data and training reach the P level was not tested. A new TPMS family therefore needs new training data (Section 6.3); the construction itself needs no change.</w:t>
       </w:r>
     </w:p>
     <w:p>
@@ -43813,7 +43812,7 @@
         <w:t xml:space="preserve">evidence/gcell/</w:t>
       </w:r>
       <w:r>
-        <w:t xml:space="preserve">): gval.json (gyroid twins: P twin, stratum and corner parameters); gval_A3.json and gval_A3G.json (single gyroid cells, NICE zero-shot and continued); newval_A3G.json (80 P validation cells, NICE continued; NICE in the same evaluation:</w:t>
+        <w:t xml:space="preserve">): gval.json (gyroid twins: P twin, cut-severity group and corner parameters); gval_A3.json and gval_A3G.json (single gyroid cells, NICE zero-shot and continued); newval_A3G.json (80 P validation cells, NICE continued; NICE in the same evaluation:</w:t>
       </w:r>
       <w:r>
         <w:t xml:space="preserve"> </w:t>
@@ -43828,6 +43827,641 @@
         <w:t xml:space="preserve">); lat_hetero_g222.json and lat_hetero_g222_A3G.json (gyroid block, NICE zero-shot and continued); lat_hetero222_A3G.json (P block, NICE continued); g_vs_p_222.json (P and gyroid blocks, NICE).</w:t>
       </w:r>
     </w:p>
+    <w:p>
+      <w:pPr>
+        <w:pStyle w:val="Heading2"/>
+      </w:pPr>
+      <w:r>
+        <w:t xml:space="preserve">Supplementary Note S8. Further continuations of the base network</w:t>
+      </w:r>
+    </w:p>
+    <w:p>
+      <w:pPr>
+        <w:pStyle w:val="FirstParagraph"/>
+      </w:pPr>
+      <w:r>
+        <w:t xml:space="preserve">Besides NICE, two further networks continue the training of the base network for 15,000 training steps. The Smoothing-trained variant applies eight smoothing steps without coarse-grid correction in every training step. The Uncorrected continuation is trained without correction. Table ST24 gives their training and evaluation settings in the format of Table 2 of the main text.</w:t>
+      </w:r>
+    </w:p>
+    <w:p>
+      <w:pPr>
+        <w:pStyle w:val="BodyText"/>
+      </w:pPr>
+      <w:r>
+        <w:rPr>
+          <w:b/>
+          <w:bCs/>
+        </w:rPr>
+        <w:t xml:space="preserve">Table ST24. Training and evaluation settings of the two further continuations.</w:t>
+      </w:r>
+      <w:r>
+        <w:t xml:space="preserve"> </w:t>
+      </w:r>
+      <w:r>
+        <w:t xml:space="preserve">Columns as in Table 2 of the main text.</w:t>
+      </w:r>
+    </w:p>
+    <w:tbl>
+      <w:tblPr>
+        <w:tblStyle w:val="Table"/>
+        <w:tblW w:type="pct" w:w="5000"/>
+        <w:tblLayout w:type="fixed"/>
+        <w:tblLook w:firstRow="1" w:lastRow="0" w:firstColumn="0" w:lastColumn="0" w:noHBand="0" w:noVBand="0" w:val="0020"/>
+      </w:tblPr>
+      <w:tblGrid>
+        <w:gridCol w:w="1485"/>
+        <w:gridCol w:w="1485"/>
+        <w:gridCol w:w="1980"/>
+        <w:gridCol w:w="1485"/>
+        <w:gridCol w:w="1485"/>
+      </w:tblGrid>
+      <w:tr>
+        <w:trPr>
+          <w:tblHeader w:val="on"/>
+        </w:trPr>
+        <w:tc>
+          <w:tcPr/>
+          <w:p>
+            <w:pPr>
+              <w:pStyle w:val="Compact"/>
+            </w:pPr>
+            <w:r>
+              <w:t xml:space="preserve">Variant</w:t>
+            </w:r>
+          </w:p>
+        </w:tc>
+        <w:tc>
+          <w:tcPr/>
+          <w:p>
+            <w:pPr>
+              <w:pStyle w:val="Compact"/>
+            </w:pPr>
+            <w:r>
+              <w:t xml:space="preserve">Network parameters</w:t>
+            </w:r>
+          </w:p>
+        </w:tc>
+        <w:tc>
+          <w:tcPr/>
+          <w:p>
+            <w:pPr>
+              <w:pStyle w:val="Compact"/>
+              <w:jc w:val="right"/>
+            </w:pPr>
+            <w:r>
+              <w:t xml:space="preserve">Training set (geometries)</w:t>
+            </w:r>
+          </w:p>
+        </w:tc>
+        <w:tc>
+          <w:tcPr/>
+          <w:p>
+            <w:pPr>
+              <w:pStyle w:val="Compact"/>
+            </w:pPr>
+            <w:r>
+              <w:t xml:space="preserve">Correction in training</w:t>
+            </w:r>
+          </w:p>
+        </w:tc>
+        <w:tc>
+          <w:tcPr/>
+          <w:p>
+            <w:pPr>
+              <w:pStyle w:val="Compact"/>
+            </w:pPr>
+            <w:r>
+              <w:t xml:space="preserve">Correction at evaluation</w:t>
+            </w:r>
+          </w:p>
+        </w:tc>
+      </w:tr>
+      <w:tr>
+        <w:tc>
+          <w:tcPr/>
+          <w:p>
+            <w:pPr>
+              <w:pStyle w:val="Compact"/>
+            </w:pPr>
+            <w:r>
+              <w:t xml:space="preserve">Smoothing-trained</w:t>
+            </w:r>
+          </w:p>
+        </w:tc>
+        <w:tc>
+          <w:tcPr/>
+          <w:p>
+            <w:pPr>
+              <w:pStyle w:val="Compact"/>
+            </w:pPr>
+            <w:r>
+              <w:t xml:space="preserve">Base network continued for 15,000 training steps</w:t>
+            </w:r>
+          </w:p>
+        </w:tc>
+        <w:tc>
+          <w:tcPr/>
+          <w:p>
+            <w:pPr>
+              <w:pStyle w:val="Compact"/>
+              <w:jc w:val="right"/>
+            </w:pPr>
+            <w:r>
+              <w:t xml:space="preserve">591</w:t>
+            </w:r>
+          </w:p>
+        </w:tc>
+        <w:tc>
+          <w:tcPr/>
+          <w:p>
+            <w:pPr>
+              <w:pStyle w:val="Compact"/>
+            </w:pPr>
+            <w:r>
+              <w:t xml:space="preserve">8 smoothing steps</w:t>
+            </w:r>
+          </w:p>
+        </w:tc>
+        <w:tc>
+          <w:tcPr/>
+          <w:p>
+            <w:pPr>
+              <w:pStyle w:val="Compact"/>
+            </w:pPr>
+            <w:r>
+              <w:t xml:space="preserve">8 smoothing steps</w:t>
+            </w:r>
+          </w:p>
+        </w:tc>
+      </w:tr>
+      <w:tr>
+        <w:tc>
+          <w:tcPr/>
+          <w:p>
+            <w:pPr>
+              <w:pStyle w:val="Compact"/>
+            </w:pPr>
+            <w:r>
+              <w:t xml:space="preserve">Uncorrected continuation</w:t>
+            </w:r>
+          </w:p>
+        </w:tc>
+        <w:tc>
+          <w:tcPr/>
+          <w:p>
+            <w:pPr>
+              <w:pStyle w:val="Compact"/>
+            </w:pPr>
+            <w:r>
+              <w:t xml:space="preserve">Base network continued for 15,000 training steps</w:t>
+            </w:r>
+          </w:p>
+        </w:tc>
+        <w:tc>
+          <w:tcPr/>
+          <w:p>
+            <w:pPr>
+              <w:pStyle w:val="Compact"/>
+              <w:jc w:val="right"/>
+            </w:pPr>
+            <w:r>
+              <w:t xml:space="preserve">591</w:t>
+            </w:r>
+          </w:p>
+        </w:tc>
+        <w:tc>
+          <w:tcPr/>
+          <w:p>
+            <w:pPr>
+              <w:pStyle w:val="Compact"/>
+            </w:pPr>
+            <w:r>
+              <w:t xml:space="preserve">None</w:t>
+            </w:r>
+          </w:p>
+        </w:tc>
+        <w:tc>
+          <w:tcPr/>
+          <w:p>
+            <w:pPr>
+              <w:pStyle w:val="Compact"/>
+            </w:pPr>
+            <w:r>
+              <w:t xml:space="preserve">None</w:t>
+            </w:r>
+          </w:p>
+        </w:tc>
+      </w:tr>
+    </w:tbl>
+    <w:p>
+      <w:pPr>
+        <w:pStyle w:val="BodyText"/>
+      </w:pPr>
+      <w:r>
+        <w:t xml:space="preserve">Both continuations use the network architecture of Section 3, with about</w:t>
+      </w:r>
+      <w:r>
+        <w:t xml:space="preserve"> </w:t>
+      </w:r>
+      <m:oMath>
+        <m:r>
+          <m:t>6</m:t>
+        </m:r>
+        <m:r>
+          <m:rPr>
+            <m:sty m:val="p"/>
+          </m:rPr>
+          <m:t>×</m:t>
+        </m:r>
+        <m:sSup>
+          <m:e>
+            <m:r>
+              <m:t>10</m:t>
+            </m:r>
+          </m:e>
+          <m:sup>
+            <m:r>
+              <m:t>5</m:t>
+            </m:r>
+          </m:sup>
+        </m:sSup>
+      </m:oMath>
+      <w:r>
+        <w:t xml:space="preserve"> </w:t>
+      </w:r>
+      <w:r>
+        <w:t xml:space="preserve">trainable parameters (Table ST15). The three continuations, NICE, the Smoothing-trained variant and the Uncorrected continuation, draw from the same set of 591 geometries. This set contains 304 of the 305 training geometries of the base network. The three continuations see the same geometries in the same order, at most 153 of the 591 in their 15,000 training steps (Table ST01).</w:t>
+      </w:r>
+    </w:p>
+    <w:p>
+      <w:pPr>
+        <w:pStyle w:val="Heading3"/>
+      </w:pPr>
+      <w:r>
+        <w:t xml:space="preserve">S8.1. Single cells</w:t>
+      </w:r>
+    </w:p>
+    <w:p>
+      <w:pPr>
+        <w:pStyle w:val="FirstParagraph"/>
+      </w:pPr>
+      <w:r>
+        <w:t xml:space="preserve">Under traction loads, the means of NICE by cut-severity group are 64 to 102 times lower than those of the Uncorrected continuation. The group means of the Uncorrected continuation rise from 1.03% for uncut to 11.2% for heavily cut cells (Table ST03b). Over all 80 geometries, the mean energy error of the Uncorrected continuation under traction loads is 6.33%, and its largest single-geometry mean is 42%. Continuing the base network without correction therefore changes its mean only from 6.89% to 6.33%. The Smoothing-trained variant reaches a mean of 1.28%, and its largest single-geometry mean is 7.8% (Table ST03).</w:t>
+      </w:r>
+    </w:p>
+    <w:p>
+      <w:pPr>
+        <w:pStyle w:val="Heading3"/>
+      </w:pPr>
+      <w:r>
+        <w:t xml:space="preserve">S8.2. Two-cell assemblies</w:t>
+      </w:r>
+    </w:p>
+    <w:p>
+      <w:pPr>
+        <w:pStyle w:val="FirstParagraph"/>
+      </w:pPr>
+      <w:r>
+        <w:t xml:space="preserve">The two further continuations were also evaluated in the two-cell assemblies of Section 5.6. The configurations, loads and error measures are those of Section 5.6. Tables ST08 and ST09 list the maxima for every variant and configuration evaluated.</w:t>
+      </w:r>
+    </w:p>
+    <w:p>
+      <w:pPr>
+        <w:pStyle w:val="BodyText"/>
+      </w:pPr>
+      <w:r>
+        <w:t xml:space="preserve">The Uncorrected continuation was evaluated in eleven configurations. It exceeds the 3% sensitivity line in four of them, with sensitivity errors up to 11.4% (Table ST08). On M1 it also exceeds the 3% compliance line, with compliance errors up to 4.1%. The Smoothing-trained variant reduces these errors, but it still exceeds the 3% sensitivity line in the same four configurations, with errors of 3.15–4.43%. Smoothing without the coarse-grid correction leaves the slowly damped error in the low modes described in Section 5.4. This is consistent with the sensitivity errors that remain in U1 and M1. Base network + correction stays below both 3% lines, with a largest sensitivity error of 0.95% on U1/x. The correction therefore brings the assembled responses below the 3% lines.</w:t>
+      </w:r>
+    </w:p>
+    <w:p>
+      <w:pPr>
+        <w:pStyle w:val="BodyText"/>
+      </w:pPr>
+      <w:r>
+        <w:t xml:space="preserve">Under the traction loads on the cut face of the test cell, the Uncorrected continuation exceeds the 3% line in four of its seven configurations, with sensitivity errors up to 14.1% (Table ST09). Under the same loads, the errors of NICE are at most 0.10% in the compliance and 0.16% in the sensitivity.</w:t>
+      </w:r>
+    </w:p>
+    <w:p>
+      <w:pPr>
+        <w:pStyle w:val="BodyText"/>
+      </w:pPr>
+      <w:r>
+        <w:t xml:space="preserve">Without the complete correction, an accurate compliance does not guarantee an accurate local sensitivity (Table ST25). Under the z traction load on the neighbour face of U1/x, the compliance error of the Smoothing-trained variant is 0.00109%, whereas its test-cell sensitivity error is 3.15%. The test cell carries 0.13% of the exact assembled energy under this load. NICE reduces both errors, and its test-cell sensitivity error under this load is 0.598%. On M1/x under the y traction load on the test-cell face, NICE gives errors of 0.0481% in the compliance and 0.145% in the sensitivity. The Uncorrected continuation gives 3.44% and 11.4% under the same load.</w:t>
+      </w:r>
+    </w:p>
+    <w:p>
+      <w:pPr>
+        <w:pStyle w:val="BodyText"/>
+      </w:pPr>
+      <w:r>
+        <w:rPr>
+          <w:b/>
+          <w:bCs/>
+        </w:rPr>
+        <w:t xml:space="preserve">Table ST25. Compliance and test-cell sensitivity under individual face loads.</w:t>
+      </w:r>
+      <w:r>
+        <w:t xml:space="preserve"> </w:t>
+      </w:r>
+      <w:r>
+        <w:t xml:space="preserve">T and N identify the loaded face of the test cell or of the neighbouring cell; x, y and z give the traction direction. The last column gives the fraction of the exact assembled energy carried by the test cell.</w:t>
+      </w:r>
+    </w:p>
+    <w:tbl>
+      <w:tblPr>
+        <w:tblStyle w:val="Table"/>
+        <w:tblW w:type="pct" w:w="5000"/>
+        <w:tblLayout w:type="fixed"/>
+        <w:tblLook w:firstRow="1" w:lastRow="0" w:firstColumn="0" w:lastColumn="0" w:noHBand="0" w:noVBand="0" w:val="0020"/>
+      </w:tblPr>
+      <w:tblGrid>
+        <w:gridCol w:w="1250"/>
+        <w:gridCol w:w="1250"/>
+        <w:gridCol w:w="1250"/>
+        <w:gridCol w:w="1250"/>
+        <w:gridCol w:w="1250"/>
+        <w:gridCol w:w="1667"/>
+      </w:tblGrid>
+      <w:tr>
+        <w:trPr>
+          <w:tblHeader w:val="on"/>
+        </w:trPr>
+        <w:tc>
+          <w:tcPr/>
+          <w:p>
+            <w:pPr>
+              <w:pStyle w:val="Compact"/>
+            </w:pPr>
+            <w:r>
+              <w:t xml:space="preserve">Test cell / configuration</w:t>
+            </w:r>
+          </w:p>
+        </w:tc>
+        <w:tc>
+          <w:tcPr/>
+          <w:p>
+            <w:pPr>
+              <w:pStyle w:val="Compact"/>
+            </w:pPr>
+            <w:r>
+              <w:t xml:space="preserve">Load</w:t>
+            </w:r>
+          </w:p>
+        </w:tc>
+        <w:tc>
+          <w:tcPr/>
+          <w:p>
+            <w:pPr>
+              <w:pStyle w:val="Compact"/>
+            </w:pPr>
+            <w:r>
+              <w:t xml:space="preserve">Uncorrected continuation: compliance / sensitivity (%)</w:t>
+            </w:r>
+          </w:p>
+        </w:tc>
+        <w:tc>
+          <w:tcPr/>
+          <w:p>
+            <w:pPr>
+              <w:pStyle w:val="Compact"/>
+            </w:pPr>
+            <w:r>
+              <w:t xml:space="preserve">Smoothing-trained: compliance / sensitivity (%)</w:t>
+            </w:r>
+          </w:p>
+        </w:tc>
+        <w:tc>
+          <w:tcPr/>
+          <w:p>
+            <w:pPr>
+              <w:pStyle w:val="Compact"/>
+            </w:pPr>
+            <w:r>
+              <w:t xml:space="preserve">NICE: compliance / sensitivity (%)</w:t>
+            </w:r>
+          </w:p>
+        </w:tc>
+        <w:tc>
+          <w:tcPr/>
+          <w:p>
+            <w:pPr>
+              <w:pStyle w:val="Compact"/>
+              <w:jc w:val="right"/>
+            </w:pPr>
+            <w:r>
+              <w:t xml:space="preserve">Energy fraction of the test cell</w:t>
+            </w:r>
+          </w:p>
+        </w:tc>
+      </w:tr>
+      <w:tr>
+        <w:tc>
+          <w:tcPr/>
+          <w:p>
+            <w:pPr>
+              <w:pStyle w:val="Compact"/>
+            </w:pPr>
+            <w:r>
+              <w:t xml:space="preserve">H1/x</w:t>
+            </w:r>
+          </w:p>
+        </w:tc>
+        <w:tc>
+          <w:tcPr/>
+          <w:p>
+            <w:pPr>
+              <w:pStyle w:val="Compact"/>
+            </w:pPr>
+            <w:r>
+              <w:t xml:space="preserve">T-x</w:t>
+            </w:r>
+          </w:p>
+        </w:tc>
+        <w:tc>
+          <w:tcPr/>
+          <w:p>
+            <w:pPr>
+              <w:pStyle w:val="Compact"/>
+            </w:pPr>
+            <w:r>
+              <w:t xml:space="preserve">1.06 / 2.47</w:t>
+            </w:r>
+          </w:p>
+        </w:tc>
+        <w:tc>
+          <w:tcPr/>
+          <w:p>
+            <w:pPr>
+              <w:pStyle w:val="Compact"/>
+            </w:pPr>
+            <w:r>
+              <w:t xml:space="preserve">0.144 / 0.636</w:t>
+            </w:r>
+          </w:p>
+        </w:tc>
+        <w:tc>
+          <w:tcPr/>
+          <w:p>
+            <w:pPr>
+              <w:pStyle w:val="Compact"/>
+            </w:pPr>
+            <w:r>
+              <w:t xml:space="preserve">0.0076 / 0.0133</w:t>
+            </w:r>
+          </w:p>
+        </w:tc>
+        <w:tc>
+          <w:tcPr/>
+          <w:p>
+            <w:pPr>
+              <w:pStyle w:val="Compact"/>
+              <w:jc w:val="right"/>
+            </w:pPr>
+            <w:r>
+              <w:t xml:space="preserve">0.643</w:t>
+            </w:r>
+          </w:p>
+        </w:tc>
+      </w:tr>
+      <w:tr>
+        <w:tc>
+          <w:tcPr/>
+          <w:p>
+            <w:pPr>
+              <w:pStyle w:val="Compact"/>
+            </w:pPr>
+            <w:r>
+              <w:t xml:space="preserve">U1/x</w:t>
+            </w:r>
+          </w:p>
+        </w:tc>
+        <w:tc>
+          <w:tcPr/>
+          <w:p>
+            <w:pPr>
+              <w:pStyle w:val="Compact"/>
+            </w:pPr>
+            <w:r>
+              <w:t xml:space="preserve">N-z</w:t>
+            </w:r>
+          </w:p>
+        </w:tc>
+        <w:tc>
+          <w:tcPr/>
+          <w:p>
+            <w:pPr>
+              <w:pStyle w:val="Compact"/>
+            </w:pPr>
+            <w:r>
+              <w:t xml:space="preserve">0.0023 / 4.89</w:t>
+            </w:r>
+          </w:p>
+        </w:tc>
+        <w:tc>
+          <w:tcPr/>
+          <w:p>
+            <w:pPr>
+              <w:pStyle w:val="Compact"/>
+            </w:pPr>
+            <w:r>
+              <w:t xml:space="preserve">0.00109 / 3.15</w:t>
+            </w:r>
+          </w:p>
+        </w:tc>
+        <w:tc>
+          <w:tcPr/>
+          <w:p>
+            <w:pPr>
+              <w:pStyle w:val="Compact"/>
+            </w:pPr>
+            <w:r>
+              <w:t xml:space="preserve">7.3×10⁻⁵ / 0.598</w:t>
+            </w:r>
+          </w:p>
+        </w:tc>
+        <w:tc>
+          <w:tcPr/>
+          <w:p>
+            <w:pPr>
+              <w:pStyle w:val="Compact"/>
+              <w:jc w:val="right"/>
+            </w:pPr>
+            <w:r>
+              <w:t xml:space="preserve">0.0013</w:t>
+            </w:r>
+          </w:p>
+        </w:tc>
+      </w:tr>
+      <w:tr>
+        <w:tc>
+          <w:tcPr/>
+          <w:p>
+            <w:pPr>
+              <w:pStyle w:val="Compact"/>
+            </w:pPr>
+            <w:r>
+              <w:t xml:space="preserve">M1/x</w:t>
+            </w:r>
+          </w:p>
+        </w:tc>
+        <w:tc>
+          <w:tcPr/>
+          <w:p>
+            <w:pPr>
+              <w:pStyle w:val="Compact"/>
+            </w:pPr>
+            <w:r>
+              <w:t xml:space="preserve">T-y</w:t>
+            </w:r>
+          </w:p>
+        </w:tc>
+        <w:tc>
+          <w:tcPr/>
+          <w:p>
+            <w:pPr>
+              <w:pStyle w:val="Compact"/>
+            </w:pPr>
+            <w:r>
+              <w:t xml:space="preserve">3.44 / 11.4</w:t>
+            </w:r>
+          </w:p>
+        </w:tc>
+        <w:tc>
+          <w:tcPr/>
+          <w:p>
+            <w:pPr>
+              <w:pStyle w:val="Compact"/>
+            </w:pPr>
+            <w:r>
+              <w:t xml:space="preserve">1.14 / 4.43</w:t>
+            </w:r>
+          </w:p>
+        </w:tc>
+        <w:tc>
+          <w:tcPr/>
+          <w:p>
+            <w:pPr>
+              <w:pStyle w:val="Compact"/>
+            </w:pPr>
+            <w:r>
+              <w:t xml:space="preserve">0.0481 / 0.145</w:t>
+            </w:r>
+          </w:p>
+        </w:tc>
+        <w:tc>
+          <w:tcPr/>
+          <w:p>
+            <w:pPr>
+              <w:pStyle w:val="Compact"/>
+              <w:jc w:val="right"/>
+            </w:pPr>
+            <w:r>
+              <w:t xml:space="preserve">0.311</w:t>
+            </w:r>
+          </w:p>
+        </w:tc>
+      </w:tr>
+    </w:tbl>
     <w:p>
       <w:pPr>
         <w:pStyle w:val="Heading2"/>
@@ -43898,7 +44532,7 @@
         <w:t xml:space="preserve"> </w:t>
       </w:r>
       <w:r>
-        <w:t xml:space="preserve">Single cells clamped on one box face and loaded by unit consistent tractions on another face in the three Cartesian directions. In (a), (b) and (d), solid lines with filled markers give the compliance and dashed lines with open markers the thickness sensitivity, each as the largest relative change over the three loads. (a) Change against the finest background resolution computed for U1 (</w:t>
+        <w:t xml:space="preserve">Single cells clamped on one cell face and loaded by unit traction loads on another face in the three Cartesian directions. In (a), (b) and (d), solid lines with filled markers give the compliance and dashed lines with open markers the thickness sensitivity, each as the largest relative change over the three loads. (a) Change against the finest background resolution computed for U1 (</w:t>
       </w:r>
       <m:oMath>
         <m:r>
@@ -44210,7 +44844,7 @@
       <w:r>
         <w:drawing>
           <wp:inline>
-            <wp:extent cx="5334000" cy="5426887"/>
+            <wp:extent cx="5334000" cy="4948966"/>
             <wp:effectExtent b="0" l="0" r="0" t="0"/>
             <wp:docPr descr="Figure S02" title="" id="15" name="Picture"/>
             <a:graphic>
@@ -44231,7 +44865,7 @@
                   <pic:spPr bwMode="auto">
                     <a:xfrm>
                       <a:off x="0" y="0"/>
-                      <a:ext cx="5334000" cy="5426887"/>
+                      <a:ext cx="5334000" cy="4948966"/>
                     </a:xfrm>
                     <a:prstGeom prst="rect">
                       <a:avLst/>
@@ -44259,13 +44893,13 @@
           <w:b/>
           <w:bCs/>
         </w:rPr>
-        <w:t xml:space="preserve">Figure S02. Distributions of geometry-level directional energy errors.</w:t>
+        <w:t xml:space="preserve">Figure S02. Distributions of geometry-level energy errors.</w:t>
       </w:r>
       <w:r>
         <w:t xml:space="preserve"> </w:t>
       </w:r>
       <w:r>
-        <w:t xml:space="preserve">Each point is one validation geometry's mean directional energy error in the identity orientation; horizontal bars are population medians. The nodal-force, spring-support, single-face-force, polynomial, multiscale, consistent-traction and single-face consistent-traction classes contain 80 geometries, and the stiffness-scaled support and neighbour-induced displacement classes 75, the same populations as Table ST03. The five variants of Table ST03 (base network, Uncorrected, Smoothing-trained, base network with the correction applied at deployment, NICE) use the markers and colours of the main-text figures; deterministic horizontal offsets separate overlapping observations. All panels share the logarithmic error axis.</w:t>
+        <w:t xml:space="preserve">Each point is one validation geometry's mean energy error in the identity orientation; horizontal bars are population medians. The classes with nodal point loads, spring supports, single-face nodal point loads, polynomial displacements, multiscale displacements, traction loads and single-face traction loads contain 80 geometries. The class with stiffness-scaled supports and the class with displacements imposed by a neighbouring cell contain 75, the same populations as Table ST03. The five variants of Table ST03 (Base network, Uncorrected continuation, Smoothing-trained, Base network + correction and NICE) use the markers and colours of the main-text figures; Base network + correction applies the correction to the base network at deployment. Deterministic horizontal offsets separate overlapping observations. All panels share the logarithmic error axis.</w:t>
       </w:r>
     </w:p>
     <w:p>
@@ -44324,13 +44958,13 @@
           <w:b/>
           <w:bCs/>
         </w:rPr>
-        <w:t xml:space="preserve">Figure S03. Field-based sensitivity-error diagnostics.</w:t>
+        <w:t xml:space="preserve">Figure S03. Sensitivity-error diagnostics.</w:t>
       </w:r>
       <w:r>
         <w:t xml:space="preserve"> </w:t>
       </w:r>
       <w:r>
-        <w:t xml:space="preserve">(a) Paired mean energy and sensitivity errors for consistent-traction and nodal-force responses, using six cells of the base network and five of Uncorrected. (b) Consistent-traction linear-term norm share</w:t>
+        <w:t xml:space="preserve">(a) Paired mean energy and sensitivity errors for responses to traction loads and nodal point loads, using six cells of the base network and five of the Uncorrected continuation. (b) Linear-term norm fraction</w:t>
       </w:r>
       <w:r>
         <w:t xml:space="preserve"> </w:t>
@@ -44461,7 +45095,10 @@
         </m:r>
       </m:oMath>
       <w:r>
-        <w:t xml:space="preserve">, where</w:t>
+        <w:t xml:space="preserve"> </w:t>
+      </w:r>
+      <w:r>
+        <w:t xml:space="preserve">under traction loads, where</w:t>
       </w:r>
       <w:r>
         <w:t xml:space="preserve"> </w:t>
@@ -44502,7 +45139,7 @@
         <w:t xml:space="preserve"> </w:t>
       </w:r>
       <w:r>
-        <w:t xml:space="preserve">is the sensitivity-error matrix over all eight design components and evaluated directions. (c,d) Shares of absolute elementwise sensitivity-error contributions and element counts in four mutually exclusive material-volume-fraction groups for the base network under consistent tractions. Each error group sums absolute contributions over its elements, design components and directions before normalisation by the total. Filled markers identify the base network and open markers and hatched bars in (a,b) Uncorrected; Uncorrected is shown for U1, U2, M1, H1 and M2 (Table ST05a).</w:t>
+        <w:t xml:space="preserve">is the sensitivity-error matrix over all eight design components and evaluated test displacements. (c,d) Fractions of absolute elementwise sensitivity-error contributions and of element counts in four mutually exclusive material-volume-fraction groups for the base network under traction loads. Each error group sums absolute contributions over its elements, design components and test displacements before normalisation by the total. Filled markers identify the base network. In (a,b), open markers and hatched bars identify the Uncorrected continuation, which is shown for U1, U2, M1, H1 and M2 (Table ST05a).</w:t>
       </w:r>
     </w:p>
     <w:p>
@@ -44512,7 +45149,7 @@
       <w:r>
         <w:drawing>
           <wp:inline>
-            <wp:extent cx="5334000" cy="4991242"/>
+            <wp:extent cx="5334000" cy="4947154"/>
             <wp:effectExtent b="0" l="0" r="0" t="0"/>
             <wp:docPr descr="Figure S04" title="" id="21" name="Picture"/>
             <a:graphic>
@@ -44533,7 +45170,7 @@
                   <pic:spPr bwMode="auto">
                     <a:xfrm>
                       <a:off x="0" y="0"/>
-                      <a:ext cx="5334000" cy="4991242"/>
+                      <a:ext cx="5334000" cy="4947154"/>
                     </a:xfrm>
                     <a:prstGeom prst="rect">
                       <a:avLst/>
@@ -44567,7 +45204,7 @@
         <w:t xml:space="preserve"> </w:t>
       </w:r>
       <w:r>
-        <w:t xml:space="preserve">The counterpart of Figure 11 for (a–c) the base network, (d–f) Uncorrected, (g–i) Smoothing-trained and (j–l) the base network with the correction applied at deployment. One point per load in the configurations evaluated for each variant (54, 87, 96 and 114 loads; Tables ST08 and ST09); filled markers denote face loads and open markers cut-surface loads. Top row: compliance error against</w:t>
+        <w:t xml:space="preserve">The counterpart of Figure 11 for (a–c) the base network, (d–f) the Uncorrected continuation, (g–i) the Smoothing-trained variant and (j–l) Base network + correction, which applies the correction at deployment. One point per load in the configurations evaluated for each variant (54, 87, 96 and 114 loads; Tables ST08 and ST09); filled markers denote face loads and open markers cut-surface loads. Top row: compliance error against</w:t>
       </w:r>
       <w:r>
         <w:t xml:space="preserve"> </w:t>
@@ -44630,7 +45267,7 @@
         <w:t xml:space="preserve"> </w:t>
       </w:r>
       <w:r>
-        <w:t xml:space="preserve">of the compliance. Middle and bottom rows: compliance error and target-cell sensitivity error against the target's exact energy share</w:t>
+        <w:t xml:space="preserve">of the compliance. Middle and bottom rows: compliance error and test-cell sensitivity error against the exact energy fraction</w:t>
       </w:r>
       <w:r>
         <w:t xml:space="preserve"> </w:t>
@@ -44641,7 +45278,10 @@
         </m:r>
       </m:oMath>
       <w:r>
-        <w:t xml:space="preserve">; lines are least-squares fits in logarithmic coordinates, with the slope given in each panel. All panels share the error axis. The circled load in (a–c) is U1/x under the neighbour-face z traction; its values are given in the note to Table ST08.</w:t>
+        <w:t xml:space="preserve"> </w:t>
+      </w:r>
+      <w:r>
+        <w:t xml:space="preserve">of the test cell; lines are least-squares fits in logarithmic coordinates, with the slope given in each panel. All panels share the error axis. The circled load in (a–c) is U1/x under the z traction load on the face of the neighbouring cell; its values are given in the note to Table ST08.</w:t>
       </w:r>
     </w:p>
     <w:sectPr>

</xml_diff>